<commit_message>
Plan GCS formato de tablas mejorado
</commit_message>
<xml_diff>
--- a/Documentacion/Planes/SONNY-PGC.docx
+++ b/Documentacion/Planes/SONNY-PGC.docx
@@ -75,12 +75,12 @@
           <wp:inline distB="114300" distT="114300" distL="114300" distR="114300">
             <wp:extent cx="447675" cy="57150"/>
             <wp:effectExtent b="0" l="0" r="0" t="0"/>
-            <wp:docPr descr="línea corta" id="2" name="image3.png"/>
+            <wp:docPr descr="línea corta" id="2" name="image1.png"/>
             <a:graphic>
               <a:graphicData uri="http://schemas.openxmlformats.org/drawingml/2006/picture">
                 <pic:pic>
                   <pic:nvPicPr>
-                    <pic:cNvPr descr="línea corta" id="0" name="image3.png"/>
+                    <pic:cNvPr descr="línea corta" id="0" name="image1.png"/>
                     <pic:cNvPicPr preferRelativeResize="0"/>
                   </pic:nvPicPr>
                   <pic:blipFill>
@@ -452,7 +452,7 @@
     </w:p>
     <w:sdt>
       <w:sdtPr>
-        <w:id w:val="229935046"/>
+        <w:id w:val="-1162421318"/>
         <w:docPartObj>
           <w:docPartGallery w:val="Table of Contents"/>
           <w:docPartUnique w:val="1"/>
@@ -598,8 +598,8 @@
                 <w:rFonts w:ascii="Proxima Nova" w:cs="Proxima Nova" w:eastAsia="Proxima Nova" w:hAnsi="Proxima Nova"/>
                 <w:b w:val="0"/>
                 <w:bCs w:val="0"/>
-                <w:i w:val="1"/>
-                <w:iCs w:val="1"/>
+                <w:i w:val="0"/>
+                <w:iCs w:val="0"/>
                 <w:smallCaps w:val="0"/>
                 <w:strike w:val="0"/>
                 <w:color w:val="000000"/>
@@ -651,8 +651,8 @@
                 <w:rFonts w:ascii="Proxima Nova" w:cs="Proxima Nova" w:eastAsia="Proxima Nova" w:hAnsi="Proxima Nova"/>
                 <w:b w:val="0"/>
                 <w:bCs w:val="0"/>
-                <w:i w:val="1"/>
-                <w:iCs w:val="1"/>
+                <w:i w:val="0"/>
+                <w:iCs w:val="0"/>
                 <w:smallCaps w:val="0"/>
                 <w:strike w:val="0"/>
                 <w:color w:val="000000"/>
@@ -715,7 +715,7 @@
                 <w:vertAlign w:val="baseline"/>
                 <w:rtl w:val="0"/>
               </w:rPr>
-              <w:t xml:space="preserve">2. Organización de la GCS</w:t>
+              <w:t xml:space="preserve">2. Gestión de la GCS</w:t>
               <w:tab/>
               <w:t xml:space="preserve">5</w:t>
             </w:r>
@@ -756,8 +756,8 @@
                 <w:rFonts w:ascii="Proxima Nova" w:cs="Proxima Nova" w:eastAsia="Proxima Nova" w:hAnsi="Proxima Nova"/>
                 <w:b w:val="0"/>
                 <w:bCs w:val="0"/>
-                <w:i w:val="1"/>
-                <w:iCs w:val="1"/>
+                <w:i w:val="0"/>
+                <w:iCs w:val="0"/>
                 <w:smallCaps w:val="0"/>
                 <w:strike w:val="0"/>
                 <w:color w:val="000000"/>
@@ -809,8 +809,8 @@
                 <w:rFonts w:ascii="Proxima Nova" w:cs="Proxima Nova" w:eastAsia="Proxima Nova" w:hAnsi="Proxima Nova"/>
                 <w:b w:val="0"/>
                 <w:bCs w:val="0"/>
-                <w:i w:val="1"/>
-                <w:iCs w:val="1"/>
+                <w:i w:val="0"/>
+                <w:iCs w:val="0"/>
                 <w:smallCaps w:val="0"/>
                 <w:strike w:val="0"/>
                 <w:color w:val="000000"/>
@@ -914,8 +914,8 @@
                 <w:rFonts w:ascii="Proxima Nova" w:cs="Proxima Nova" w:eastAsia="Proxima Nova" w:hAnsi="Proxima Nova"/>
                 <w:b w:val="0"/>
                 <w:bCs w:val="0"/>
-                <w:i w:val="1"/>
-                <w:iCs w:val="1"/>
+                <w:i w:val="0"/>
+                <w:iCs w:val="0"/>
                 <w:smallCaps w:val="0"/>
                 <w:strike w:val="0"/>
                 <w:color w:val="000000"/>
@@ -967,8 +967,8 @@
                 <w:rFonts w:ascii="Proxima Nova" w:cs="Proxima Nova" w:eastAsia="Proxima Nova" w:hAnsi="Proxima Nova"/>
                 <w:b w:val="0"/>
                 <w:bCs w:val="0"/>
-                <w:i w:val="1"/>
-                <w:iCs w:val="1"/>
+                <w:i w:val="0"/>
+                <w:iCs w:val="0"/>
                 <w:smallCaps w:val="0"/>
                 <w:strike w:val="0"/>
                 <w:color w:val="000000"/>
@@ -1020,8 +1020,8 @@
                 <w:rFonts w:ascii="Proxima Nova" w:cs="Proxima Nova" w:eastAsia="Proxima Nova" w:hAnsi="Proxima Nova"/>
                 <w:b w:val="0"/>
                 <w:bCs w:val="0"/>
-                <w:i w:val="1"/>
-                <w:iCs w:val="1"/>
+                <w:i w:val="0"/>
+                <w:iCs w:val="0"/>
                 <w:smallCaps w:val="0"/>
                 <w:strike w:val="0"/>
                 <w:color w:val="000000"/>
@@ -1073,8 +1073,8 @@
                 <w:rFonts w:ascii="Proxima Nova" w:cs="Proxima Nova" w:eastAsia="Proxima Nova" w:hAnsi="Proxima Nova"/>
                 <w:b w:val="0"/>
                 <w:bCs w:val="0"/>
-                <w:i w:val="1"/>
-                <w:iCs w:val="1"/>
+                <w:i w:val="0"/>
+                <w:iCs w:val="0"/>
                 <w:smallCaps w:val="0"/>
                 <w:strike w:val="0"/>
                 <w:color w:val="000000"/>
@@ -1126,8 +1126,8 @@
                 <w:rFonts w:ascii="Proxima Nova" w:cs="Proxima Nova" w:eastAsia="Proxima Nova" w:hAnsi="Proxima Nova"/>
                 <w:b w:val="0"/>
                 <w:bCs w:val="0"/>
-                <w:i w:val="1"/>
-                <w:iCs w:val="1"/>
+                <w:i w:val="0"/>
+                <w:iCs w:val="0"/>
                 <w:smallCaps w:val="0"/>
                 <w:strike w:val="0"/>
                 <w:color w:val="000000"/>
@@ -1140,7 +1140,7 @@
               </w:rPr>
               <w:t xml:space="preserve">3.2 Control de la GCS</w:t>
               <w:tab/>
-              <w:t xml:space="preserve">10</w:t>
+              <w:t xml:space="preserve">11</w:t>
             </w:r>
           </w:hyperlink>
           <w:r>
@@ -1179,8 +1179,8 @@
                 <w:rFonts w:ascii="Proxima Nova" w:cs="Proxima Nova" w:eastAsia="Proxima Nova" w:hAnsi="Proxima Nova"/>
                 <w:b w:val="0"/>
                 <w:bCs w:val="0"/>
-                <w:i w:val="1"/>
-                <w:iCs w:val="1"/>
+                <w:i w:val="0"/>
+                <w:iCs w:val="0"/>
                 <w:smallCaps w:val="0"/>
                 <w:strike w:val="0"/>
                 <w:color w:val="000000"/>
@@ -1193,7 +1193,7 @@
               </w:rPr>
               <w:t xml:space="preserve">3.2.1 Solicitud de Cambio 1</w:t>
               <w:tab/>
-              <w:t xml:space="preserve">10</w:t>
+              <w:t xml:space="preserve">11</w:t>
             </w:r>
           </w:hyperlink>
           <w:r>
@@ -1232,8 +1232,8 @@
                 <w:rFonts w:ascii="Proxima Nova" w:cs="Proxima Nova" w:eastAsia="Proxima Nova" w:hAnsi="Proxima Nova"/>
                 <w:b w:val="0"/>
                 <w:bCs w:val="0"/>
-                <w:i w:val="1"/>
-                <w:iCs w:val="1"/>
+                <w:i w:val="0"/>
+                <w:iCs w:val="0"/>
                 <w:smallCaps w:val="0"/>
                 <w:strike w:val="0"/>
                 <w:color w:val="000000"/>
@@ -1285,8 +1285,8 @@
                 <w:rFonts w:ascii="Proxima Nova" w:cs="Proxima Nova" w:eastAsia="Proxima Nova" w:hAnsi="Proxima Nova"/>
                 <w:b w:val="0"/>
                 <w:bCs w:val="0"/>
-                <w:i w:val="1"/>
-                <w:iCs w:val="1"/>
+                <w:i w:val="0"/>
+                <w:iCs w:val="0"/>
                 <w:smallCaps w:val="0"/>
                 <w:strike w:val="0"/>
                 <w:color w:val="000000"/>
@@ -1299,7 +1299,7 @@
               </w:rPr>
               <w:t xml:space="preserve">3.2.3 Solicitud de Cambio 3</w:t>
               <w:tab/>
-              <w:t xml:space="preserve">11</w:t>
+              <w:t xml:space="preserve">12</w:t>
             </w:r>
           </w:hyperlink>
           <w:r>
@@ -1338,8 +1338,8 @@
                 <w:rFonts w:ascii="Proxima Nova" w:cs="Proxima Nova" w:eastAsia="Proxima Nova" w:hAnsi="Proxima Nova"/>
                 <w:b w:val="0"/>
                 <w:bCs w:val="0"/>
-                <w:i w:val="1"/>
-                <w:iCs w:val="1"/>
+                <w:i w:val="0"/>
+                <w:iCs w:val="0"/>
                 <w:smallCaps w:val="0"/>
                 <w:strike w:val="0"/>
                 <w:color w:val="000000"/>
@@ -1352,7 +1352,7 @@
               </w:rPr>
               <w:t xml:space="preserve">3.2.4 Solicitud de Cambio 4</w:t>
               <w:tab/>
-              <w:t xml:space="preserve">11</w:t>
+              <w:t xml:space="preserve">12</w:t>
             </w:r>
           </w:hyperlink>
           <w:r>
@@ -1391,8 +1391,8 @@
                 <w:rFonts w:ascii="Proxima Nova" w:cs="Proxima Nova" w:eastAsia="Proxima Nova" w:hAnsi="Proxima Nova"/>
                 <w:b w:val="0"/>
                 <w:bCs w:val="0"/>
-                <w:i w:val="1"/>
-                <w:iCs w:val="1"/>
+                <w:i w:val="0"/>
+                <w:iCs w:val="0"/>
                 <w:smallCaps w:val="0"/>
                 <w:strike w:val="0"/>
                 <w:color w:val="000000"/>
@@ -1405,7 +1405,7 @@
               </w:rPr>
               <w:t xml:space="preserve">3.2.5 Solicitud de Cambio 5</w:t>
               <w:tab/>
-              <w:t xml:space="preserve">12</w:t>
+              <w:t xml:space="preserve">13</w:t>
             </w:r>
           </w:hyperlink>
           <w:r>
@@ -1444,8 +1444,8 @@
                 <w:rFonts w:ascii="Proxima Nova" w:cs="Proxima Nova" w:eastAsia="Proxima Nova" w:hAnsi="Proxima Nova"/>
                 <w:b w:val="0"/>
                 <w:bCs w:val="0"/>
-                <w:i w:val="1"/>
-                <w:iCs w:val="1"/>
+                <w:i w:val="0"/>
+                <w:iCs w:val="0"/>
                 <w:smallCaps w:val="0"/>
                 <w:strike w:val="0"/>
                 <w:color w:val="000000"/>
@@ -1458,7 +1458,7 @@
               </w:rPr>
               <w:t xml:space="preserve">3.2.6 Solicitud de Cambio 6</w:t>
               <w:tab/>
-              <w:t xml:space="preserve">12</w:t>
+              <w:t xml:space="preserve">13</w:t>
             </w:r>
           </w:hyperlink>
           <w:r>
@@ -1497,8 +1497,8 @@
                 <w:rFonts w:ascii="Proxima Nova" w:cs="Proxima Nova" w:eastAsia="Proxima Nova" w:hAnsi="Proxima Nova"/>
                 <w:b w:val="0"/>
                 <w:bCs w:val="0"/>
-                <w:i w:val="1"/>
-                <w:iCs w:val="1"/>
+                <w:i w:val="0"/>
+                <w:iCs w:val="0"/>
                 <w:smallCaps w:val="0"/>
                 <w:strike w:val="0"/>
                 <w:color w:val="000000"/>
@@ -1511,7 +1511,7 @@
               </w:rPr>
               <w:t xml:space="preserve">3.2.7 Solicitud de Cambio 7</w:t>
               <w:tab/>
-              <w:t xml:space="preserve">13</w:t>
+              <w:t xml:space="preserve">14</w:t>
             </w:r>
           </w:hyperlink>
           <w:r>
@@ -2127,7 +2127,7 @@
         <w:widowControl w:val="1"/>
         <w:numPr>
           <w:ilvl w:val="0"/>
-          <w:numId w:val="6"/>
+          <w:numId w:val="7"/>
         </w:numPr>
         <w:pBdr>
           <w:top w:space="0" w:sz="0" w:val="nil"/>
@@ -2167,7 +2167,7 @@
         <w:widowControl w:val="1"/>
         <w:numPr>
           <w:ilvl w:val="0"/>
-          <w:numId w:val="6"/>
+          <w:numId w:val="7"/>
         </w:numPr>
         <w:pBdr>
           <w:top w:space="0" w:sz="0" w:val="nil"/>
@@ -2207,7 +2207,7 @@
         <w:widowControl w:val="1"/>
         <w:numPr>
           <w:ilvl w:val="0"/>
-          <w:numId w:val="6"/>
+          <w:numId w:val="7"/>
         </w:numPr>
         <w:pBdr>
           <w:top w:space="0" w:sz="0" w:val="nil"/>
@@ -2248,7 +2248,7 @@
       <w:pPr>
         <w:numPr>
           <w:ilvl w:val="0"/>
-          <w:numId w:val="6"/>
+          <w:numId w:val="7"/>
         </w:numPr>
         <w:spacing w:after="0" w:lineRule="auto"/>
         <w:ind w:left="720" w:hanging="360"/>
@@ -2284,7 +2284,7 @@
         <w:widowControl w:val="1"/>
         <w:numPr>
           <w:ilvl w:val="0"/>
-          <w:numId w:val="6"/>
+          <w:numId w:val="7"/>
         </w:numPr>
         <w:pBdr>
           <w:top w:space="0" w:sz="0" w:val="nil"/>
@@ -3058,7 +3058,7 @@
           <w:szCs w:val="36"/>
           <w:rtl w:val="0"/>
         </w:rPr>
-        <w:t xml:space="preserve">2. Organización de la GCS</w:t>
+        <w:t xml:space="preserve">2. Gestión de la GCS</w:t>
       </w:r>
       <w:r>
         <w:rPr>
@@ -3070,21 +3070,36 @@
       <w:pPr>
         <w:pStyle w:val="Heading2"/>
         <w:spacing w:before="280" w:line="300" w:lineRule="auto"/>
-        <w:rPr>
-          <w:rFonts w:ascii="Proxima Nova" w:cs="Proxima Nova" w:eastAsia="Proxima Nova" w:hAnsi="Proxima Nova"/>
-        </w:rPr>
-      </w:pPr>
-      <w:bookmarkStart w:colFirst="0" w:colLast="0" w:name="_heading=h.whos5suqp7sm" w:id="6"/>
-      <w:bookmarkEnd w:id="6"/>
-      <w:r>
         <w:rPr>
           <w:rFonts w:ascii="Proxima Nova" w:cs="Proxima Nova" w:eastAsia="Proxima Nova" w:hAnsi="Proxima Nova"/>
           <w:color w:val="e61a17"/>
           <w:sz w:val="26"/>
           <w:szCs w:val="26"/>
+        </w:rPr>
+      </w:pPr>
+      <w:bookmarkStart w:colFirst="0" w:colLast="0" w:name="_heading=h.whos5suqp7sm" w:id="6"/>
+      <w:bookmarkEnd w:id="6"/>
+      <w:r>
+        <w:rPr>
+          <w:rFonts w:ascii="Proxima Nova" w:cs="Proxima Nova" w:eastAsia="Proxima Nova" w:hAnsi="Proxima Nova"/>
+          <w:color w:val="e61a17"/>
+          <w:sz w:val="26"/>
+          <w:szCs w:val="26"/>
           <w:rtl w:val="0"/>
         </w:rPr>
         <w:t xml:space="preserve">2.1 Roles y Responsabilidades</w:t>
+      </w:r>
+    </w:p>
+    <w:p>
+      <w:pPr>
+        <w:rPr/>
+      </w:pPr>
+      <w:r>
+        <w:rPr>
+          <w:rFonts w:ascii="Proxima Nova" w:cs="Proxima Nova" w:eastAsia="Proxima Nova" w:hAnsi="Proxima Nova"/>
+          <w:rtl w:val="0"/>
+        </w:rPr>
+        <w:t xml:space="preserve">La Tabla 1 presenta los roles relacionados con la Gestión de la Configuración del Software y sus responsabilidades específicas.</w:t>
       </w:r>
       <w:r>
         <w:rPr>
@@ -3110,13 +3125,14 @@
     <w:sdt>
       <w:sdtPr>
         <w:lock w:val="contentLocked"/>
-        <w:id w:val="-1792116298"/>
+        <w:id w:val="-719039057"/>
         <w:tag w:val="goog_rdk_0"/>
       </w:sdtPr>
       <w:sdtContent>
         <w:tbl>
           <w:tblPr>
             <w:tblStyle w:val="Table1"/>
+            <w:tblpPr w:leftFromText="180" w:rightFromText="180" w:topFromText="180" w:bottomFromText="180" w:vertAnchor="text" w:horzAnchor="text" w:tblpX="-20.99999999999966" w:tblpY="0.5375000000003638"/>
             <w:tblW w:w="8400.0" w:type="dxa"/>
             <w:jc w:val="left"/>
             <w:tblBorders>
@@ -3162,7 +3178,6 @@
                   <w:bottom w:w="113.38582677165356" w:type="dxa"/>
                   <w:right w:w="113.38582677165356" w:type="dxa"/>
                 </w:tcMar>
-                <w:vAlign w:val="top"/>
               </w:tcPr>
               <w:p>
                 <w:pPr>
@@ -3202,7 +3217,6 @@
                   <w:bottom w:w="113.38582677165356" w:type="dxa"/>
                   <w:right w:w="113.38582677165356" w:type="dxa"/>
                 </w:tcMar>
-                <w:vAlign w:val="top"/>
               </w:tcPr>
               <w:p>
                 <w:pPr>
@@ -3242,7 +3256,6 @@
                   <w:bottom w:w="113.38582677165356" w:type="dxa"/>
                   <w:right w:w="113.38582677165356" w:type="dxa"/>
                 </w:tcMar>
-                <w:vAlign w:val="top"/>
               </w:tcPr>
               <w:p>
                 <w:pPr>
@@ -3281,14 +3294,12 @@
                   <w:bottom w:color="e0e0e0" w:space="0" w:sz="4" w:val="single"/>
                   <w:right w:color="000000" w:space="0" w:sz="0" w:val="nil"/>
                 </w:tcBorders>
-                <w:shd w:fill="auto" w:val="clear"/>
                 <w:tcMar>
                   <w:top w:w="113.38582677165356" w:type="dxa"/>
                   <w:left w:w="113.38582677165356" w:type="dxa"/>
                   <w:bottom w:w="113.38582677165356" w:type="dxa"/>
                   <w:right w:w="113.38582677165356" w:type="dxa"/>
                 </w:tcMar>
-                <w:vAlign w:val="top"/>
               </w:tcPr>
               <w:p>
                 <w:pPr>
@@ -3332,14 +3343,12 @@
                   <w:bottom w:color="e0e0e0" w:space="0" w:sz="4" w:val="single"/>
                   <w:right w:color="000000" w:space="0" w:sz="0" w:val="nil"/>
                 </w:tcBorders>
-                <w:shd w:fill="auto" w:val="clear"/>
                 <w:tcMar>
                   <w:top w:w="113.38582677165356" w:type="dxa"/>
                   <w:left w:w="113.38582677165356" w:type="dxa"/>
                   <w:bottom w:w="113.38582677165356" w:type="dxa"/>
                   <w:right w:w="113.38582677165356" w:type="dxa"/>
                 </w:tcMar>
-                <w:vAlign w:val="top"/>
               </w:tcPr>
               <w:p>
                 <w:pPr>
@@ -3368,28 +3377,25 @@
                   <w:bottom w:color="e0e0e0" w:space="0" w:sz="4" w:val="single"/>
                   <w:right w:color="000000" w:space="0" w:sz="0" w:val="nil"/>
                 </w:tcBorders>
-                <w:shd w:fill="auto" w:val="clear"/>
                 <w:tcMar>
                   <w:top w:w="113.38582677165356" w:type="dxa"/>
                   <w:left w:w="113.38582677165356" w:type="dxa"/>
                   <w:bottom w:w="113.38582677165356" w:type="dxa"/>
                   <w:right w:w="113.38582677165356" w:type="dxa"/>
                 </w:tcMar>
-                <w:vAlign w:val="top"/>
               </w:tcPr>
               <w:p>
                 <w:pPr>
                   <w:widowControl w:val="0"/>
                   <w:numPr>
                     <w:ilvl w:val="0"/>
-                    <w:numId w:val="4"/>
+                    <w:numId w:val="5"/>
                   </w:numPr>
                   <w:spacing w:after="0" w:line="240" w:lineRule="auto"/>
                   <w:ind w:left="283.4645669291342" w:hanging="285"/>
                   <w:rPr>
                     <w:rFonts w:ascii="Proxima Nova" w:cs="Proxima Nova" w:eastAsia="Proxima Nova" w:hAnsi="Proxima Nova"/>
                     <w:color w:val="222222"/>
-                    <w:u w:val="none"/>
                   </w:rPr>
                 </w:pPr>
                 <w:r>
@@ -3406,14 +3412,13 @@
                   <w:widowControl w:val="0"/>
                   <w:numPr>
                     <w:ilvl w:val="0"/>
-                    <w:numId w:val="4"/>
+                    <w:numId w:val="5"/>
                   </w:numPr>
                   <w:spacing w:after="0" w:line="240" w:lineRule="auto"/>
                   <w:ind w:left="283.4645669291342" w:hanging="285"/>
                   <w:rPr>
                     <w:rFonts w:ascii="Proxima Nova" w:cs="Proxima Nova" w:eastAsia="Proxima Nova" w:hAnsi="Proxima Nova"/>
                     <w:color w:val="222222"/>
-                    <w:u w:val="none"/>
                   </w:rPr>
                 </w:pPr>
                 <w:r>
@@ -3430,14 +3435,13 @@
                   <w:widowControl w:val="0"/>
                   <w:numPr>
                     <w:ilvl w:val="0"/>
-                    <w:numId w:val="4"/>
+                    <w:numId w:val="5"/>
                   </w:numPr>
                   <w:spacing w:after="0" w:line="240" w:lineRule="auto"/>
                   <w:ind w:left="283.4645669291342" w:hanging="285"/>
                   <w:rPr>
                     <w:rFonts w:ascii="Proxima Nova" w:cs="Proxima Nova" w:eastAsia="Proxima Nova" w:hAnsi="Proxima Nova"/>
                     <w:color w:val="222222"/>
-                    <w:u w:val="none"/>
                   </w:rPr>
                 </w:pPr>
                 <w:r>
@@ -3471,7 +3475,6 @@
                   <w:bottom w:w="113.38582677165356" w:type="dxa"/>
                   <w:right w:w="113.38582677165356" w:type="dxa"/>
                 </w:tcMar>
-                <w:vAlign w:val="top"/>
               </w:tcPr>
               <w:p>
                 <w:pPr>
@@ -3507,7 +3510,6 @@
                   <w:bottom w:w="113.38582677165356" w:type="dxa"/>
                   <w:right w:w="113.38582677165356" w:type="dxa"/>
                 </w:tcMar>
-                <w:vAlign w:val="top"/>
               </w:tcPr>
               <w:p>
                 <w:pPr>
@@ -3525,11 +3527,6 @@
                     <w:rtl w:val="0"/>
                   </w:rPr>
                   <w:t xml:space="preserve">3</w:t>
-                </w:r>
-                <w:r>
-                  <w:rPr>
-                    <w:rtl w:val="0"/>
-                  </w:rPr>
                 </w:r>
               </w:p>
             </w:tc>
@@ -3548,14 +3545,13 @@
                   <w:bottom w:w="113.38582677165356" w:type="dxa"/>
                   <w:right w:w="113.38582677165356" w:type="dxa"/>
                 </w:tcMar>
-                <w:vAlign w:val="top"/>
               </w:tcPr>
               <w:p>
                 <w:pPr>
                   <w:widowControl w:val="0"/>
                   <w:numPr>
                     <w:ilvl w:val="0"/>
-                    <w:numId w:val="4"/>
+                    <w:numId w:val="5"/>
                   </w:numPr>
                   <w:spacing w:after="0" w:line="240" w:lineRule="auto"/>
                   <w:ind w:left="283.4645669291342" w:hanging="285"/>
@@ -3578,7 +3574,7 @@
                   <w:widowControl w:val="0"/>
                   <w:numPr>
                     <w:ilvl w:val="0"/>
-                    <w:numId w:val="4"/>
+                    <w:numId w:val="5"/>
                   </w:numPr>
                   <w:spacing w:after="0" w:line="240" w:lineRule="auto"/>
                   <w:ind w:left="283.4645669291342" w:hanging="285"/>
@@ -3601,7 +3597,7 @@
                   <w:widowControl w:val="0"/>
                   <w:numPr>
                     <w:ilvl w:val="0"/>
-                    <w:numId w:val="4"/>
+                    <w:numId w:val="5"/>
                   </w:numPr>
                   <w:spacing w:after="0" w:line="240" w:lineRule="auto"/>
                   <w:ind w:left="283.4645669291342" w:hanging="285"/>
@@ -3641,7 +3637,6 @@
                   <w:bottom w:w="113.38582677165356" w:type="dxa"/>
                   <w:right w:w="113.38582677165356" w:type="dxa"/>
                 </w:tcMar>
-                <w:vAlign w:val="top"/>
               </w:tcPr>
               <w:p>
                 <w:pPr>
@@ -3677,7 +3672,6 @@
                   <w:bottom w:w="113.38582677165356" w:type="dxa"/>
                   <w:right w:w="113.38582677165356" w:type="dxa"/>
                 </w:tcMar>
-                <w:vAlign w:val="top"/>
               </w:tcPr>
               <w:p>
                 <w:pPr>
@@ -3713,14 +3707,13 @@
                   <w:bottom w:w="113.38582677165356" w:type="dxa"/>
                   <w:right w:w="113.38582677165356" w:type="dxa"/>
                 </w:tcMar>
-                <w:vAlign w:val="top"/>
               </w:tcPr>
               <w:p>
                 <w:pPr>
                   <w:widowControl w:val="0"/>
                   <w:numPr>
                     <w:ilvl w:val="0"/>
-                    <w:numId w:val="4"/>
+                    <w:numId w:val="5"/>
                   </w:numPr>
                   <w:spacing w:after="0" w:line="240" w:lineRule="auto"/>
                   <w:ind w:left="283.4645669291342" w:hanging="285"/>
@@ -3742,7 +3735,7 @@
                   <w:widowControl w:val="0"/>
                   <w:numPr>
                     <w:ilvl w:val="0"/>
-                    <w:numId w:val="4"/>
+                    <w:numId w:val="5"/>
                   </w:numPr>
                   <w:spacing w:after="0" w:line="240" w:lineRule="auto"/>
                   <w:ind w:left="283.4645669291342" w:hanging="285"/>
@@ -3764,7 +3757,7 @@
                   <w:widowControl w:val="0"/>
                   <w:numPr>
                     <w:ilvl w:val="0"/>
-                    <w:numId w:val="4"/>
+                    <w:numId w:val="5"/>
                   </w:numPr>
                   <w:spacing w:after="0" w:line="240" w:lineRule="auto"/>
                   <w:ind w:left="283.4645669291342" w:hanging="285"/>
@@ -3786,7 +3779,7 @@
                   <w:widowControl w:val="0"/>
                   <w:numPr>
                     <w:ilvl w:val="0"/>
-                    <w:numId w:val="4"/>
+                    <w:numId w:val="5"/>
                   </w:numPr>
                   <w:spacing w:after="0" w:line="240" w:lineRule="auto"/>
                   <w:ind w:left="283.4645669291342" w:hanging="285"/>
@@ -3816,10 +3809,11 @@
     <w:p>
       <w:pPr>
         <w:spacing w:after="0" w:lineRule="auto"/>
-        <w:ind w:left="0" w:firstLine="0"/>
         <w:jc w:val="both"/>
         <w:rPr>
           <w:rFonts w:ascii="Proxima Nova" w:cs="Proxima Nova" w:eastAsia="Proxima Nova" w:hAnsi="Proxima Nova"/>
+          <w:sz w:val="2"/>
+          <w:szCs w:val="2"/>
         </w:rPr>
       </w:pPr>
       <w:r>
@@ -3830,25 +3824,54 @@
     </w:p>
     <w:p>
       <w:pPr>
+        <w:spacing w:before="0" w:line="300" w:lineRule="auto"/>
+        <w:ind w:left="0" w:firstLine="0"/>
+        <w:rPr>
+          <w:rFonts w:ascii="Proxima Nova" w:cs="Proxima Nova" w:eastAsia="Proxima Nova" w:hAnsi="Proxima Nova"/>
+        </w:rPr>
+      </w:pPr>
+      <w:r>
+        <w:rPr>
+          <w:rFonts w:ascii="Proxima Nova" w:cs="Proxima Nova" w:eastAsia="Proxima Nova" w:hAnsi="Proxima Nova"/>
+          <w:rtl w:val="0"/>
+        </w:rPr>
+        <w:t xml:space="preserve">Tabla 1. Definición de roles y responsabilidades de la Gestión de la Configuración</w:t>
+      </w:r>
+    </w:p>
+    <w:p>
+      <w:pPr>
         <w:pStyle w:val="Heading2"/>
         <w:spacing w:before="280" w:line="300" w:lineRule="auto"/>
-        <w:rPr>
-          <w:rFonts w:ascii="Proxima Nova" w:cs="Proxima Nova" w:eastAsia="Proxima Nova" w:hAnsi="Proxima Nova"/>
-          <w:b w:val="1"/>
-          <w:bCs w:val="1"/>
-        </w:rPr>
-      </w:pPr>
-      <w:bookmarkStart w:colFirst="0" w:colLast="0" w:name="_heading=h.8ogizzm8wd3m" w:id="7"/>
-      <w:bookmarkEnd w:id="7"/>
-      <w:r>
         <w:rPr>
           <w:rFonts w:ascii="Proxima Nova" w:cs="Proxima Nova" w:eastAsia="Proxima Nova" w:hAnsi="Proxima Nova"/>
           <w:color w:val="e61a17"/>
           <w:sz w:val="26"/>
           <w:szCs w:val="26"/>
+        </w:rPr>
+      </w:pPr>
+      <w:bookmarkStart w:colFirst="0" w:colLast="0" w:name="_heading=h.8ogizzm8wd3m" w:id="7"/>
+      <w:bookmarkEnd w:id="7"/>
+      <w:r>
+        <w:rPr>
+          <w:rFonts w:ascii="Proxima Nova" w:cs="Proxima Nova" w:eastAsia="Proxima Nova" w:hAnsi="Proxima Nova"/>
+          <w:color w:val="e61a17"/>
+          <w:sz w:val="26"/>
+          <w:szCs w:val="26"/>
           <w:rtl w:val="0"/>
         </w:rPr>
         <w:t xml:space="preserve">2.2 Benchmarking de Herramientas de control de versiones</w:t>
+      </w:r>
+    </w:p>
+    <w:p>
+      <w:pPr>
+        <w:rPr/>
+      </w:pPr>
+      <w:r>
+        <w:rPr>
+          <w:rFonts w:ascii="Proxima Nova" w:cs="Proxima Nova" w:eastAsia="Proxima Nova" w:hAnsi="Proxima Nova"/>
+          <w:rtl w:val="0"/>
+        </w:rPr>
+        <w:t xml:space="preserve">La Tabla 2 presenta el benchmarking de las herramientas de control de versiones consideradas, junto con su descripción correspondiente.</w:t>
       </w:r>
       <w:r>
         <w:rPr>
@@ -3874,7 +3897,7 @@
     <w:sdt>
       <w:sdtPr>
         <w:lock w:val="contentLocked"/>
-        <w:id w:val="1832817448"/>
+        <w:id w:val="2003125632"/>
         <w:tag w:val="goog_rdk_1"/>
       </w:sdtPr>
       <w:sdtContent>
@@ -4068,7 +4091,7 @@
                   <w:widowControl w:val="0"/>
                   <w:numPr>
                     <w:ilvl w:val="0"/>
-                    <w:numId w:val="4"/>
+                    <w:numId w:val="5"/>
                   </w:numPr>
                   <w:spacing w:after="0" w:line="240" w:lineRule="auto"/>
                   <w:ind w:left="283.4645669291342" w:hanging="285"/>
@@ -4084,48 +4107,6 @@
                     <w:rtl w:val="0"/>
                   </w:rPr>
                   <w:t xml:space="preserve">Estándar en la industria. Permite trabajar offline y realizar ramas.</w:t>
-                </w:r>
-              </w:p>
-              <w:p>
-                <w:pPr>
-                  <w:widowControl w:val="0"/>
-                  <w:numPr>
-                    <w:ilvl w:val="0"/>
-                    <w:numId w:val="4"/>
-                  </w:numPr>
-                  <w:spacing w:after="0" w:line="240" w:lineRule="auto"/>
-                  <w:ind w:left="283.4645669291342" w:hanging="285"/>
-                  <w:rPr>
-                    <w:rFonts w:ascii="Proxima Nova" w:cs="Proxima Nova" w:eastAsia="Proxima Nova" w:hAnsi="Proxima Nova"/>
-                    <w:color w:val="222222"/>
-                  </w:rPr>
-                </w:pPr>
-                <w:r>
-                  <w:rPr>
-                    <w:rFonts w:ascii="Proxima Nova" w:cs="Proxima Nova" w:eastAsia="Proxima Nova" w:hAnsi="Proxima Nova"/>
-                    <w:color w:val="222222"/>
-                    <w:rtl w:val="0"/>
-                  </w:rPr>
-                  <w:t xml:space="preserve">Chacon, S., &amp; Straub, B. (2014). Pro Git. </w:t>
-                </w:r>
-                <w:hyperlink r:id="rId8">
-                  <w:r>
-                    <w:rPr>
-                      <w:rFonts w:ascii="Proxima Nova" w:cs="Proxima Nova" w:eastAsia="Proxima Nova" w:hAnsi="Proxima Nova"/>
-                      <w:color w:val="1155cc"/>
-                      <w:u w:val="single"/>
-                      <w:rtl w:val="0"/>
-                    </w:rPr>
-                    <w:t xml:space="preserve">https://git-scm.com/book/en/v2</w:t>
-                  </w:r>
-                </w:hyperlink>
-                <w:r>
-                  <w:rPr>
-                    <w:rFonts w:ascii="Proxima Nova" w:cs="Proxima Nova" w:eastAsia="Proxima Nova" w:hAnsi="Proxima Nova"/>
-                    <w:color w:val="222222"/>
-                    <w:rtl w:val="0"/>
-                  </w:rPr>
-                  <w:t xml:space="preserve"> </w:t>
                 </w:r>
               </w:p>
             </w:tc>
@@ -4208,7 +4189,7 @@
                   <w:widowControl w:val="0"/>
                   <w:numPr>
                     <w:ilvl w:val="0"/>
-                    <w:numId w:val="4"/>
+                    <w:numId w:val="5"/>
                   </w:numPr>
                   <w:spacing w:after="0" w:line="240" w:lineRule="auto"/>
                   <w:ind w:left="283.4645669291342" w:hanging="285"/>
@@ -4224,48 +4205,6 @@
                     <w:rtl w:val="0"/>
                   </w:rPr>
                   <w:t xml:space="preserve">Similar a GIT pero está diseñado para manejar proyectos de manera más intuitiva.</w:t>
-                </w:r>
-              </w:p>
-              <w:p>
-                <w:pPr>
-                  <w:widowControl w:val="0"/>
-                  <w:numPr>
-                    <w:ilvl w:val="0"/>
-                    <w:numId w:val="4"/>
-                  </w:numPr>
-                  <w:spacing w:after="0" w:line="240" w:lineRule="auto"/>
-                  <w:ind w:left="283.4645669291342" w:hanging="285"/>
-                  <w:rPr>
-                    <w:rFonts w:ascii="Proxima Nova" w:cs="Proxima Nova" w:eastAsia="Proxima Nova" w:hAnsi="Proxima Nova"/>
-                    <w:color w:val="222222"/>
-                  </w:rPr>
-                </w:pPr>
-                <w:r>
-                  <w:rPr>
-                    <w:rFonts w:ascii="Proxima Nova" w:cs="Proxima Nova" w:eastAsia="Proxima Nova" w:hAnsi="Proxima Nova"/>
-                    <w:color w:val="222222"/>
-                    <w:rtl w:val="0"/>
-                  </w:rPr>
-                  <w:t xml:space="preserve">O'Sullivan, B. (2009). Mercurial: The Definitive Guide. </w:t>
-                </w:r>
-                <w:hyperlink r:id="rId9">
-                  <w:r>
-                    <w:rPr>
-                      <w:rFonts w:ascii="Proxima Nova" w:cs="Proxima Nova" w:eastAsia="Proxima Nova" w:hAnsi="Proxima Nova"/>
-                      <w:color w:val="1155cc"/>
-                      <w:u w:val="single"/>
-                      <w:rtl w:val="0"/>
-                    </w:rPr>
-                    <w:t xml:space="preserve">https://hgbook.red-bean.com/read/</w:t>
-                  </w:r>
-                </w:hyperlink>
-                <w:r>
-                  <w:rPr>
-                    <w:rFonts w:ascii="Proxima Nova" w:cs="Proxima Nova" w:eastAsia="Proxima Nova" w:hAnsi="Proxima Nova"/>
-                    <w:color w:val="222222"/>
-                    <w:rtl w:val="0"/>
-                  </w:rPr>
-                  <w:t xml:space="preserve"> </w:t>
                 </w:r>
               </w:p>
             </w:tc>
@@ -4348,7 +4287,7 @@
                   <w:widowControl w:val="0"/>
                   <w:numPr>
                     <w:ilvl w:val="0"/>
-                    <w:numId w:val="4"/>
+                    <w:numId w:val="5"/>
                   </w:numPr>
                   <w:spacing w:after="0" w:line="240" w:lineRule="auto"/>
                   <w:ind w:left="283.4645669291342" w:hanging="285"/>
@@ -4364,48 +4303,6 @@
                     <w:rtl w:val="0"/>
                   </w:rPr>
                   <w:t xml:space="preserve">Usado en entornos donde se requiere un control de acceso más rígido</w:t>
-                </w:r>
-              </w:p>
-              <w:p>
-                <w:pPr>
-                  <w:widowControl w:val="0"/>
-                  <w:numPr>
-                    <w:ilvl w:val="0"/>
-                    <w:numId w:val="4"/>
-                  </w:numPr>
-                  <w:spacing w:after="0" w:line="240" w:lineRule="auto"/>
-                  <w:ind w:left="283.4645669291342" w:hanging="285"/>
-                  <w:rPr>
-                    <w:rFonts w:ascii="Proxima Nova" w:cs="Proxima Nova" w:eastAsia="Proxima Nova" w:hAnsi="Proxima Nova"/>
-                    <w:color w:val="222222"/>
-                  </w:rPr>
-                </w:pPr>
-                <w:r>
-                  <w:rPr>
-                    <w:rFonts w:ascii="Proxima Nova" w:cs="Proxima Nova" w:eastAsia="Proxima Nova" w:hAnsi="Proxima Nova"/>
-                    <w:color w:val="222222"/>
-                    <w:rtl w:val="0"/>
-                  </w:rPr>
-                  <w:t xml:space="preserve">Pilato, C. M., Collins-Sussman, B., &amp; Fitzpatrick, B. W. (2008). Version Control with Subversion. </w:t>
-                </w:r>
-                <w:hyperlink r:id="rId10">
-                  <w:r>
-                    <w:rPr>
-                      <w:rFonts w:ascii="Proxima Nova" w:cs="Proxima Nova" w:eastAsia="Proxima Nova" w:hAnsi="Proxima Nova"/>
-                      <w:color w:val="1155cc"/>
-                      <w:u w:val="single"/>
-                      <w:rtl w:val="0"/>
-                    </w:rPr>
-                    <w:t xml:space="preserve">https://indico.cern.ch/event/83294/contributions/1260815/attachments/1070958/1527274/svn-book.pdf</w:t>
-                  </w:r>
-                </w:hyperlink>
-                <w:r>
-                  <w:rPr>
-                    <w:rFonts w:ascii="Proxima Nova" w:cs="Proxima Nova" w:eastAsia="Proxima Nova" w:hAnsi="Proxima Nova"/>
-                    <w:color w:val="222222"/>
-                    <w:rtl w:val="0"/>
-                  </w:rPr>
-                  <w:t xml:space="preserve"> </w:t>
                 </w:r>
               </w:p>
             </w:tc>
@@ -4480,21 +4377,6 @@
                   </w:rPr>
                 </w:r>
               </w:p>
-              <w:p>
-                <w:pPr>
-                  <w:widowControl w:val="0"/>
-                  <w:spacing w:after="0" w:line="240" w:lineRule="auto"/>
-                  <w:rPr>
-                    <w:rFonts w:ascii="Proxima Nova" w:cs="Proxima Nova" w:eastAsia="Proxima Nova" w:hAnsi="Proxima Nova"/>
-                    <w:color w:val="222222"/>
-                  </w:rPr>
-                </w:pPr>
-                <w:r>
-                  <w:rPr>
-                    <w:rtl w:val="0"/>
-                  </w:rPr>
-                </w:r>
-              </w:p>
             </w:tc>
             <w:tc>
               <w:tcPr>
@@ -4518,7 +4400,7 @@
                   <w:widowControl w:val="0"/>
                   <w:numPr>
                     <w:ilvl w:val="0"/>
-                    <w:numId w:val="4"/>
+                    <w:numId w:val="5"/>
                   </w:numPr>
                   <w:spacing w:after="0" w:line="240" w:lineRule="auto"/>
                   <w:ind w:left="283.4645669291342" w:hanging="285"/>
@@ -4533,46 +4415,6 @@
                     <w:rtl w:val="0"/>
                   </w:rPr>
                   <w:t xml:space="preserve">Usado principalmente en el desarrollo de videojuegos por su capacidad de manejar archivos pesados.</w:t>
-                </w:r>
-              </w:p>
-              <w:p>
-                <w:pPr>
-                  <w:widowControl w:val="0"/>
-                  <w:numPr>
-                    <w:ilvl w:val="0"/>
-                    <w:numId w:val="4"/>
-                  </w:numPr>
-                  <w:spacing w:after="0" w:line="240" w:lineRule="auto"/>
-                  <w:ind w:left="283.4645669291342" w:hanging="285"/>
-                  <w:rPr>
-                    <w:rFonts w:ascii="Proxima Nova" w:cs="Proxima Nova" w:eastAsia="Proxima Nova" w:hAnsi="Proxima Nova"/>
-                    <w:color w:val="222222"/>
-                  </w:rPr>
-                </w:pPr>
-                <w:r>
-                  <w:rPr>
-                    <w:rFonts w:ascii="Proxima Nova" w:cs="Proxima Nova" w:eastAsia="Proxima Nova" w:hAnsi="Proxima Nova"/>
-                    <w:rtl w:val="0"/>
-                  </w:rPr>
-                  <w:t xml:space="preserve">Perforce Software. (2024). Helix Core Version Control Guide. </w:t>
-                </w:r>
-                <w:hyperlink r:id="rId11">
-                  <w:r>
-                    <w:rPr>
-                      <w:rFonts w:ascii="Proxima Nova" w:cs="Proxima Nova" w:eastAsia="Proxima Nova" w:hAnsi="Proxima Nova"/>
-                      <w:color w:val="1155cc"/>
-                      <w:u w:val="single"/>
-                      <w:rtl w:val="0"/>
-                    </w:rPr>
-                    <w:t xml:space="preserve">https://ftp.perforce.com/perforce/r20.1/doc/manuals/overview.pdf</w:t>
-                  </w:r>
-                </w:hyperlink>
-                <w:r>
-                  <w:rPr>
-                    <w:rFonts w:ascii="Proxima Nova" w:cs="Proxima Nova" w:eastAsia="Proxima Nova" w:hAnsi="Proxima Nova"/>
-                    <w:rtl w:val="0"/>
-                  </w:rPr>
-                  <w:t xml:space="preserve"> </w:t>
                 </w:r>
               </w:p>
             </w:tc>
@@ -4582,12 +4424,36 @@
     </w:sdt>
     <w:p>
       <w:pPr>
-        <w:spacing w:after="0" w:lineRule="auto"/>
-        <w:jc w:val="both"/>
-        <w:rPr>
-          <w:rFonts w:ascii="Proxima Nova" w:cs="Proxima Nova" w:eastAsia="Proxima Nova" w:hAnsi="Proxima Nova"/>
-        </w:rPr>
-      </w:pPr>
+        <w:spacing w:line="300" w:lineRule="auto"/>
+        <w:ind w:firstLine="720"/>
+        <w:rPr>
+          <w:sz w:val="6"/>
+          <w:szCs w:val="6"/>
+        </w:rPr>
+      </w:pPr>
+      <w:r>
+        <w:rPr>
+          <w:rtl w:val="0"/>
+        </w:rPr>
+      </w:r>
+    </w:p>
+    <w:p>
+      <w:pPr>
+        <w:spacing w:line="300" w:lineRule="auto"/>
+        <w:ind w:firstLine="720"/>
+        <w:rPr>
+          <w:rFonts w:ascii="Proxima Nova" w:cs="Proxima Nova" w:eastAsia="Proxima Nova" w:hAnsi="Proxima Nova"/>
+          <w:sz w:val="16"/>
+          <w:szCs w:val="16"/>
+        </w:rPr>
+      </w:pPr>
+      <w:r>
+        <w:rPr>
+          <w:rFonts w:ascii="Proxima Nova" w:cs="Proxima Nova" w:eastAsia="Proxima Nova" w:hAnsi="Proxima Nova"/>
+          <w:rtl w:val="0"/>
+        </w:rPr>
+        <w:t xml:space="preserve">Tabla 2. Descripción de Herramientas de control de versiones</w:t>
+      </w:r>
       <w:r>
         <w:rPr>
           <w:rtl w:val="0"/>
@@ -4601,8 +4467,8 @@
         <w:jc w:val="both"/>
         <w:rPr>
           <w:rFonts w:ascii="Proxima Nova" w:cs="Proxima Nova" w:eastAsia="Proxima Nova" w:hAnsi="Proxima Nova"/>
-          <w:sz w:val="12"/>
-          <w:szCs w:val="12"/>
+          <w:b w:val="1"/>
+          <w:bCs w:val="1"/>
         </w:rPr>
       </w:pPr>
       <w:r>
@@ -4653,11 +4519,10 @@
       <w:pPr>
         <w:numPr>
           <w:ilvl w:val="0"/>
-          <w:numId w:val="5"/>
+          <w:numId w:val="6"/>
         </w:numPr>
         <w:spacing w:after="0" w:lineRule="auto"/>
         <w:ind w:left="720" w:hanging="360"/>
-        <w:jc w:val="both"/>
         <w:rPr/>
       </w:pPr>
       <w:r>
@@ -4681,7 +4546,6 @@
       <w:pPr>
         <w:spacing w:after="0" w:lineRule="auto"/>
         <w:ind w:left="720" w:firstLine="0"/>
-        <w:jc w:val="both"/>
         <w:rPr>
           <w:rFonts w:ascii="Proxima Nova" w:cs="Proxima Nova" w:eastAsia="Proxima Nova" w:hAnsi="Proxima Nova"/>
           <w:sz w:val="12"/>
@@ -4698,11 +4562,10 @@
       <w:pPr>
         <w:numPr>
           <w:ilvl w:val="0"/>
-          <w:numId w:val="5"/>
+          <w:numId w:val="6"/>
         </w:numPr>
         <w:spacing w:after="0" w:lineRule="auto"/>
         <w:ind w:left="720" w:hanging="360"/>
-        <w:jc w:val="both"/>
         <w:rPr/>
       </w:pPr>
       <w:r>
@@ -4726,7 +4589,6 @@
       <w:pPr>
         <w:spacing w:after="0" w:lineRule="auto"/>
         <w:ind w:left="720" w:firstLine="0"/>
-        <w:jc w:val="both"/>
         <w:rPr>
           <w:rFonts w:ascii="Proxima Nova" w:cs="Proxima Nova" w:eastAsia="Proxima Nova" w:hAnsi="Proxima Nova"/>
           <w:sz w:val="12"/>
@@ -4743,11 +4605,10 @@
       <w:pPr>
         <w:numPr>
           <w:ilvl w:val="0"/>
-          <w:numId w:val="5"/>
+          <w:numId w:val="6"/>
         </w:numPr>
         <w:spacing w:after="0" w:lineRule="auto"/>
         <w:ind w:left="720" w:hanging="360"/>
-        <w:jc w:val="both"/>
         <w:rPr/>
       </w:pPr>
       <w:r>
@@ -4771,7 +4632,6 @@
       <w:pPr>
         <w:spacing w:after="0" w:lineRule="auto"/>
         <w:ind w:left="720" w:firstLine="0"/>
-        <w:jc w:val="both"/>
         <w:rPr>
           <w:rFonts w:ascii="Proxima Nova" w:cs="Proxima Nova" w:eastAsia="Proxima Nova" w:hAnsi="Proxima Nova"/>
           <w:sz w:val="12"/>
@@ -4788,11 +4648,10 @@
       <w:pPr>
         <w:numPr>
           <w:ilvl w:val="0"/>
-          <w:numId w:val="5"/>
+          <w:numId w:val="6"/>
         </w:numPr>
         <w:spacing w:after="0" w:lineRule="auto"/>
         <w:ind w:left="720" w:hanging="360"/>
-        <w:jc w:val="both"/>
         <w:rPr/>
       </w:pPr>
       <w:r>
@@ -4816,7 +4675,6 @@
       <w:pPr>
         <w:spacing w:after="0" w:lineRule="auto"/>
         <w:ind w:left="720" w:firstLine="0"/>
-        <w:jc w:val="both"/>
         <w:rPr>
           <w:rFonts w:ascii="Proxima Nova" w:cs="Proxima Nova" w:eastAsia="Proxima Nova" w:hAnsi="Proxima Nova"/>
           <w:sz w:val="12"/>
@@ -4833,11 +4691,10 @@
       <w:pPr>
         <w:numPr>
           <w:ilvl w:val="0"/>
-          <w:numId w:val="5"/>
+          <w:numId w:val="6"/>
         </w:numPr>
         <w:spacing w:after="0" w:lineRule="auto"/>
         <w:ind w:left="720" w:hanging="360"/>
-        <w:jc w:val="both"/>
         <w:rPr/>
       </w:pPr>
       <w:r>
@@ -4864,6 +4721,8 @@
         <w:jc w:val="both"/>
         <w:rPr>
           <w:rFonts w:ascii="Proxima Nova" w:cs="Proxima Nova" w:eastAsia="Proxima Nova" w:hAnsi="Proxima Nova"/>
+          <w:sz w:val="30"/>
+          <w:szCs w:val="30"/>
         </w:rPr>
       </w:pPr>
       <w:r>
@@ -4874,7 +4733,7 @@
     </w:p>
     <w:p>
       <w:pPr>
-        <w:spacing w:after="0" w:lineRule="auto"/>
+        <w:spacing w:after="140" w:line="259.20000000000005" w:lineRule="auto"/>
         <w:ind w:left="0" w:firstLine="0"/>
         <w:jc w:val="both"/>
         <w:rPr>
@@ -4891,6 +4750,30 @@
           <w:rtl w:val="0"/>
         </w:rPr>
         <w:t xml:space="preserve">Analisis de criterios com matriz de controntación</w:t>
+      </w:r>
+      <w:r>
+        <w:rPr>
+          <w:rtl w:val="0"/>
+        </w:rPr>
+      </w:r>
+    </w:p>
+    <w:p>
+      <w:pPr>
+        <w:rPr>
+          <w:rFonts w:ascii="Proxima Nova" w:cs="Proxima Nova" w:eastAsia="Proxima Nova" w:hAnsi="Proxima Nova"/>
+        </w:rPr>
+      </w:pPr>
+      <w:r>
+        <w:rPr>
+          <w:rFonts w:ascii="Proxima Nova" w:cs="Proxima Nova" w:eastAsia="Proxima Nova" w:hAnsi="Proxima Nova"/>
+          <w:rtl w:val="0"/>
+        </w:rPr>
+        <w:t xml:space="preserve">La Tabla 3 presenta la matriz de confrontación utilizada en el análisis de criterios para evaluar las herramientas de control de versiones seleccionadas.</w:t>
+      </w:r>
+      <w:r>
+        <w:rPr>
+          <w:rtl w:val="0"/>
+        </w:rPr>
       </w:r>
     </w:p>
     <w:p>
@@ -4900,6 +4783,8 @@
         <w:jc w:val="both"/>
         <w:rPr>
           <w:rFonts w:ascii="Proxima Nova" w:cs="Proxima Nova" w:eastAsia="Proxima Nova" w:hAnsi="Proxima Nova"/>
+          <w:sz w:val="18"/>
+          <w:szCs w:val="18"/>
         </w:rPr>
       </w:pPr>
       <w:r>
@@ -4911,7 +4796,7 @@
     <w:sdt>
       <w:sdtPr>
         <w:lock w:val="contentLocked"/>
-        <w:id w:val="1415675858"/>
+        <w:id w:val="1989448369"/>
         <w:tag w:val="goog_rdk_2"/>
       </w:sdtPr>
       <w:sdtContent>
@@ -7446,15 +7331,27 @@
     </w:p>
     <w:p>
       <w:pPr>
-        <w:spacing w:after="0" w:lineRule="auto"/>
-        <w:ind w:left="0" w:firstLine="0"/>
-        <w:jc w:val="both"/>
+        <w:spacing w:line="300" w:lineRule="auto"/>
+        <w:ind w:left="1440" w:firstLine="720"/>
         <w:rPr>
           <w:rFonts w:ascii="Proxima Nova" w:cs="Proxima Nova" w:eastAsia="Proxima Nova" w:hAnsi="Proxima Nova"/>
           <w:b w:val="1"/>
           <w:bCs w:val="1"/>
         </w:rPr>
       </w:pPr>
+      <w:r>
+        <w:rPr>
+          <w:rFonts w:ascii="Proxima Nova" w:cs="Proxima Nova" w:eastAsia="Proxima Nova" w:hAnsi="Proxima Nova"/>
+          <w:rtl w:val="0"/>
+        </w:rPr>
+        <w:t xml:space="preserve">Tabla 3. Matriz de confrontación</w:t>
+      </w:r>
+      <w:r>
+        <w:rPr>
+          <w:rtl w:val="0"/>
+        </w:rPr>
+        <w:t xml:space="preserve"> </w:t>
+      </w:r>
       <w:r>
         <w:rPr>
           <w:rtl w:val="0"/>
@@ -7484,6 +7381,20 @@
     </w:p>
     <w:p>
       <w:pPr>
+        <w:rPr>
+          <w:rFonts w:ascii="Proxima Nova" w:cs="Proxima Nova" w:eastAsia="Proxima Nova" w:hAnsi="Proxima Nova"/>
+        </w:rPr>
+      </w:pPr>
+      <w:r>
+        <w:rPr>
+          <w:rFonts w:ascii="Proxima Nova" w:cs="Proxima Nova" w:eastAsia="Proxima Nova" w:hAnsi="Proxima Nova"/>
+          <w:rtl w:val="0"/>
+        </w:rPr>
+        <w:t xml:space="preserve">La Tabla 4 presenta los resultados del análisis de criterios utilizados para evaluar las herramientas de control de versiones seleccionadas. Asimismo, se aclara que:</w:t>
+      </w:r>
+    </w:p>
+    <w:p>
+      <w:pPr>
         <w:spacing w:after="0" w:lineRule="auto"/>
         <w:ind w:left="0" w:firstLine="0"/>
         <w:rPr>
@@ -7493,9 +7404,18 @@
       <w:r>
         <w:rPr>
           <w:rFonts w:ascii="Proxima Nova" w:cs="Proxima Nova" w:eastAsia="Proxima Nova" w:hAnsi="Proxima Nova"/>
-          <w:rtl w:val="0"/>
-        </w:rPr>
-        <w:t xml:space="preserve">S (Puntaje): Se manejó una escala de 1 a 5 donde 1 es deficiente y 5 es excelente</w:t>
+          <w:b w:val="1"/>
+          <w:bCs w:val="1"/>
+          <w:rtl w:val="0"/>
+        </w:rPr>
+        <w:t xml:space="preserve">S </w:t>
+      </w:r>
+      <w:r>
+        <w:rPr>
+          <w:rFonts w:ascii="Proxima Nova" w:cs="Proxima Nova" w:eastAsia="Proxima Nova" w:hAnsi="Proxima Nova"/>
+          <w:rtl w:val="0"/>
+        </w:rPr>
+        <w:t xml:space="preserve">(Puntaje): Se manejó una escala de 1 a 5 donde 1 es deficiente y 5 es excelente</w:t>
       </w:r>
     </w:p>
     <w:p>
@@ -7509,9 +7429,18 @@
       <w:r>
         <w:rPr>
           <w:rFonts w:ascii="Proxima Nova" w:cs="Proxima Nova" w:eastAsia="Proxima Nova" w:hAnsi="Proxima Nova"/>
-          <w:rtl w:val="0"/>
-        </w:rPr>
-        <w:t xml:space="preserve">P (Promedio): Es la escala del puntaje obtenido con el promedio de importancia del criterio</w:t>
+          <w:b w:val="1"/>
+          <w:bCs w:val="1"/>
+          <w:rtl w:val="0"/>
+        </w:rPr>
+        <w:t xml:space="preserve">P </w:t>
+      </w:r>
+      <w:r>
+        <w:rPr>
+          <w:rFonts w:ascii="Proxima Nova" w:cs="Proxima Nova" w:eastAsia="Proxima Nova" w:hAnsi="Proxima Nova"/>
+          <w:rtl w:val="0"/>
+        </w:rPr>
+        <w:t xml:space="preserve">(Promedio): Es la escala del puntaje obtenido con el promedio de importancia del criterio</w:t>
       </w:r>
     </w:p>
     <w:p>
@@ -7532,7 +7461,7 @@
     <w:sdt>
       <w:sdtPr>
         <w:lock w:val="contentLocked"/>
-        <w:id w:val="2075662252"/>
+        <w:id w:val="1078360033"/>
         <w:tag w:val="goog_rdk_3"/>
       </w:sdtPr>
       <w:sdtContent>
@@ -10512,11 +10441,51 @@
     </w:sdt>
     <w:p>
       <w:pPr>
+        <w:spacing w:line="300" w:lineRule="auto"/>
+        <w:ind w:firstLine="720"/>
+        <w:rPr>
+          <w:sz w:val="4"/>
+          <w:szCs w:val="4"/>
+        </w:rPr>
+      </w:pPr>
+      <w:r>
+        <w:rPr>
+          <w:rtl w:val="0"/>
+        </w:rPr>
+      </w:r>
+    </w:p>
+    <w:p>
+      <w:pPr>
+        <w:spacing w:line="300" w:lineRule="auto"/>
+        <w:ind w:firstLine="720"/>
+        <w:rPr>
+          <w:rFonts w:ascii="Proxima Nova" w:cs="Proxima Nova" w:eastAsia="Proxima Nova" w:hAnsi="Proxima Nova"/>
+          <w:sz w:val="16"/>
+          <w:szCs w:val="16"/>
+        </w:rPr>
+      </w:pPr>
+      <w:r>
+        <w:rPr>
+          <w:rFonts w:ascii="Proxima Nova" w:cs="Proxima Nova" w:eastAsia="Proxima Nova" w:hAnsi="Proxima Nova"/>
+          <w:rtl w:val="0"/>
+        </w:rPr>
+        <w:t xml:space="preserve">Tabla 4. Resultados de Análisis de Herramientas de control de versiones</w:t>
+      </w:r>
+      <w:r>
+        <w:rPr>
+          <w:rtl w:val="0"/>
+        </w:rPr>
+      </w:r>
+    </w:p>
+    <w:p>
+      <w:pPr>
         <w:spacing w:after="0" w:lineRule="auto"/>
         <w:ind w:left="0" w:firstLine="0"/>
         <w:jc w:val="both"/>
         <w:rPr>
           <w:rFonts w:ascii="Proxima Nova" w:cs="Proxima Nova" w:eastAsia="Proxima Nova" w:hAnsi="Proxima Nova"/>
+          <w:sz w:val="2"/>
+          <w:szCs w:val="2"/>
         </w:rPr>
       </w:pPr>
       <w:r>
@@ -10532,14 +10501,18 @@
         <w:jc w:val="both"/>
         <w:rPr>
           <w:rFonts w:ascii="Proxima Nova" w:cs="Proxima Nova" w:eastAsia="Proxima Nova" w:hAnsi="Proxima Nova"/>
-        </w:rPr>
-      </w:pPr>
-      <w:r>
-        <w:rPr>
-          <w:rFonts w:ascii="Proxima Nova" w:cs="Proxima Nova" w:eastAsia="Proxima Nova" w:hAnsi="Proxima Nova"/>
-          <w:rtl w:val="0"/>
-        </w:rPr>
-        <w:t xml:space="preserve">Como vemos, Mercurial y GIT son las dos herramientas con mayor puntajes en promedio, siendo Mercurial una opción mucho más accesible y sencilla de utilizar, mientras que GIT gana en su versatilidad e integración con varios IDE 'S. </w:t>
+          <w:b w:val="1"/>
+          <w:bCs w:val="1"/>
+        </w:rPr>
+      </w:pPr>
+      <w:r>
+        <w:rPr>
+          <w:rFonts w:ascii="Proxima Nova" w:cs="Proxima Nova" w:eastAsia="Proxima Nova" w:hAnsi="Proxima Nova"/>
+          <w:b w:val="1"/>
+          <w:bCs w:val="1"/>
+          <w:rtl w:val="0"/>
+        </w:rPr>
+        <w:t xml:space="preserve">Interpretación de Resultados </w:t>
       </w:r>
     </w:p>
     <w:p>
@@ -10549,6 +10522,10 @@
         <w:jc w:val="both"/>
         <w:rPr>
           <w:rFonts w:ascii="Proxima Nova" w:cs="Proxima Nova" w:eastAsia="Proxima Nova" w:hAnsi="Proxima Nova"/>
+          <w:b w:val="1"/>
+          <w:bCs w:val="1"/>
+          <w:sz w:val="10"/>
+          <w:szCs w:val="10"/>
         </w:rPr>
       </w:pPr>
       <w:r>
@@ -10571,6 +10548,47 @@
           <w:rFonts w:ascii="Proxima Nova" w:cs="Proxima Nova" w:eastAsia="Proxima Nova" w:hAnsi="Proxima Nova"/>
           <w:rtl w:val="0"/>
         </w:rPr>
+        <w:t xml:space="preserve">Se observa que</w:t>
+      </w:r>
+      <w:r>
+        <w:rPr>
+          <w:rFonts w:ascii="Proxima Nova" w:cs="Proxima Nova" w:eastAsia="Proxima Nova" w:hAnsi="Proxima Nova"/>
+          <w:rtl w:val="0"/>
+        </w:rPr>
+        <w:t xml:space="preserve"> Mercurial y GIT son las dos herramientas con mayor puntajes en promedio, siendo Mercurial una opción mucho más accesible y sencilla de utilizar, mientras que GIT gana en su versatilidad e integración con varios IDE 'S. </w:t>
+      </w:r>
+    </w:p>
+    <w:p>
+      <w:pPr>
+        <w:spacing w:after="0" w:lineRule="auto"/>
+        <w:ind w:left="0" w:firstLine="0"/>
+        <w:jc w:val="both"/>
+        <w:rPr>
+          <w:rFonts w:ascii="Proxima Nova" w:cs="Proxima Nova" w:eastAsia="Proxima Nova" w:hAnsi="Proxima Nova"/>
+          <w:sz w:val="16"/>
+          <w:szCs w:val="16"/>
+        </w:rPr>
+      </w:pPr>
+      <w:r>
+        <w:rPr>
+          <w:rtl w:val="0"/>
+        </w:rPr>
+      </w:r>
+    </w:p>
+    <w:p>
+      <w:pPr>
+        <w:spacing w:after="0" w:lineRule="auto"/>
+        <w:ind w:left="0" w:firstLine="0"/>
+        <w:jc w:val="both"/>
+        <w:rPr>
+          <w:rFonts w:ascii="Proxima Nova" w:cs="Proxima Nova" w:eastAsia="Proxima Nova" w:hAnsi="Proxima Nova"/>
+        </w:rPr>
+      </w:pPr>
+      <w:r>
+        <w:rPr>
+          <w:rFonts w:ascii="Proxima Nova" w:cs="Proxima Nova" w:eastAsia="Proxima Nova" w:hAnsi="Proxima Nova"/>
+          <w:rtl w:val="0"/>
+        </w:rPr>
         <w:t xml:space="preserve">Por otro lado, Perforce Helix gana en manejo de archivos pesados ideal para proyectos que manejen modelado 3d o imágenes. Subversive es el penúltimo de la lista y pese a ser muy parecido en ciertos aspecto a GIT y Mercurial, este está pensado para un entorno corporativo, donde haya un control de acceso más rígido por medio de un servidor, lo cual puede limitar el acceso a algunos desarrolladores y traer un riesgo grande si el servidor no se encuentra operativo.</w:t>
       </w:r>
     </w:p>
@@ -10656,21 +10674,169 @@
         <w:spacing w:after="200" w:before="200" w:line="300" w:lineRule="auto"/>
         <w:rPr>
           <w:rFonts w:ascii="Proxima Nova" w:cs="Proxima Nova" w:eastAsia="Proxima Nova" w:hAnsi="Proxima Nova"/>
-          <w:b w:val="1"/>
-          <w:bCs w:val="1"/>
-        </w:rPr>
-      </w:pPr>
-      <w:bookmarkStart w:colFirst="0" w:colLast="0" w:name="_heading=h.lh6huhqns082" w:id="11"/>
-      <w:bookmarkEnd w:id="11"/>
-      <w:r>
-        <w:rPr>
-          <w:rFonts w:ascii="Proxima Nova" w:cs="Proxima Nova" w:eastAsia="Proxima Nova" w:hAnsi="Proxima Nova"/>
           <w:color w:val="008a05"/>
           <w:sz w:val="24"/>
           <w:szCs w:val="24"/>
+        </w:rPr>
+      </w:pPr>
+      <w:bookmarkStart w:colFirst="0" w:colLast="0" w:name="_heading=h.lh6huhqns082" w:id="11"/>
+      <w:bookmarkEnd w:id="11"/>
+      <w:r>
+        <w:rPr>
+          <w:rFonts w:ascii="Proxima Nova" w:cs="Proxima Nova" w:eastAsia="Proxima Nova" w:hAnsi="Proxima Nova"/>
+          <w:color w:val="008a05"/>
+          <w:sz w:val="24"/>
+          <w:szCs w:val="24"/>
           <w:rtl w:val="0"/>
         </w:rPr>
         <w:t xml:space="preserve">3.1.1 Estructura de las librerías del repositorio</w:t>
+      </w:r>
+    </w:p>
+    <w:p>
+      <w:pPr>
+        <w:rPr>
+          <w:rFonts w:ascii="Proxima Nova" w:cs="Proxima Nova" w:eastAsia="Proxima Nova" w:hAnsi="Proxima Nova"/>
+        </w:rPr>
+      </w:pPr>
+      <w:r>
+        <w:rPr>
+          <w:rFonts w:ascii="Proxima Nova" w:cs="Proxima Nova" w:eastAsia="Proxima Nova" w:hAnsi="Proxima Nova"/>
+          <w:rtl w:val="0"/>
+        </w:rPr>
+        <w:t xml:space="preserve">La Figura 1 presenta la estructura de las librerías del repositorio de la empresa </w:t>
+      </w:r>
+      <w:r>
+        <w:rPr>
+          <w:rFonts w:ascii="Proxima Nova" w:cs="Proxima Nova" w:eastAsia="Proxima Nova" w:hAnsi="Proxima Nova"/>
+          <w:rtl w:val="0"/>
+        </w:rPr>
+        <w:t xml:space="preserve">Sonny</w:t>
+      </w:r>
+      <w:r>
+        <w:rPr>
+          <w:rFonts w:ascii="Proxima Nova" w:cs="Proxima Nova" w:eastAsia="Proxima Nova" w:hAnsi="Proxima Nova"/>
+          <w:rtl w:val="0"/>
+        </w:rPr>
+        <w:t xml:space="preserve"> SAC, la cual está dividida en cuatro carpetas principales:</w:t>
+      </w:r>
+    </w:p>
+    <w:p>
+      <w:pPr>
+        <w:numPr>
+          <w:ilvl w:val="0"/>
+          <w:numId w:val="4"/>
+        </w:numPr>
+        <w:spacing w:after="0" w:afterAutospacing="0"/>
+        <w:ind w:left="720" w:hanging="360"/>
+        <w:rPr>
+          <w:rFonts w:ascii="Proxima Nova" w:cs="Proxima Nova" w:eastAsia="Proxima Nova" w:hAnsi="Proxima Nova"/>
+          <w:u w:val="none"/>
+        </w:rPr>
+      </w:pPr>
+      <w:r>
+        <w:rPr>
+          <w:rFonts w:ascii="Proxima Nova" w:cs="Proxima Nova" w:eastAsia="Proxima Nova" w:hAnsi="Proxima Nova"/>
+          <w:b w:val="1"/>
+          <w:bCs w:val="1"/>
+          <w:rtl w:val="0"/>
+        </w:rPr>
+        <w:t xml:space="preserve">Clientes</w:t>
+      </w:r>
+      <w:r>
+        <w:rPr>
+          <w:rFonts w:ascii="Proxima Nova" w:cs="Proxima Nova" w:eastAsia="Proxima Nova" w:hAnsi="Proxima Nova"/>
+          <w:rtl w:val="0"/>
+        </w:rPr>
+        <w:t xml:space="preserve">: Contiene los proyectos en producción de la empresa </w:t>
+      </w:r>
+    </w:p>
+    <w:p>
+      <w:pPr>
+        <w:numPr>
+          <w:ilvl w:val="0"/>
+          <w:numId w:val="4"/>
+        </w:numPr>
+        <w:spacing w:after="0" w:afterAutospacing="0"/>
+        <w:ind w:left="720" w:hanging="360"/>
+        <w:rPr>
+          <w:rFonts w:ascii="Proxima Nova" w:cs="Proxima Nova" w:eastAsia="Proxima Nova" w:hAnsi="Proxima Nova"/>
+          <w:u w:val="none"/>
+        </w:rPr>
+      </w:pPr>
+      <w:r>
+        <w:rPr>
+          <w:rFonts w:ascii="Proxima Nova" w:cs="Proxima Nova" w:eastAsia="Proxima Nova" w:hAnsi="Proxima Nova"/>
+          <w:b w:val="1"/>
+          <w:bCs w:val="1"/>
+          <w:rtl w:val="0"/>
+        </w:rPr>
+        <w:t xml:space="preserve">Desarrollo</w:t>
+      </w:r>
+      <w:r>
+        <w:rPr>
+          <w:rFonts w:ascii="Proxima Nova" w:cs="Proxima Nova" w:eastAsia="Proxima Nova" w:hAnsi="Proxima Nova"/>
+          <w:rtl w:val="0"/>
+        </w:rPr>
+        <w:t xml:space="preserve">: Contiene los proyectos en desarrollo de la empresa </w:t>
+      </w:r>
+    </w:p>
+    <w:p>
+      <w:pPr>
+        <w:numPr>
+          <w:ilvl w:val="0"/>
+          <w:numId w:val="4"/>
+        </w:numPr>
+        <w:spacing w:after="0" w:afterAutospacing="0"/>
+        <w:ind w:left="720" w:hanging="360"/>
+        <w:rPr>
+          <w:rFonts w:ascii="Proxima Nova" w:cs="Proxima Nova" w:eastAsia="Proxima Nova" w:hAnsi="Proxima Nova"/>
+          <w:u w:val="none"/>
+        </w:rPr>
+      </w:pPr>
+      <w:r>
+        <w:rPr>
+          <w:rFonts w:ascii="Proxima Nova" w:cs="Proxima Nova" w:eastAsia="Proxima Nova" w:hAnsi="Proxima Nova"/>
+          <w:b w:val="1"/>
+          <w:bCs w:val="1"/>
+          <w:rtl w:val="0"/>
+        </w:rPr>
+        <w:t xml:space="preserve">Documentos</w:t>
+      </w:r>
+      <w:r>
+        <w:rPr>
+          <w:rFonts w:ascii="Proxima Nova" w:cs="Proxima Nova" w:eastAsia="Proxima Nova" w:hAnsi="Proxima Nova"/>
+          <w:rtl w:val="0"/>
+        </w:rPr>
+        <w:t xml:space="preserve">: Contiene los documentos generales de la empresa</w:t>
+      </w:r>
+    </w:p>
+    <w:p>
+      <w:pPr>
+        <w:numPr>
+          <w:ilvl w:val="0"/>
+          <w:numId w:val="4"/>
+        </w:numPr>
+        <w:ind w:left="720" w:hanging="360"/>
+        <w:rPr>
+          <w:rFonts w:ascii="Proxima Nova" w:cs="Proxima Nova" w:eastAsia="Proxima Nova" w:hAnsi="Proxima Nova"/>
+          <w:u w:val="none"/>
+        </w:rPr>
+      </w:pPr>
+      <w:r>
+        <w:rPr>
+          <w:rFonts w:ascii="Proxima Nova" w:cs="Proxima Nova" w:eastAsia="Proxima Nova" w:hAnsi="Proxima Nova"/>
+          <w:b w:val="1"/>
+          <w:bCs w:val="1"/>
+          <w:rtl w:val="0"/>
+        </w:rPr>
+        <w:t xml:space="preserve">Línea base</w:t>
+      </w:r>
+      <w:r>
+        <w:rPr>
+          <w:rFonts w:ascii="Proxima Nova" w:cs="Proxima Nova" w:eastAsia="Proxima Nova" w:hAnsi="Proxima Nova"/>
+          <w:rtl w:val="0"/>
+        </w:rPr>
+        <w:t xml:space="preserve">: Contiene las líneas bases de los proyectos en desarrollo</w:t>
       </w:r>
       <w:r>
         <w:rPr>
@@ -10685,6 +10851,8 @@
         <w:jc w:val="both"/>
         <w:rPr>
           <w:rFonts w:ascii="Proxima Nova" w:cs="Proxima Nova" w:eastAsia="Proxima Nova" w:hAnsi="Proxima Nova"/>
+          <w:sz w:val="10"/>
+          <w:szCs w:val="10"/>
         </w:rPr>
       </w:pPr>
       <w:r>
@@ -10705,16 +10873,16 @@
             <wp:extent cx="5399730" cy="4038600"/>
             <wp:effectExtent b="0" l="0" r="0" t="0"/>
             <wp:wrapTopAndBottom distB="0" distT="0"/>
-            <wp:docPr id="4" name="image2.png"/>
+            <wp:docPr id="4" name="image3.png"/>
             <a:graphic>
               <a:graphicData uri="http://schemas.openxmlformats.org/drawingml/2006/picture">
                 <pic:pic>
                   <pic:nvPicPr>
-                    <pic:cNvPr id="0" name="image2.png"/>
+                    <pic:cNvPr id="0" name="image3.png"/>
                     <pic:cNvPicPr preferRelativeResize="0"/>
                   </pic:nvPicPr>
                   <pic:blipFill>
-                    <a:blip r:embed="rId12"/>
+                    <a:blip r:embed="rId8"/>
                     <a:srcRect b="0" l="0" r="0" t="0"/>
                     <a:stretch>
                       <a:fillRect/>
@@ -10737,23 +10905,111 @@
     </w:p>
     <w:p>
       <w:pPr>
+        <w:spacing w:line="300" w:lineRule="auto"/>
+        <w:ind w:firstLine="720"/>
+        <w:rPr>
+          <w:rFonts w:ascii="Proxima Nova" w:cs="Proxima Nova" w:eastAsia="Proxima Nova" w:hAnsi="Proxima Nova"/>
+          <w:sz w:val="4"/>
+          <w:szCs w:val="4"/>
+        </w:rPr>
+      </w:pPr>
+      <w:r>
+        <w:rPr>
+          <w:rFonts w:ascii="Proxima Nova" w:cs="Proxima Nova" w:eastAsia="Proxima Nova" w:hAnsi="Proxima Nova"/>
+          <w:rtl w:val="0"/>
+        </w:rPr>
+        <w:t xml:space="preserve">Figura 1. Estructura del repositorio de la empresa </w:t>
+      </w:r>
+      <w:r>
+        <w:rPr>
+          <w:rFonts w:ascii="Proxima Nova" w:cs="Proxima Nova" w:eastAsia="Proxima Nova" w:hAnsi="Proxima Nova"/>
+          <w:rtl w:val="0"/>
+        </w:rPr>
+        <w:t xml:space="preserve">Sonny</w:t>
+      </w:r>
+      <w:r>
+        <w:rPr>
+          <w:rFonts w:ascii="Proxima Nova" w:cs="Proxima Nova" w:eastAsia="Proxima Nova" w:hAnsi="Proxima Nova"/>
+          <w:rtl w:val="0"/>
+        </w:rPr>
+        <w:t xml:space="preserve"> SAC</w:t>
+      </w:r>
+      <w:r>
+        <w:rPr>
+          <w:rtl w:val="0"/>
+        </w:rPr>
+      </w:r>
+    </w:p>
+    <w:p>
+      <w:pPr>
         <w:pStyle w:val="Heading3"/>
-        <w:spacing w:after="200" w:before="200" w:line="300" w:lineRule="auto"/>
-        <w:rPr>
-          <w:rFonts w:ascii="Proxima Nova" w:cs="Proxima Nova" w:eastAsia="Proxima Nova" w:hAnsi="Proxima Nova"/>
-        </w:rPr>
-      </w:pPr>
-      <w:bookmarkStart w:colFirst="0" w:colLast="0" w:name="_heading=h.v3pesbi2zf64" w:id="12"/>
-      <w:bookmarkEnd w:id="12"/>
-      <w:r>
+        <w:spacing w:after="200" w:before="240" w:line="300" w:lineRule="auto"/>
         <w:rPr>
           <w:rFonts w:ascii="Proxima Nova" w:cs="Proxima Nova" w:eastAsia="Proxima Nova" w:hAnsi="Proxima Nova"/>
           <w:color w:val="008a05"/>
           <w:sz w:val="24"/>
           <w:szCs w:val="24"/>
+        </w:rPr>
+      </w:pPr>
+      <w:bookmarkStart w:colFirst="0" w:colLast="0" w:name="_heading=h.tjxs0ft018bm" w:id="12"/>
+      <w:bookmarkEnd w:id="12"/>
+      <w:r>
+        <w:br w:type="page"/>
+      </w:r>
+      <w:r>
+        <w:rPr>
+          <w:rtl w:val="0"/>
+        </w:rPr>
+      </w:r>
+    </w:p>
+    <w:p>
+      <w:pPr>
+        <w:pStyle w:val="Heading3"/>
+        <w:spacing w:after="200" w:before="240" w:line="300" w:lineRule="auto"/>
+        <w:rPr>
+          <w:rFonts w:ascii="Proxima Nova" w:cs="Proxima Nova" w:eastAsia="Proxima Nova" w:hAnsi="Proxima Nova"/>
+          <w:color w:val="008a05"/>
+          <w:sz w:val="24"/>
+          <w:szCs w:val="24"/>
+        </w:rPr>
+      </w:pPr>
+      <w:bookmarkStart w:colFirst="0" w:colLast="0" w:name="_heading=h.v3pesbi2zf64" w:id="13"/>
+      <w:bookmarkEnd w:id="13"/>
+      <w:r>
+        <w:rPr>
+          <w:rFonts w:ascii="Proxima Nova" w:cs="Proxima Nova" w:eastAsia="Proxima Nova" w:hAnsi="Proxima Nova"/>
+          <w:color w:val="008a05"/>
+          <w:sz w:val="24"/>
+          <w:szCs w:val="24"/>
           <w:rtl w:val="0"/>
         </w:rPr>
         <w:t xml:space="preserve">3.1.2 Definición de Nomenclatura</w:t>
+      </w:r>
+    </w:p>
+    <w:p>
+      <w:pPr>
+        <w:rPr/>
+      </w:pPr>
+      <w:r>
+        <w:rPr>
+          <w:rFonts w:ascii="Proxima Nova" w:cs="Proxima Nova" w:eastAsia="Proxima Nova" w:hAnsi="Proxima Nova"/>
+          <w:rtl w:val="0"/>
+        </w:rPr>
+        <w:t xml:space="preserve">A continuación, se presentan los casos que especifican la definición de nomenclaturas de ítems de la empresa </w:t>
+      </w:r>
+      <w:r>
+        <w:rPr>
+          <w:rFonts w:ascii="Proxima Nova" w:cs="Proxima Nova" w:eastAsia="Proxima Nova" w:hAnsi="Proxima Nova"/>
+          <w:rtl w:val="0"/>
+        </w:rPr>
+        <w:t xml:space="preserve">Sonny</w:t>
+      </w:r>
+      <w:r>
+        <w:rPr>
+          <w:rFonts w:ascii="Proxima Nova" w:cs="Proxima Nova" w:eastAsia="Proxima Nova" w:hAnsi="Proxima Nova"/>
+          <w:rtl w:val="0"/>
+        </w:rPr>
+        <w:t xml:space="preserve"> SAC.</w:t>
       </w:r>
       <w:r>
         <w:rPr>
@@ -10805,7 +11061,7 @@
     <w:sdt>
       <w:sdtPr>
         <w:lock w:val="contentLocked"/>
-        <w:id w:val="1826115490"/>
+        <w:id w:val="-809731881"/>
         <w:tag w:val="goog_rdk_4"/>
       </w:sdtPr>
       <w:sdtContent>
@@ -10891,6 +11147,76 @@
         <w:jc w:val="both"/>
         <w:rPr>
           <w:rFonts w:ascii="Proxima Nova" w:cs="Proxima Nova" w:eastAsia="Proxima Nova" w:hAnsi="Proxima Nova"/>
+          <w:b w:val="1"/>
+          <w:bCs w:val="1"/>
+        </w:rPr>
+      </w:pPr>
+      <w:r>
+        <w:rPr>
+          <w:rtl w:val="0"/>
+        </w:rPr>
+      </w:r>
+    </w:p>
+    <w:p>
+      <w:pPr>
+        <w:spacing w:after="0" w:lineRule="auto"/>
+        <w:ind w:left="0" w:firstLine="0"/>
+        <w:jc w:val="both"/>
+        <w:rPr>
+          <w:rFonts w:ascii="Proxima Nova" w:cs="Proxima Nova" w:eastAsia="Proxima Nova" w:hAnsi="Proxima Nova"/>
+          <w:color w:val="595959"/>
+          <w:sz w:val="20"/>
+          <w:szCs w:val="20"/>
+        </w:rPr>
+      </w:pPr>
+      <w:r>
+        <w:rPr>
+          <w:rFonts w:ascii="Proxima Nova" w:cs="Proxima Nova" w:eastAsia="Proxima Nova" w:hAnsi="Proxima Nova"/>
+          <w:color w:val="595959"/>
+          <w:sz w:val="20"/>
+          <w:szCs w:val="20"/>
+          <w:rtl w:val="0"/>
+        </w:rPr>
+        <w:t xml:space="preserve">Ejemplo: Plan de Gestión de la Configuración de la empresa </w:t>
+      </w:r>
+      <w:r>
+        <w:rPr>
+          <w:rFonts w:ascii="Proxima Nova" w:cs="Proxima Nova" w:eastAsia="Proxima Nova" w:hAnsi="Proxima Nova"/>
+          <w:color w:val="595959"/>
+          <w:sz w:val="20"/>
+          <w:szCs w:val="20"/>
+          <w:rtl w:val="0"/>
+        </w:rPr>
+        <w:t xml:space="preserve">SONNY</w:t>
+      </w:r>
+      <w:sdt>
+        <w:sdtPr>
+          <w:id w:val="-183736531"/>
+          <w:tag w:val="goog_rdk_5"/>
+        </w:sdtPr>
+        <w:sdtContent>
+          <w:r>
+            <w:rPr>
+              <w:rFonts w:ascii="Nova Mono" w:cs="Nova Mono" w:eastAsia="Nova Mono" w:hAnsi="Nova Mono"/>
+              <w:color w:val="595959"/>
+              <w:sz w:val="20"/>
+              <w:szCs w:val="20"/>
+              <w:rtl w:val="0"/>
+            </w:rPr>
+            <w:t xml:space="preserve"> SAC→  SONNY-PGC</w:t>
+          </w:r>
+        </w:sdtContent>
+      </w:sdt>
+    </w:p>
+    <w:p>
+      <w:pPr>
+        <w:spacing w:after="0" w:lineRule="auto"/>
+        <w:ind w:left="0" w:firstLine="0"/>
+        <w:jc w:val="both"/>
+        <w:rPr>
+          <w:rFonts w:ascii="Proxima Nova" w:cs="Proxima Nova" w:eastAsia="Proxima Nova" w:hAnsi="Proxima Nova"/>
+          <w:sz w:val="18"/>
+          <w:szCs w:val="18"/>
         </w:rPr>
       </w:pPr>
       <w:r>
@@ -10943,8 +11269,8 @@
     <w:sdt>
       <w:sdtPr>
         <w:lock w:val="contentLocked"/>
-        <w:id w:val="1741982508"/>
-        <w:tag w:val="goog_rdk_5"/>
+        <w:id w:val="-1121909039"/>
+        <w:tag w:val="goog_rdk_6"/>
       </w:sdtPr>
       <w:sdtContent>
         <w:tbl>
@@ -11040,6 +11366,53 @@
     <w:p>
       <w:pPr>
         <w:spacing w:after="0" w:lineRule="auto"/>
+        <w:jc w:val="both"/>
+        <w:rPr>
+          <w:rFonts w:ascii="Proxima Nova" w:cs="Proxima Nova" w:eastAsia="Proxima Nova" w:hAnsi="Proxima Nova"/>
+          <w:color w:val="595959"/>
+          <w:sz w:val="20"/>
+          <w:szCs w:val="20"/>
+        </w:rPr>
+      </w:pPr>
+      <w:sdt>
+        <w:sdtPr>
+          <w:id w:val="-947352222"/>
+          <w:tag w:val="goog_rdk_7"/>
+        </w:sdtPr>
+        <w:sdtContent>
+          <w:r>
+            <w:rPr>
+              <w:rFonts w:ascii="Nova Mono" w:cs="Nova Mono" w:eastAsia="Nova Mono" w:hAnsi="Nova Mono"/>
+              <w:color w:val="595959"/>
+              <w:sz w:val="20"/>
+              <w:szCs w:val="20"/>
+              <w:rtl w:val="0"/>
+            </w:rPr>
+            <w:t xml:space="preserve">Ejemplo: Project Charter del proyecto SISCOP→  SISCOP-PC</w:t>
+          </w:r>
+        </w:sdtContent>
+      </w:sdt>
+    </w:p>
+    <w:p>
+      <w:pPr>
+        <w:spacing w:after="0" w:lineRule="auto"/>
+        <w:jc w:val="both"/>
+        <w:rPr>
+          <w:rFonts w:ascii="Proxima Nova" w:cs="Proxima Nova" w:eastAsia="Proxima Nova" w:hAnsi="Proxima Nova"/>
+          <w:color w:val="595959"/>
+          <w:sz w:val="20"/>
+          <w:szCs w:val="20"/>
+        </w:rPr>
+      </w:pPr>
+      <w:r>
+        <w:rPr>
+          <w:rtl w:val="0"/>
+        </w:rPr>
+      </w:r>
+    </w:p>
+    <w:p>
+      <w:pPr>
+        <w:spacing w:after="0" w:lineRule="auto"/>
         <w:ind w:left="0" w:firstLine="0"/>
         <w:jc w:val="both"/>
         <w:rPr>
@@ -11081,8 +11454,8 @@
     <w:sdt>
       <w:sdtPr>
         <w:lock w:val="contentLocked"/>
-        <w:id w:val="143534755"/>
-        <w:tag w:val="goog_rdk_6"/>
+        <w:id w:val="730134792"/>
+        <w:tag w:val="goog_rdk_8"/>
       </w:sdtPr>
       <w:sdtContent>
         <w:tbl>
@@ -11163,10 +11536,12 @@
     <w:p>
       <w:pPr>
         <w:spacing w:after="0" w:lineRule="auto"/>
-        <w:ind w:left="1440" w:firstLine="0"/>
+        <w:ind w:left="0" w:firstLine="0"/>
         <w:jc w:val="both"/>
         <w:rPr>
           <w:rFonts w:ascii="Proxima Nova" w:cs="Proxima Nova" w:eastAsia="Proxima Nova" w:hAnsi="Proxima Nova"/>
+          <w:b w:val="1"/>
+          <w:bCs w:val="1"/>
         </w:rPr>
       </w:pPr>
       <w:r>
@@ -11178,12 +11553,41 @@
     <w:p>
       <w:pPr>
         <w:spacing w:after="0" w:lineRule="auto"/>
-        <w:ind w:left="0" w:firstLine="0"/>
+        <w:rPr>
+          <w:rFonts w:ascii="Proxima Nova" w:cs="Proxima Nova" w:eastAsia="Proxima Nova" w:hAnsi="Proxima Nova"/>
+          <w:color w:val="595959"/>
+          <w:sz w:val="20"/>
+          <w:szCs w:val="20"/>
+        </w:rPr>
+      </w:pPr>
+      <w:sdt>
+        <w:sdtPr>
+          <w:id w:val="-1943878781"/>
+          <w:tag w:val="goog_rdk_9"/>
+        </w:sdtPr>
+        <w:sdtContent>
+          <w:r>
+            <w:rPr>
+              <w:rFonts w:ascii="Nova Mono" w:cs="Nova Mono" w:eastAsia="Nova Mono" w:hAnsi="Nova Mono"/>
+              <w:color w:val="595959"/>
+              <w:sz w:val="20"/>
+              <w:szCs w:val="20"/>
+              <w:rtl w:val="0"/>
+            </w:rPr>
+            <w:t xml:space="preserve">Ejemplo: Plan de Pruebas para dos módulos distintos → SISCOP-PP-MOD1 y SISCOP-PP-MOD2</w:t>
+          </w:r>
+        </w:sdtContent>
+      </w:sdt>
+    </w:p>
+    <w:p>
+      <w:pPr>
+        <w:spacing w:after="0" w:lineRule="auto"/>
         <w:jc w:val="both"/>
         <w:rPr>
           <w:rFonts w:ascii="Proxima Nova" w:cs="Proxima Nova" w:eastAsia="Proxima Nova" w:hAnsi="Proxima Nova"/>
-          <w:b w:val="1"/>
-          <w:bCs w:val="1"/>
+          <w:color w:val="595959"/>
+          <w:sz w:val="20"/>
+          <w:szCs w:val="20"/>
         </w:rPr>
       </w:pPr>
       <w:r>
@@ -11236,8 +11640,8 @@
     <w:sdt>
       <w:sdtPr>
         <w:lock w:val="contentLocked"/>
-        <w:id w:val="47771137"/>
-        <w:tag w:val="goog_rdk_7"/>
+        <w:id w:val="111447552"/>
+        <w:tag w:val="goog_rdk_10"/>
       </w:sdtPr>
       <w:sdtContent>
         <w:tbl>
@@ -11318,9 +11722,11 @@
     <w:p>
       <w:pPr>
         <w:spacing w:after="0" w:lineRule="auto"/>
-        <w:jc w:val="both"/>
-        <w:rPr>
-          <w:rFonts w:ascii="Proxima Nova" w:cs="Proxima Nova" w:eastAsia="Proxima Nova" w:hAnsi="Proxima Nova"/>
+        <w:rPr>
+          <w:rFonts w:ascii="Proxima Nova" w:cs="Proxima Nova" w:eastAsia="Proxima Nova" w:hAnsi="Proxima Nova"/>
+          <w:color w:val="595959"/>
+          <w:sz w:val="20"/>
+          <w:szCs w:val="20"/>
         </w:rPr>
       </w:pPr>
       <w:r>
@@ -11332,6 +11738,51 @@
     <w:p>
       <w:pPr>
         <w:spacing w:after="0" w:lineRule="auto"/>
+        <w:rPr>
+          <w:rFonts w:ascii="Proxima Nova" w:cs="Proxima Nova" w:eastAsia="Proxima Nova" w:hAnsi="Proxima Nova"/>
+          <w:color w:val="595959"/>
+          <w:sz w:val="20"/>
+          <w:szCs w:val="20"/>
+        </w:rPr>
+      </w:pPr>
+      <w:sdt>
+        <w:sdtPr>
+          <w:id w:val="537783221"/>
+          <w:tag w:val="goog_rdk_11"/>
+        </w:sdtPr>
+        <w:sdtContent>
+          <w:r>
+            <w:rPr>
+              <w:rFonts w:ascii="Nova Mono" w:cs="Nova Mono" w:eastAsia="Nova Mono" w:hAnsi="Nova Mono"/>
+              <w:color w:val="595959"/>
+              <w:sz w:val="20"/>
+              <w:szCs w:val="20"/>
+              <w:rtl w:val="0"/>
+            </w:rPr>
+            <w:t xml:space="preserve">Ejemplo: Especificación del caso de uso 5 → SISCOP-CU05</w:t>
+          </w:r>
+        </w:sdtContent>
+      </w:sdt>
+    </w:p>
+    <w:p>
+      <w:pPr>
+        <w:spacing w:after="0" w:lineRule="auto"/>
+        <w:rPr>
+          <w:rFonts w:ascii="Proxima Nova" w:cs="Proxima Nova" w:eastAsia="Proxima Nova" w:hAnsi="Proxima Nova"/>
+          <w:color w:val="595959"/>
+          <w:sz w:val="20"/>
+          <w:szCs w:val="20"/>
+        </w:rPr>
+      </w:pPr>
+      <w:r>
+        <w:rPr>
+          <w:rtl w:val="0"/>
+        </w:rPr>
+      </w:r>
+    </w:p>
+    <w:p>
+      <w:pPr>
+        <w:spacing w:after="0" w:lineRule="auto"/>
         <w:jc w:val="both"/>
         <w:rPr>
           <w:rFonts w:ascii="Proxima Nova" w:cs="Proxima Nova" w:eastAsia="Proxima Nova" w:hAnsi="Proxima Nova"/>
@@ -11349,19 +11800,36 @@
       <w:pPr>
         <w:pStyle w:val="Heading3"/>
         <w:spacing w:after="200" w:before="200" w:line="300" w:lineRule="auto"/>
-        <w:rPr/>
-      </w:pPr>
-      <w:bookmarkStart w:colFirst="0" w:colLast="0" w:name="_heading=h.qa9igwvqetd2" w:id="13"/>
-      <w:bookmarkEnd w:id="13"/>
-      <w:r>
         <w:rPr>
           <w:rFonts w:ascii="Proxima Nova" w:cs="Proxima Nova" w:eastAsia="Proxima Nova" w:hAnsi="Proxima Nova"/>
           <w:color w:val="008a05"/>
           <w:sz w:val="24"/>
           <w:szCs w:val="24"/>
+        </w:rPr>
+      </w:pPr>
+      <w:bookmarkStart w:colFirst="0" w:colLast="0" w:name="_heading=h.qa9igwvqetd2" w:id="14"/>
+      <w:bookmarkEnd w:id="14"/>
+      <w:r>
+        <w:rPr>
+          <w:rFonts w:ascii="Proxima Nova" w:cs="Proxima Nova" w:eastAsia="Proxima Nova" w:hAnsi="Proxima Nova"/>
+          <w:color w:val="008a05"/>
+          <w:sz w:val="24"/>
+          <w:szCs w:val="24"/>
           <w:rtl w:val="0"/>
         </w:rPr>
         <w:t xml:space="preserve">3.1.3 Lista y Clasificación de Ítems</w:t>
+      </w:r>
+    </w:p>
+    <w:p>
+      <w:pPr>
+        <w:rPr/>
+      </w:pPr>
+      <w:r>
+        <w:rPr>
+          <w:rFonts w:ascii="Proxima Nova" w:cs="Proxima Nova" w:eastAsia="Proxima Nova" w:hAnsi="Proxima Nova"/>
+          <w:rtl w:val="0"/>
+        </w:rPr>
+        <w:t xml:space="preserve">La Tabla 5 presenta la lista de ítems del proyecto Sistema de Control de Peso (SISCOP), especificando su tipo y nomenclatura correspondiente.</w:t>
       </w:r>
       <w:r>
         <w:rPr>
@@ -13789,7 +14257,7 @@
                 <w:rFonts w:ascii="Proxima Nova" w:cs="Proxima Nova" w:eastAsia="Proxima Nova" w:hAnsi="Proxima Nova"/>
                 <w:rtl w:val="0"/>
               </w:rPr>
-              <w:t xml:space="preserve">Soporte</w:t>
+              <w:t xml:space="preserve">Fuente</w:t>
             </w:r>
           </w:p>
         </w:tc>
@@ -13821,7 +14289,7 @@
                 <w:rFonts w:ascii="Proxima Nova" w:cs="Proxima Nova" w:eastAsia="Proxima Nova" w:hAnsi="Proxima Nova"/>
                 <w:rtl w:val="0"/>
               </w:rPr>
-              <w:t xml:space="preserve">Manual de configuración de entorno</w:t>
+              <w:t xml:space="preserve">API REST funcional</w:t>
             </w:r>
           </w:p>
         </w:tc>
@@ -13853,7 +14321,7 @@
                 <w:rFonts w:ascii="Proxima Nova" w:cs="Proxima Nova" w:eastAsia="Proxima Nova" w:hAnsi="Proxima Nova"/>
                 <w:rtl w:val="0"/>
               </w:rPr>
-              <w:t xml:space="preserve">SISCOP-CE.docx</w:t>
+              <w:t xml:space="preserve">SISCOP-API.py</w:t>
             </w:r>
           </w:p>
         </w:tc>
@@ -13958,7 +14426,7 @@
                 <w:rFonts w:ascii="Proxima Nova" w:cs="Proxima Nova" w:eastAsia="Proxima Nova" w:hAnsi="Proxima Nova"/>
                 <w:rtl w:val="0"/>
               </w:rPr>
-              <w:t xml:space="preserve">Módulo de conexión a base de datos</w:t>
+              <w:t xml:space="preserve">Módulo de autenticación</w:t>
             </w:r>
           </w:p>
         </w:tc>
@@ -13991,7 +14459,7 @@
                 <w:rFonts w:ascii="Proxima Nova" w:cs="Proxima Nova" w:eastAsia="Proxima Nova" w:hAnsi="Proxima Nova"/>
                 <w:rtl w:val="0"/>
               </w:rPr>
-              <w:t xml:space="preserve">SISCOP-CBD.py</w:t>
+              <w:t xml:space="preserve">SISCOP-AUTH.py</w:t>
             </w:r>
           </w:p>
         </w:tc>
@@ -14032,7 +14500,7 @@
       <w:tr>
         <w:trPr>
           <w:cantSplit w:val="0"/>
-          <w:trHeight w:val="500" w:hRule="atLeast"/>
+          <w:trHeight w:val="770" w:hRule="atLeast"/>
           <w:tblHeader w:val="0"/>
         </w:trPr>
         <w:tc>
@@ -14095,7 +14563,7 @@
                 <w:rFonts w:ascii="Proxima Nova" w:cs="Proxima Nova" w:eastAsia="Proxima Nova" w:hAnsi="Proxima Nova"/>
                 <w:rtl w:val="0"/>
               </w:rPr>
-              <w:t xml:space="preserve">API REST funcional</w:t>
+              <w:t xml:space="preserve">Sistema de rutas</w:t>
             </w:r>
           </w:p>
         </w:tc>
@@ -14127,7 +14595,7 @@
                 <w:rFonts w:ascii="Proxima Nova" w:cs="Proxima Nova" w:eastAsia="Proxima Nova" w:hAnsi="Proxima Nova"/>
                 <w:rtl w:val="0"/>
               </w:rPr>
-              <w:t xml:space="preserve">SISCOP-API.py</w:t>
+              <w:t xml:space="preserve">SISCOP-ROUTES.jsx</w:t>
             </w:r>
           </w:p>
         </w:tc>
@@ -14232,7 +14700,7 @@
                 <w:rFonts w:ascii="Proxima Nova" w:cs="Proxima Nova" w:eastAsia="Proxima Nova" w:hAnsi="Proxima Nova"/>
                 <w:rtl w:val="0"/>
               </w:rPr>
-              <w:t xml:space="preserve">Módulo de autenticación</w:t>
+              <w:t xml:space="preserve">Pantalla de autenticación</w:t>
             </w:r>
           </w:p>
         </w:tc>
@@ -14265,7 +14733,7 @@
                 <w:rFonts w:ascii="Proxima Nova" w:cs="Proxima Nova" w:eastAsia="Proxima Nova" w:hAnsi="Proxima Nova"/>
                 <w:rtl w:val="0"/>
               </w:rPr>
-              <w:t xml:space="preserve">SISCOP-AUTH.py</w:t>
+              <w:t xml:space="preserve">SISCOP-LOGIN.jsx</w:t>
             </w:r>
           </w:p>
         </w:tc>
@@ -14306,7 +14774,7 @@
       <w:tr>
         <w:trPr>
           <w:cantSplit w:val="0"/>
-          <w:trHeight w:val="770" w:hRule="atLeast"/>
+          <w:trHeight w:val="500" w:hRule="atLeast"/>
           <w:tblHeader w:val="0"/>
         </w:trPr>
         <w:tc>
@@ -14369,7 +14837,7 @@
                 <w:rFonts w:ascii="Proxima Nova" w:cs="Proxima Nova" w:eastAsia="Proxima Nova" w:hAnsi="Proxima Nova"/>
                 <w:rtl w:val="0"/>
               </w:rPr>
-              <w:t xml:space="preserve">Sistema de rutas</w:t>
+              <w:t xml:space="preserve">Interfaces funcionales de pacientes</w:t>
             </w:r>
           </w:p>
         </w:tc>
@@ -14401,7 +14869,7 @@
                 <w:rFonts w:ascii="Proxima Nova" w:cs="Proxima Nova" w:eastAsia="Proxima Nova" w:hAnsi="Proxima Nova"/>
                 <w:rtl w:val="0"/>
               </w:rPr>
-              <w:t xml:space="preserve">SISCOP-ROUTES.jsx</w:t>
+              <w:t xml:space="preserve">SISCOP-PAC.jsx</w:t>
             </w:r>
           </w:p>
         </w:tc>
@@ -14506,7 +14974,7 @@
                 <w:rFonts w:ascii="Proxima Nova" w:cs="Proxima Nova" w:eastAsia="Proxima Nova" w:hAnsi="Proxima Nova"/>
                 <w:rtl w:val="0"/>
               </w:rPr>
-              <w:t xml:space="preserve">Pantalla de autenticación</w:t>
+              <w:t xml:space="preserve">Interfaces funcionales de historia clínica</w:t>
             </w:r>
           </w:p>
         </w:tc>
@@ -14539,7 +15007,7 @@
                 <w:rFonts w:ascii="Proxima Nova" w:cs="Proxima Nova" w:eastAsia="Proxima Nova" w:hAnsi="Proxima Nova"/>
                 <w:rtl w:val="0"/>
               </w:rPr>
-              <w:t xml:space="preserve">SISCOP-LOGIN.jsx</w:t>
+              <w:t xml:space="preserve">SISCOP-HC.jsx</w:t>
             </w:r>
           </w:p>
         </w:tc>
@@ -14643,7 +15111,7 @@
                 <w:rFonts w:ascii="Proxima Nova" w:cs="Proxima Nova" w:eastAsia="Proxima Nova" w:hAnsi="Proxima Nova"/>
                 <w:rtl w:val="0"/>
               </w:rPr>
-              <w:t xml:space="preserve">Interfaces funcionales de pacientes</w:t>
+              <w:t xml:space="preserve">Interfaces funcionales de evaluación nutricional</w:t>
             </w:r>
           </w:p>
         </w:tc>
@@ -14675,7 +15143,7 @@
                 <w:rFonts w:ascii="Proxima Nova" w:cs="Proxima Nova" w:eastAsia="Proxima Nova" w:hAnsi="Proxima Nova"/>
                 <w:rtl w:val="0"/>
               </w:rPr>
-              <w:t xml:space="preserve">SISCOP-PAC.jsx</w:t>
+              <w:t xml:space="preserve">SISCOP-EVN.jsx</w:t>
             </w:r>
           </w:p>
         </w:tc>
@@ -14780,7 +15248,7 @@
                 <w:rFonts w:ascii="Proxima Nova" w:cs="Proxima Nova" w:eastAsia="Proxima Nova" w:hAnsi="Proxima Nova"/>
                 <w:rtl w:val="0"/>
               </w:rPr>
-              <w:t xml:space="preserve">Interfaces funcionales de historia clínica</w:t>
+              <w:t xml:space="preserve">Módulo gráfico</w:t>
             </w:r>
           </w:p>
         </w:tc>
@@ -14813,7 +15281,7 @@
                 <w:rFonts w:ascii="Proxima Nova" w:cs="Proxima Nova" w:eastAsia="Proxima Nova" w:hAnsi="Proxima Nova"/>
                 <w:rtl w:val="0"/>
               </w:rPr>
-              <w:t xml:space="preserve">SISCOP-HC.jsx</w:t>
+              <w:t xml:space="preserve">SISCOP-GRAF.jsx</w:t>
             </w:r>
           </w:p>
         </w:tc>
@@ -14865,6 +15333,7 @@
               <w:bottom w:color="e0e0e0" w:space="0" w:sz="8" w:val="single"/>
               <w:right w:color="ffffff" w:space="0" w:sz="8" w:val="single"/>
             </w:tcBorders>
+            <w:shd w:fill="ffffff" w:val="clear"/>
             <w:tcMar>
               <w:top w:w="100.0" w:type="dxa"/>
               <w:left w:w="100.0" w:type="dxa"/>
@@ -14885,7 +15354,86 @@
                 <w:rFonts w:ascii="Proxima Nova" w:cs="Proxima Nova" w:eastAsia="Proxima Nova" w:hAnsi="Proxima Nova"/>
                 <w:rtl w:val="0"/>
               </w:rPr>
-              <w:t xml:space="preserve">Fuente</w:t>
+              <w:t xml:space="preserve">Soporte</w:t>
+            </w:r>
+          </w:p>
+        </w:tc>
+        <w:tc>
+          <w:tcPr>
+            <w:tcBorders>
+              <w:top w:color="e0e0e0" w:space="0" w:sz="8" w:val="single"/>
+              <w:left w:color="ffffff" w:space="0" w:sz="8" w:val="single"/>
+              <w:bottom w:color="e0e0e0" w:space="0" w:sz="8" w:val="single"/>
+              <w:right w:color="ffffff" w:space="0" w:sz="8" w:val="single"/>
+            </w:tcBorders>
+            <w:shd w:fill="ffffff" w:val="clear"/>
+            <w:tcMar>
+              <w:top w:w="100.0" w:type="dxa"/>
+              <w:left w:w="100.0" w:type="dxa"/>
+              <w:bottom w:w="100.0" w:type="dxa"/>
+              <w:right w:w="100.0" w:type="dxa"/>
+            </w:tcMar>
+            <w:vAlign w:val="top"/>
+          </w:tcPr>
+          <w:p>
+            <w:pPr>
+              <w:spacing w:after="0" w:line="240" w:lineRule="auto"/>
+              <w:rPr>
+                <w:rFonts w:ascii="Proxima Nova" w:cs="Proxima Nova" w:eastAsia="Proxima Nova" w:hAnsi="Proxima Nova"/>
+              </w:rPr>
+            </w:pPr>
+            <w:r>
+              <w:rPr>
+                <w:rFonts w:ascii="Proxima Nova" w:cs="Proxima Nova" w:eastAsia="Proxima Nova" w:hAnsi="Proxima Nova"/>
+                <w:rtl w:val="0"/>
+              </w:rPr>
+              <w:t xml:space="preserve">Página de descarga</w:t>
+            </w:r>
+            <w:r>
+              <w:rPr>
+                <w:rFonts w:ascii="Proxima Nova" w:cs="Proxima Nova" w:eastAsia="Proxima Nova" w:hAnsi="Proxima Nova"/>
+                <w:rtl w:val="0"/>
+              </w:rPr>
+              <w:t xml:space="preserve"> </w:t>
+            </w:r>
+            <w:hyperlink r:id="rId9">
+              <w:r>
+                <w:rPr>
+                  <w:rFonts w:ascii="Proxima Nova" w:cs="Proxima Nova" w:eastAsia="Proxima Nova" w:hAnsi="Proxima Nova"/>
+                  <w:rtl w:val="0"/>
+                </w:rPr>
+                <w:t xml:space="preserve">Node.js</w:t>
+              </w:r>
+            </w:hyperlink>
+            <w:r>
+              <w:rPr>
+                <w:rFonts w:ascii="Proxima Nova" w:cs="Proxima Nova" w:eastAsia="Proxima Nova" w:hAnsi="Proxima Nova"/>
+                <w:rtl w:val="0"/>
+              </w:rPr>
+              <w:t xml:space="preserve"> y </w:t>
+            </w:r>
+            <w:hyperlink r:id="rId10">
+              <w:r>
+                <w:rPr>
+                  <w:rFonts w:ascii="Proxima Nova" w:cs="Proxima Nova" w:eastAsia="Proxima Nova" w:hAnsi="Proxima Nova"/>
+                  <w:rtl w:val="0"/>
+                </w:rPr>
+                <w:t xml:space="preserve">React.js</w:t>
+              </w:r>
+            </w:hyperlink>
+            <w:r>
+              <w:rPr>
+                <w:rFonts w:ascii="Proxima Nova" w:cs="Proxima Nova" w:eastAsia="Proxima Nova" w:hAnsi="Proxima Nova"/>
+                <w:rtl w:val="0"/>
+              </w:rPr>
+              <w:t xml:space="preserve"> </w:t>
+            </w:r>
+            <w:r>
+              <w:rPr>
+                <w:rFonts w:ascii="Proxima Nova" w:cs="Proxima Nova" w:eastAsia="Proxima Nova" w:hAnsi="Proxima Nova"/>
+                <w:rtl w:val="0"/>
+              </w:rPr>
+              <w:t xml:space="preserve">- Desarrollo backend y frontend</w:t>
             </w:r>
           </w:p>
         </w:tc>
@@ -14917,7 +15465,7 @@
                 <w:rFonts w:ascii="Proxima Nova" w:cs="Proxima Nova" w:eastAsia="Proxima Nova" w:hAnsi="Proxima Nova"/>
                 <w:rtl w:val="0"/>
               </w:rPr>
-              <w:t xml:space="preserve">Interfaces funcionales de evaluación nutricional</w:t>
+              <w:t xml:space="preserve">NODE-V24.15.0-X64.MSI</w:t>
             </w:r>
           </w:p>
         </w:tc>
@@ -14929,38 +15477,7 @@
               <w:bottom w:color="e0e0e0" w:space="0" w:sz="8" w:val="single"/>
               <w:right w:color="ffffff" w:space="0" w:sz="8" w:val="single"/>
             </w:tcBorders>
-            <w:tcMar>
-              <w:top w:w="100.0" w:type="dxa"/>
-              <w:left w:w="100.0" w:type="dxa"/>
-              <w:bottom w:w="100.0" w:type="dxa"/>
-              <w:right w:w="100.0" w:type="dxa"/>
-            </w:tcMar>
-            <w:vAlign w:val="top"/>
-          </w:tcPr>
-          <w:p>
-            <w:pPr>
-              <w:spacing w:after="0" w:line="240" w:lineRule="auto"/>
-              <w:rPr>
-                <w:rFonts w:ascii="Proxima Nova" w:cs="Proxima Nova" w:eastAsia="Proxima Nova" w:hAnsi="Proxima Nova"/>
-              </w:rPr>
-            </w:pPr>
-            <w:r>
-              <w:rPr>
-                <w:rFonts w:ascii="Proxima Nova" w:cs="Proxima Nova" w:eastAsia="Proxima Nova" w:hAnsi="Proxima Nova"/>
-                <w:rtl w:val="0"/>
-              </w:rPr>
-              <w:t xml:space="preserve">SISCOP-EVN.jsx</w:t>
-            </w:r>
-          </w:p>
-        </w:tc>
-        <w:tc>
-          <w:tcPr>
-            <w:tcBorders>
-              <w:top w:color="e0e0e0" w:space="0" w:sz="8" w:val="single"/>
-              <w:left w:color="ffffff" w:space="0" w:sz="8" w:val="single"/>
-              <w:bottom w:color="e0e0e0" w:space="0" w:sz="8" w:val="single"/>
-              <w:right w:color="ffffff" w:space="0" w:sz="8" w:val="single"/>
-            </w:tcBorders>
+            <w:shd w:fill="ffffff" w:val="clear"/>
             <w:tcMar>
               <w:top w:w="100.0" w:type="dxa"/>
               <w:left w:w="100.0" w:type="dxa"/>
@@ -15021,280 +15538,6 @@
                 <w:rFonts w:ascii="Proxima Nova" w:cs="Proxima Nova" w:eastAsia="Proxima Nova" w:hAnsi="Proxima Nova"/>
                 <w:rtl w:val="0"/>
               </w:rPr>
-              <w:t xml:space="preserve">Fuente</w:t>
-            </w:r>
-          </w:p>
-        </w:tc>
-        <w:tc>
-          <w:tcPr>
-            <w:tcBorders>
-              <w:top w:color="e0e0e0" w:space="0" w:sz="8" w:val="single"/>
-              <w:left w:color="ffffff" w:space="0" w:sz="8" w:val="single"/>
-              <w:bottom w:color="e0e0e0" w:space="0" w:sz="8" w:val="single"/>
-              <w:right w:color="ffffff" w:space="0" w:sz="8" w:val="single"/>
-            </w:tcBorders>
-            <w:shd w:fill="efefef" w:val="clear"/>
-            <w:tcMar>
-              <w:top w:w="100.0" w:type="dxa"/>
-              <w:left w:w="100.0" w:type="dxa"/>
-              <w:bottom w:w="100.0" w:type="dxa"/>
-              <w:right w:w="100.0" w:type="dxa"/>
-            </w:tcMar>
-            <w:vAlign w:val="top"/>
-          </w:tcPr>
-          <w:p>
-            <w:pPr>
-              <w:spacing w:after="0" w:line="240" w:lineRule="auto"/>
-              <w:rPr>
-                <w:rFonts w:ascii="Proxima Nova" w:cs="Proxima Nova" w:eastAsia="Proxima Nova" w:hAnsi="Proxima Nova"/>
-              </w:rPr>
-            </w:pPr>
-            <w:r>
-              <w:rPr>
-                <w:rFonts w:ascii="Proxima Nova" w:cs="Proxima Nova" w:eastAsia="Proxima Nova" w:hAnsi="Proxima Nova"/>
-                <w:rtl w:val="0"/>
-              </w:rPr>
-              <w:t xml:space="preserve">Módulo gráfico</w:t>
-            </w:r>
-          </w:p>
-        </w:tc>
-        <w:tc>
-          <w:tcPr>
-            <w:tcBorders>
-              <w:top w:color="e0e0e0" w:space="0" w:sz="8" w:val="single"/>
-              <w:left w:color="ffffff" w:space="0" w:sz="8" w:val="single"/>
-              <w:bottom w:color="e0e0e0" w:space="0" w:sz="8" w:val="single"/>
-              <w:right w:color="ffffff" w:space="0" w:sz="8" w:val="single"/>
-            </w:tcBorders>
-            <w:shd w:fill="efefef" w:val="clear"/>
-            <w:tcMar>
-              <w:top w:w="100.0" w:type="dxa"/>
-              <w:left w:w="100.0" w:type="dxa"/>
-              <w:bottom w:w="100.0" w:type="dxa"/>
-              <w:right w:w="100.0" w:type="dxa"/>
-            </w:tcMar>
-            <w:vAlign w:val="top"/>
-          </w:tcPr>
-          <w:p>
-            <w:pPr>
-              <w:spacing w:after="0" w:line="240" w:lineRule="auto"/>
-              <w:rPr>
-                <w:rFonts w:ascii="Proxima Nova" w:cs="Proxima Nova" w:eastAsia="Proxima Nova" w:hAnsi="Proxima Nova"/>
-              </w:rPr>
-            </w:pPr>
-            <w:r>
-              <w:rPr>
-                <w:rFonts w:ascii="Proxima Nova" w:cs="Proxima Nova" w:eastAsia="Proxima Nova" w:hAnsi="Proxima Nova"/>
-                <w:rtl w:val="0"/>
-              </w:rPr>
-              <w:t xml:space="preserve">SISCOP-GRAF.jsx</w:t>
-            </w:r>
-          </w:p>
-        </w:tc>
-        <w:tc>
-          <w:tcPr>
-            <w:tcBorders>
-              <w:top w:color="e0e0e0" w:space="0" w:sz="8" w:val="single"/>
-              <w:left w:color="ffffff" w:space="0" w:sz="8" w:val="single"/>
-              <w:bottom w:color="e0e0e0" w:space="0" w:sz="8" w:val="single"/>
-              <w:right w:color="ffffff" w:space="0" w:sz="8" w:val="single"/>
-            </w:tcBorders>
-            <w:shd w:fill="efefef" w:val="clear"/>
-            <w:tcMar>
-              <w:top w:w="100.0" w:type="dxa"/>
-              <w:left w:w="100.0" w:type="dxa"/>
-              <w:bottom w:w="100.0" w:type="dxa"/>
-              <w:right w:w="100.0" w:type="dxa"/>
-            </w:tcMar>
-            <w:vAlign w:val="top"/>
-          </w:tcPr>
-          <w:p>
-            <w:pPr>
-              <w:spacing w:after="0" w:line="240" w:lineRule="auto"/>
-              <w:rPr>
-                <w:rFonts w:ascii="Proxima Nova" w:cs="Proxima Nova" w:eastAsia="Proxima Nova" w:hAnsi="Proxima Nova"/>
-              </w:rPr>
-            </w:pPr>
-            <w:r>
-              <w:rPr>
-                <w:rFonts w:ascii="Proxima Nova" w:cs="Proxima Nova" w:eastAsia="Proxima Nova" w:hAnsi="Proxima Nova"/>
-                <w:rtl w:val="0"/>
-              </w:rPr>
-              <w:t xml:space="preserve">SISCOP</w:t>
-            </w:r>
-          </w:p>
-        </w:tc>
-      </w:tr>
-      <w:tr>
-        <w:trPr>
-          <w:cantSplit w:val="0"/>
-          <w:trHeight w:val="500" w:hRule="atLeast"/>
-          <w:tblHeader w:val="0"/>
-        </w:trPr>
-        <w:tc>
-          <w:tcPr>
-            <w:tcBorders>
-              <w:top w:color="e0e0e0" w:space="0" w:sz="8" w:val="single"/>
-              <w:left w:color="ffffff" w:space="0" w:sz="8" w:val="single"/>
-              <w:bottom w:color="e0e0e0" w:space="0" w:sz="8" w:val="single"/>
-              <w:right w:color="ffffff" w:space="0" w:sz="8" w:val="single"/>
-            </w:tcBorders>
-            <w:tcMar>
-              <w:top w:w="100.0" w:type="dxa"/>
-              <w:left w:w="100.0" w:type="dxa"/>
-              <w:bottom w:w="100.0" w:type="dxa"/>
-              <w:right w:w="100.0" w:type="dxa"/>
-            </w:tcMar>
-            <w:vAlign w:val="top"/>
-          </w:tcPr>
-          <w:p>
-            <w:pPr>
-              <w:spacing w:after="0" w:line="240" w:lineRule="auto"/>
-              <w:rPr>
-                <w:rFonts w:ascii="Proxima Nova" w:cs="Proxima Nova" w:eastAsia="Proxima Nova" w:hAnsi="Proxima Nova"/>
-              </w:rPr>
-            </w:pPr>
-            <w:r>
-              <w:rPr>
-                <w:rFonts w:ascii="Proxima Nova" w:cs="Proxima Nova" w:eastAsia="Proxima Nova" w:hAnsi="Proxima Nova"/>
-                <w:rtl w:val="0"/>
-              </w:rPr>
-              <w:t xml:space="preserve">Soporte</w:t>
-            </w:r>
-          </w:p>
-        </w:tc>
-        <w:tc>
-          <w:tcPr>
-            <w:tcBorders>
-              <w:top w:color="e0e0e0" w:space="0" w:sz="8" w:val="single"/>
-              <w:left w:color="ffffff" w:space="0" w:sz="8" w:val="single"/>
-              <w:bottom w:color="e0e0e0" w:space="0" w:sz="8" w:val="single"/>
-              <w:right w:color="ffffff" w:space="0" w:sz="8" w:val="single"/>
-            </w:tcBorders>
-            <w:tcMar>
-              <w:top w:w="100.0" w:type="dxa"/>
-              <w:left w:w="100.0" w:type="dxa"/>
-              <w:bottom w:w="100.0" w:type="dxa"/>
-              <w:right w:w="100.0" w:type="dxa"/>
-            </w:tcMar>
-            <w:vAlign w:val="top"/>
-          </w:tcPr>
-          <w:p>
-            <w:pPr>
-              <w:spacing w:after="0" w:line="240" w:lineRule="auto"/>
-              <w:rPr>
-                <w:rFonts w:ascii="Proxima Nova" w:cs="Proxima Nova" w:eastAsia="Proxima Nova" w:hAnsi="Proxima Nova"/>
-              </w:rPr>
-            </w:pPr>
-            <w:r>
-              <w:rPr>
-                <w:rFonts w:ascii="Proxima Nova" w:cs="Proxima Nova" w:eastAsia="Proxima Nova" w:hAnsi="Proxima Nova"/>
-                <w:rtl w:val="0"/>
-              </w:rPr>
-              <w:t xml:space="preserve">Manual de uso del sistema</w:t>
-            </w:r>
-          </w:p>
-        </w:tc>
-        <w:tc>
-          <w:tcPr>
-            <w:tcBorders>
-              <w:top w:color="e0e0e0" w:space="0" w:sz="8" w:val="single"/>
-              <w:left w:color="ffffff" w:space="0" w:sz="8" w:val="single"/>
-              <w:bottom w:color="e0e0e0" w:space="0" w:sz="8" w:val="single"/>
-              <w:right w:color="ffffff" w:space="0" w:sz="8" w:val="single"/>
-            </w:tcBorders>
-            <w:tcMar>
-              <w:top w:w="100.0" w:type="dxa"/>
-              <w:left w:w="100.0" w:type="dxa"/>
-              <w:bottom w:w="100.0" w:type="dxa"/>
-              <w:right w:w="100.0" w:type="dxa"/>
-            </w:tcMar>
-            <w:vAlign w:val="top"/>
-          </w:tcPr>
-          <w:p>
-            <w:pPr>
-              <w:spacing w:after="0" w:line="240" w:lineRule="auto"/>
-              <w:rPr>
-                <w:rFonts w:ascii="Proxima Nova" w:cs="Proxima Nova" w:eastAsia="Proxima Nova" w:hAnsi="Proxima Nova"/>
-              </w:rPr>
-            </w:pPr>
-            <w:r>
-              <w:rPr>
-                <w:rFonts w:ascii="Proxima Nova" w:cs="Proxima Nova" w:eastAsia="Proxima Nova" w:hAnsi="Proxima Nova"/>
-                <w:rtl w:val="0"/>
-              </w:rPr>
-              <w:t xml:space="preserve">SISCOP-MU.docx</w:t>
-            </w:r>
-          </w:p>
-        </w:tc>
-        <w:tc>
-          <w:tcPr>
-            <w:tcBorders>
-              <w:top w:color="e0e0e0" w:space="0" w:sz="8" w:val="single"/>
-              <w:left w:color="ffffff" w:space="0" w:sz="8" w:val="single"/>
-              <w:bottom w:color="e0e0e0" w:space="0" w:sz="8" w:val="single"/>
-              <w:right w:color="ffffff" w:space="0" w:sz="8" w:val="single"/>
-            </w:tcBorders>
-            <w:tcMar>
-              <w:top w:w="100.0" w:type="dxa"/>
-              <w:left w:w="100.0" w:type="dxa"/>
-              <w:bottom w:w="100.0" w:type="dxa"/>
-              <w:right w:w="100.0" w:type="dxa"/>
-            </w:tcMar>
-            <w:vAlign w:val="top"/>
-          </w:tcPr>
-          <w:p>
-            <w:pPr>
-              <w:spacing w:after="0" w:line="240" w:lineRule="auto"/>
-              <w:rPr>
-                <w:rFonts w:ascii="Proxima Nova" w:cs="Proxima Nova" w:eastAsia="Proxima Nova" w:hAnsi="Proxima Nova"/>
-              </w:rPr>
-            </w:pPr>
-            <w:r>
-              <w:rPr>
-                <w:rFonts w:ascii="Proxima Nova" w:cs="Proxima Nova" w:eastAsia="Proxima Nova" w:hAnsi="Proxima Nova"/>
-                <w:rtl w:val="0"/>
-              </w:rPr>
-              <w:t xml:space="preserve">SISCOP</w:t>
-            </w:r>
-          </w:p>
-        </w:tc>
-      </w:tr>
-      <w:tr>
-        <w:trPr>
-          <w:cantSplit w:val="0"/>
-          <w:trHeight w:val="500" w:hRule="atLeast"/>
-          <w:tblHeader w:val="0"/>
-        </w:trPr>
-        <w:tc>
-          <w:tcPr>
-            <w:tcBorders>
-              <w:top w:color="e0e0e0" w:space="0" w:sz="8" w:val="single"/>
-              <w:left w:color="ffffff" w:space="0" w:sz="8" w:val="single"/>
-              <w:bottom w:color="e0e0e0" w:space="0" w:sz="8" w:val="single"/>
-              <w:right w:color="ffffff" w:space="0" w:sz="8" w:val="single"/>
-            </w:tcBorders>
-            <w:shd w:fill="efefef" w:val="clear"/>
-            <w:tcMar>
-              <w:top w:w="100.0" w:type="dxa"/>
-              <w:left w:w="100.0" w:type="dxa"/>
-              <w:bottom w:w="100.0" w:type="dxa"/>
-              <w:right w:w="100.0" w:type="dxa"/>
-            </w:tcMar>
-            <w:vAlign w:val="top"/>
-          </w:tcPr>
-          <w:p>
-            <w:pPr>
-              <w:spacing w:after="0" w:line="240" w:lineRule="auto"/>
-              <w:rPr>
-                <w:rFonts w:ascii="Proxima Nova" w:cs="Proxima Nova" w:eastAsia="Proxima Nova" w:hAnsi="Proxima Nova"/>
-              </w:rPr>
-            </w:pPr>
-            <w:r>
-              <w:rPr>
-                <w:rFonts w:ascii="Proxima Nova" w:cs="Proxima Nova" w:eastAsia="Proxima Nova" w:hAnsi="Proxima Nova"/>
-                <w:rtl w:val="0"/>
-              </w:rPr>
               <w:t xml:space="preserve">Soporte</w:t>
             </w:r>
           </w:p>
@@ -15328,7 +15571,7 @@
                 <w:rFonts w:ascii="Proxima Nova" w:cs="Proxima Nova" w:eastAsia="Proxima Nova" w:hAnsi="Proxima Nova"/>
                 <w:rtl w:val="0"/>
               </w:rPr>
-              <w:t xml:space="preserve">Reporte de pruebas funcionales</w:t>
+              <w:t xml:space="preserve">Pagina de descarga PostgreSql - Motor DB</w:t>
             </w:r>
           </w:p>
         </w:tc>
@@ -15361,7 +15604,7 @@
                 <w:rFonts w:ascii="Proxima Nova" w:cs="Proxima Nova" w:eastAsia="Proxima Nova" w:hAnsi="Proxima Nova"/>
                 <w:rtl w:val="0"/>
               </w:rPr>
-              <w:t xml:space="preserve">SISCOP-RPF.docx</w:t>
+              <w:t xml:space="preserve">POSTGRESQL.EXE</w:t>
             </w:r>
           </w:p>
         </w:tc>
@@ -15410,7 +15653,7 @@
             <w:tcBorders>
               <w:top w:color="e0e0e0" w:space="0" w:sz="8" w:val="single"/>
               <w:left w:color="ffffff" w:space="0" w:sz="8" w:val="single"/>
-              <w:bottom w:color="e0e0e0" w:space="0" w:sz="8" w:val="single"/>
+              <w:bottom w:color="00aee4" w:space="0" w:sz="8" w:val="single"/>
               <w:right w:color="ffffff" w:space="0" w:sz="8" w:val="single"/>
             </w:tcBorders>
             <w:tcMar>
@@ -15442,7 +15685,7 @@
             <w:tcBorders>
               <w:top w:color="e0e0e0" w:space="0" w:sz="8" w:val="single"/>
               <w:left w:color="ffffff" w:space="0" w:sz="8" w:val="single"/>
-              <w:bottom w:color="e0e0e0" w:space="0" w:sz="8" w:val="single"/>
+              <w:bottom w:color="00aee4" w:space="0" w:sz="8" w:val="single"/>
               <w:right w:color="ffffff" w:space="0" w:sz="8" w:val="single"/>
             </w:tcBorders>
             <w:tcMar>
@@ -15465,7 +15708,7 @@
                 <w:rFonts w:ascii="Proxima Nova" w:cs="Proxima Nova" w:eastAsia="Proxima Nova" w:hAnsi="Proxima Nova"/>
                 <w:rtl w:val="0"/>
               </w:rPr>
-              <w:t xml:space="preserve">Reporte de corrección de errores</w:t>
+              <w:t xml:space="preserve">Entorno de desarrollo UX - figma</w:t>
             </w:r>
           </w:p>
         </w:tc>
@@ -15474,7 +15717,7 @@
             <w:tcBorders>
               <w:top w:color="e0e0e0" w:space="0" w:sz="8" w:val="single"/>
               <w:left w:color="ffffff" w:space="0" w:sz="8" w:val="single"/>
-              <w:bottom w:color="e0e0e0" w:space="0" w:sz="8" w:val="single"/>
+              <w:bottom w:color="00aee4" w:space="0" w:sz="8" w:val="single"/>
               <w:right w:color="ffffff" w:space="0" w:sz="8" w:val="single"/>
             </w:tcBorders>
             <w:tcMar>
@@ -15497,7 +15740,7 @@
                 <w:rFonts w:ascii="Proxima Nova" w:cs="Proxima Nova" w:eastAsia="Proxima Nova" w:hAnsi="Proxima Nova"/>
                 <w:rtl w:val="0"/>
               </w:rPr>
-              <w:t xml:space="preserve">SISCOP-RCE.docx</w:t>
+              <w:t xml:space="preserve">FIGMA.COM</w:t>
             </w:r>
           </w:p>
         </w:tc>
@@ -15506,7 +15749,7 @@
             <w:tcBorders>
               <w:top w:color="e0e0e0" w:space="0" w:sz="8" w:val="single"/>
               <w:left w:color="ffffff" w:space="0" w:sz="8" w:val="single"/>
-              <w:bottom w:color="e0e0e0" w:space="0" w:sz="8" w:val="single"/>
+              <w:bottom w:color="00aee4" w:space="0" w:sz="8" w:val="single"/>
               <w:right w:color="ffffff" w:space="0" w:sz="8" w:val="single"/>
             </w:tcBorders>
             <w:tcMar>
@@ -15534,424 +15777,35 @@
           </w:p>
         </w:tc>
       </w:tr>
-      <w:tr>
-        <w:trPr>
-          <w:cantSplit w:val="0"/>
-          <w:trHeight w:val="500" w:hRule="atLeast"/>
-          <w:tblHeader w:val="0"/>
-        </w:trPr>
-        <w:tc>
-          <w:tcPr>
-            <w:tcBorders>
-              <w:top w:color="e0e0e0" w:space="0" w:sz="8" w:val="single"/>
-              <w:left w:color="ffffff" w:space="0" w:sz="8" w:val="single"/>
-              <w:bottom w:color="e0e0e0" w:space="0" w:sz="8" w:val="single"/>
-              <w:right w:color="ffffff" w:space="0" w:sz="8" w:val="single"/>
-            </w:tcBorders>
-            <w:shd w:fill="efefef" w:val="clear"/>
-            <w:tcMar>
-              <w:top w:w="100.0" w:type="dxa"/>
-              <w:left w:w="100.0" w:type="dxa"/>
-              <w:bottom w:w="100.0" w:type="dxa"/>
-              <w:right w:w="100.0" w:type="dxa"/>
-            </w:tcMar>
-            <w:vAlign w:val="top"/>
-          </w:tcPr>
-          <w:p>
-            <w:pPr>
-              <w:spacing w:after="0" w:line="240" w:lineRule="auto"/>
-              <w:rPr>
-                <w:rFonts w:ascii="Proxima Nova" w:cs="Proxima Nova" w:eastAsia="Proxima Nova" w:hAnsi="Proxima Nova"/>
-              </w:rPr>
-            </w:pPr>
-            <w:r>
-              <w:rPr>
-                <w:rFonts w:ascii="Proxima Nova" w:cs="Proxima Nova" w:eastAsia="Proxima Nova" w:hAnsi="Proxima Nova"/>
-                <w:rtl w:val="0"/>
-              </w:rPr>
-              <w:t xml:space="preserve">Soporte</w:t>
-            </w:r>
-          </w:p>
-        </w:tc>
-        <w:tc>
-          <w:tcPr>
-            <w:tcBorders>
-              <w:top w:color="e0e0e0" w:space="0" w:sz="8" w:val="single"/>
-              <w:left w:color="ffffff" w:space="0" w:sz="8" w:val="single"/>
-              <w:bottom w:color="e0e0e0" w:space="0" w:sz="8" w:val="single"/>
-              <w:right w:color="ffffff" w:space="0" w:sz="8" w:val="single"/>
-            </w:tcBorders>
-            <w:shd w:fill="efefef" w:val="clear"/>
-            <w:tcMar>
-              <w:top w:w="100.0" w:type="dxa"/>
-              <w:left w:w="100.0" w:type="dxa"/>
-              <w:bottom w:w="100.0" w:type="dxa"/>
-              <w:right w:w="100.0" w:type="dxa"/>
-            </w:tcMar>
-            <w:vAlign w:val="top"/>
-          </w:tcPr>
-          <w:p>
-            <w:pPr>
-              <w:spacing w:after="0" w:line="240" w:lineRule="auto"/>
-              <w:rPr>
-                <w:rFonts w:ascii="Proxima Nova" w:cs="Proxima Nova" w:eastAsia="Proxima Nova" w:hAnsi="Proxima Nova"/>
-              </w:rPr>
-            </w:pPr>
-            <w:r>
-              <w:rPr>
-                <w:rFonts w:ascii="Proxima Nova" w:cs="Proxima Nova" w:eastAsia="Proxima Nova" w:hAnsi="Proxima Nova"/>
-                <w:rtl w:val="0"/>
-              </w:rPr>
-              <w:t xml:space="preserve">Reporte de validación final</w:t>
-            </w:r>
-          </w:p>
-        </w:tc>
-        <w:tc>
-          <w:tcPr>
-            <w:tcBorders>
-              <w:top w:color="e0e0e0" w:space="0" w:sz="8" w:val="single"/>
-              <w:left w:color="ffffff" w:space="0" w:sz="8" w:val="single"/>
-              <w:bottom w:color="e0e0e0" w:space="0" w:sz="8" w:val="single"/>
-              <w:right w:color="ffffff" w:space="0" w:sz="8" w:val="single"/>
-            </w:tcBorders>
-            <w:shd w:fill="efefef" w:val="clear"/>
-            <w:tcMar>
-              <w:top w:w="100.0" w:type="dxa"/>
-              <w:left w:w="100.0" w:type="dxa"/>
-              <w:bottom w:w="100.0" w:type="dxa"/>
-              <w:right w:w="100.0" w:type="dxa"/>
-            </w:tcMar>
-            <w:vAlign w:val="top"/>
-          </w:tcPr>
-          <w:p>
-            <w:pPr>
-              <w:spacing w:after="0" w:line="240" w:lineRule="auto"/>
-              <w:rPr>
-                <w:rFonts w:ascii="Proxima Nova" w:cs="Proxima Nova" w:eastAsia="Proxima Nova" w:hAnsi="Proxima Nova"/>
-              </w:rPr>
-            </w:pPr>
-            <w:r>
-              <w:rPr>
-                <w:rFonts w:ascii="Proxima Nova" w:cs="Proxima Nova" w:eastAsia="Proxima Nova" w:hAnsi="Proxima Nova"/>
-                <w:rtl w:val="0"/>
-              </w:rPr>
-              <w:t xml:space="preserve">SISCOP-RVF.docx</w:t>
-            </w:r>
-          </w:p>
-        </w:tc>
-        <w:tc>
-          <w:tcPr>
-            <w:tcBorders>
-              <w:top w:color="e0e0e0" w:space="0" w:sz="8" w:val="single"/>
-              <w:left w:color="ffffff" w:space="0" w:sz="8" w:val="single"/>
-              <w:bottom w:color="e0e0e0" w:space="0" w:sz="8" w:val="single"/>
-              <w:right w:color="ffffff" w:space="0" w:sz="8" w:val="single"/>
-            </w:tcBorders>
-            <w:shd w:fill="efefef" w:val="clear"/>
-            <w:tcMar>
-              <w:top w:w="100.0" w:type="dxa"/>
-              <w:left w:w="100.0" w:type="dxa"/>
-              <w:bottom w:w="100.0" w:type="dxa"/>
-              <w:right w:w="100.0" w:type="dxa"/>
-            </w:tcMar>
-            <w:vAlign w:val="top"/>
-          </w:tcPr>
-          <w:p>
-            <w:pPr>
-              <w:spacing w:after="0" w:line="240" w:lineRule="auto"/>
-              <w:rPr>
-                <w:rFonts w:ascii="Proxima Nova" w:cs="Proxima Nova" w:eastAsia="Proxima Nova" w:hAnsi="Proxima Nova"/>
-              </w:rPr>
-            </w:pPr>
-            <w:r>
-              <w:rPr>
-                <w:rFonts w:ascii="Proxima Nova" w:cs="Proxima Nova" w:eastAsia="Proxima Nova" w:hAnsi="Proxima Nova"/>
-                <w:rtl w:val="0"/>
-              </w:rPr>
-              <w:t xml:space="preserve">SISCOP</w:t>
-            </w:r>
-          </w:p>
-        </w:tc>
-      </w:tr>
-      <w:tr>
-        <w:trPr>
-          <w:cantSplit w:val="0"/>
-          <w:trHeight w:val="500" w:hRule="atLeast"/>
-          <w:tblHeader w:val="0"/>
-        </w:trPr>
-        <w:tc>
-          <w:tcPr>
-            <w:tcBorders>
-              <w:top w:color="e0e0e0" w:space="0" w:sz="8" w:val="single"/>
-              <w:left w:color="ffffff" w:space="0" w:sz="8" w:val="single"/>
-              <w:bottom w:color="e0e0e0" w:space="0" w:sz="8" w:val="single"/>
-              <w:right w:color="ffffff" w:space="0" w:sz="8" w:val="single"/>
-            </w:tcBorders>
-            <w:tcMar>
-              <w:top w:w="100.0" w:type="dxa"/>
-              <w:left w:w="100.0" w:type="dxa"/>
-              <w:bottom w:w="100.0" w:type="dxa"/>
-              <w:right w:w="100.0" w:type="dxa"/>
-            </w:tcMar>
-            <w:vAlign w:val="top"/>
-          </w:tcPr>
-          <w:p>
-            <w:pPr>
-              <w:spacing w:after="0" w:line="240" w:lineRule="auto"/>
-              <w:rPr>
-                <w:rFonts w:ascii="Proxima Nova" w:cs="Proxima Nova" w:eastAsia="Proxima Nova" w:hAnsi="Proxima Nova"/>
-              </w:rPr>
-            </w:pPr>
-            <w:r>
-              <w:rPr>
-                <w:rFonts w:ascii="Proxima Nova" w:cs="Proxima Nova" w:eastAsia="Proxima Nova" w:hAnsi="Proxima Nova"/>
-                <w:rtl w:val="0"/>
-              </w:rPr>
-              <w:t xml:space="preserve">Soporte</w:t>
-            </w:r>
-          </w:p>
-        </w:tc>
-        <w:tc>
-          <w:tcPr>
-            <w:tcBorders>
-              <w:top w:color="e0e0e0" w:space="0" w:sz="8" w:val="single"/>
-              <w:left w:color="ffffff" w:space="0" w:sz="8" w:val="single"/>
-              <w:bottom w:color="e0e0e0" w:space="0" w:sz="8" w:val="single"/>
-              <w:right w:color="ffffff" w:space="0" w:sz="8" w:val="single"/>
-            </w:tcBorders>
-            <w:tcMar>
-              <w:top w:w="100.0" w:type="dxa"/>
-              <w:left w:w="100.0" w:type="dxa"/>
-              <w:bottom w:w="100.0" w:type="dxa"/>
-              <w:right w:w="100.0" w:type="dxa"/>
-            </w:tcMar>
-            <w:vAlign w:val="top"/>
-          </w:tcPr>
-          <w:p>
-            <w:pPr>
-              <w:spacing w:after="0" w:line="240" w:lineRule="auto"/>
-              <w:rPr>
-                <w:rFonts w:ascii="Proxima Nova" w:cs="Proxima Nova" w:eastAsia="Proxima Nova" w:hAnsi="Proxima Nova"/>
-              </w:rPr>
-            </w:pPr>
-            <w:r>
-              <w:rPr>
-                <w:rFonts w:ascii="Proxima Nova" w:cs="Proxima Nova" w:eastAsia="Proxima Nova" w:hAnsi="Proxima Nova"/>
-                <w:rtl w:val="0"/>
-              </w:rPr>
-              <w:t xml:space="preserve">Documento recopilatorio final</w:t>
-            </w:r>
-          </w:p>
-        </w:tc>
-        <w:tc>
-          <w:tcPr>
-            <w:tcBorders>
-              <w:top w:color="e0e0e0" w:space="0" w:sz="8" w:val="single"/>
-              <w:left w:color="ffffff" w:space="0" w:sz="8" w:val="single"/>
-              <w:bottom w:color="e0e0e0" w:space="0" w:sz="8" w:val="single"/>
-              <w:right w:color="ffffff" w:space="0" w:sz="8" w:val="single"/>
-            </w:tcBorders>
-            <w:tcMar>
-              <w:top w:w="100.0" w:type="dxa"/>
-              <w:left w:w="100.0" w:type="dxa"/>
-              <w:bottom w:w="100.0" w:type="dxa"/>
-              <w:right w:w="100.0" w:type="dxa"/>
-            </w:tcMar>
-            <w:vAlign w:val="top"/>
-          </w:tcPr>
-          <w:p>
-            <w:pPr>
-              <w:spacing w:after="0" w:line="240" w:lineRule="auto"/>
-              <w:rPr>
-                <w:rFonts w:ascii="Proxima Nova" w:cs="Proxima Nova" w:eastAsia="Proxima Nova" w:hAnsi="Proxima Nova"/>
-              </w:rPr>
-            </w:pPr>
-            <w:r>
-              <w:rPr>
-                <w:rFonts w:ascii="Proxima Nova" w:cs="Proxima Nova" w:eastAsia="Proxima Nova" w:hAnsi="Proxima Nova"/>
-                <w:rtl w:val="0"/>
-              </w:rPr>
-              <w:t xml:space="preserve">SISCOP-DRF.docx</w:t>
-            </w:r>
-          </w:p>
-        </w:tc>
-        <w:tc>
-          <w:tcPr>
-            <w:tcBorders>
-              <w:top w:color="e0e0e0" w:space="0" w:sz="8" w:val="single"/>
-              <w:left w:color="ffffff" w:space="0" w:sz="8" w:val="single"/>
-              <w:bottom w:color="e0e0e0" w:space="0" w:sz="8" w:val="single"/>
-              <w:right w:color="ffffff" w:space="0" w:sz="8" w:val="single"/>
-            </w:tcBorders>
-            <w:tcMar>
-              <w:top w:w="100.0" w:type="dxa"/>
-              <w:left w:w="100.0" w:type="dxa"/>
-              <w:bottom w:w="100.0" w:type="dxa"/>
-              <w:right w:w="100.0" w:type="dxa"/>
-            </w:tcMar>
-            <w:vAlign w:val="top"/>
-          </w:tcPr>
-          <w:p>
-            <w:pPr>
-              <w:spacing w:after="0" w:line="240" w:lineRule="auto"/>
-              <w:rPr>
-                <w:rFonts w:ascii="Proxima Nova" w:cs="Proxima Nova" w:eastAsia="Proxima Nova" w:hAnsi="Proxima Nova"/>
-              </w:rPr>
-            </w:pPr>
-            <w:r>
-              <w:rPr>
-                <w:rFonts w:ascii="Proxima Nova" w:cs="Proxima Nova" w:eastAsia="Proxima Nova" w:hAnsi="Proxima Nova"/>
-                <w:rtl w:val="0"/>
-              </w:rPr>
-              <w:t xml:space="preserve">SISCOP</w:t>
-            </w:r>
-          </w:p>
-        </w:tc>
-      </w:tr>
-      <w:tr>
-        <w:trPr>
-          <w:cantSplit w:val="0"/>
-          <w:trHeight w:val="500" w:hRule="atLeast"/>
-          <w:tblHeader w:val="0"/>
-        </w:trPr>
-        <w:tc>
-          <w:tcPr>
-            <w:tcBorders>
-              <w:top w:color="e0e0e0" w:space="0" w:sz="8" w:val="single"/>
-              <w:left w:color="ffffff" w:space="0" w:sz="8" w:val="single"/>
-              <w:bottom w:color="00aee4" w:space="0" w:sz="4" w:val="single"/>
-              <w:right w:color="ffffff" w:space="0" w:sz="8" w:val="single"/>
-            </w:tcBorders>
-            <w:shd w:fill="efefef" w:val="clear"/>
-            <w:tcMar>
-              <w:top w:w="100.0" w:type="dxa"/>
-              <w:left w:w="100.0" w:type="dxa"/>
-              <w:bottom w:w="100.0" w:type="dxa"/>
-              <w:right w:w="100.0" w:type="dxa"/>
-            </w:tcMar>
-            <w:vAlign w:val="top"/>
-          </w:tcPr>
-          <w:p>
-            <w:pPr>
-              <w:spacing w:after="0" w:line="240" w:lineRule="auto"/>
-              <w:rPr>
-                <w:rFonts w:ascii="Proxima Nova" w:cs="Proxima Nova" w:eastAsia="Proxima Nova" w:hAnsi="Proxima Nova"/>
-              </w:rPr>
-            </w:pPr>
-            <w:r>
-              <w:rPr>
-                <w:rFonts w:ascii="Proxima Nova" w:cs="Proxima Nova" w:eastAsia="Proxima Nova" w:hAnsi="Proxima Nova"/>
-                <w:rtl w:val="0"/>
-              </w:rPr>
-              <w:t xml:space="preserve">Soporte</w:t>
-            </w:r>
-          </w:p>
-        </w:tc>
-        <w:tc>
-          <w:tcPr>
-            <w:tcBorders>
-              <w:top w:color="e0e0e0" w:space="0" w:sz="8" w:val="single"/>
-              <w:left w:color="ffffff" w:space="0" w:sz="8" w:val="single"/>
-              <w:bottom w:color="00aee4" w:space="0" w:sz="4" w:val="single"/>
-              <w:right w:color="ffffff" w:space="0" w:sz="8" w:val="single"/>
-            </w:tcBorders>
-            <w:shd w:fill="efefef" w:val="clear"/>
-            <w:tcMar>
-              <w:top w:w="100.0" w:type="dxa"/>
-              <w:left w:w="100.0" w:type="dxa"/>
-              <w:bottom w:w="100.0" w:type="dxa"/>
-              <w:right w:w="100.0" w:type="dxa"/>
-            </w:tcMar>
-            <w:vAlign w:val="top"/>
-          </w:tcPr>
-          <w:p>
-            <w:pPr>
-              <w:spacing w:after="0" w:line="240" w:lineRule="auto"/>
-              <w:rPr>
-                <w:rFonts w:ascii="Proxima Nova" w:cs="Proxima Nova" w:eastAsia="Proxima Nova" w:hAnsi="Proxima Nova"/>
-              </w:rPr>
-            </w:pPr>
-            <w:r>
-              <w:rPr>
-                <w:rFonts w:ascii="Proxima Nova" w:cs="Proxima Nova" w:eastAsia="Proxima Nova" w:hAnsi="Proxima Nova"/>
-                <w:rtl w:val="0"/>
-              </w:rPr>
-              <w:t xml:space="preserve">Presentación del proyecto</w:t>
-            </w:r>
-          </w:p>
-        </w:tc>
-        <w:tc>
-          <w:tcPr>
-            <w:tcBorders>
-              <w:top w:color="e0e0e0" w:space="0" w:sz="8" w:val="single"/>
-              <w:left w:color="ffffff" w:space="0" w:sz="8" w:val="single"/>
-              <w:bottom w:color="00aee4" w:space="0" w:sz="4" w:val="single"/>
-              <w:right w:color="ffffff" w:space="0" w:sz="8" w:val="single"/>
-            </w:tcBorders>
-            <w:shd w:fill="efefef" w:val="clear"/>
-            <w:tcMar>
-              <w:top w:w="100.0" w:type="dxa"/>
-              <w:left w:w="100.0" w:type="dxa"/>
-              <w:bottom w:w="100.0" w:type="dxa"/>
-              <w:right w:w="100.0" w:type="dxa"/>
-            </w:tcMar>
-            <w:vAlign w:val="top"/>
-          </w:tcPr>
-          <w:p>
-            <w:pPr>
-              <w:spacing w:after="0" w:line="240" w:lineRule="auto"/>
-              <w:rPr>
-                <w:rFonts w:ascii="Proxima Nova" w:cs="Proxima Nova" w:eastAsia="Proxima Nova" w:hAnsi="Proxima Nova"/>
-              </w:rPr>
-            </w:pPr>
-            <w:r>
-              <w:rPr>
-                <w:rFonts w:ascii="Proxima Nova" w:cs="Proxima Nova" w:eastAsia="Proxima Nova" w:hAnsi="Proxima Nova"/>
-                <w:rtl w:val="0"/>
-              </w:rPr>
-              <w:t xml:space="preserve">SISCOP-PPT.pptx</w:t>
-            </w:r>
-          </w:p>
-        </w:tc>
-        <w:tc>
-          <w:tcPr>
-            <w:tcBorders>
-              <w:top w:color="e0e0e0" w:space="0" w:sz="8" w:val="single"/>
-              <w:left w:color="ffffff" w:space="0" w:sz="8" w:val="single"/>
-              <w:bottom w:color="00aee4" w:space="0" w:sz="4" w:val="single"/>
-              <w:right w:color="ffffff" w:space="0" w:sz="8" w:val="single"/>
-            </w:tcBorders>
-            <w:shd w:fill="efefef" w:val="clear"/>
-            <w:tcMar>
-              <w:top w:w="100.0" w:type="dxa"/>
-              <w:left w:w="100.0" w:type="dxa"/>
-              <w:bottom w:w="100.0" w:type="dxa"/>
-              <w:right w:w="100.0" w:type="dxa"/>
-            </w:tcMar>
-            <w:vAlign w:val="top"/>
-          </w:tcPr>
-          <w:p>
-            <w:pPr>
-              <w:spacing w:after="0" w:line="240" w:lineRule="auto"/>
-              <w:rPr>
-                <w:rFonts w:ascii="Proxima Nova" w:cs="Proxima Nova" w:eastAsia="Proxima Nova" w:hAnsi="Proxima Nova"/>
-              </w:rPr>
-            </w:pPr>
-            <w:r>
-              <w:rPr>
-                <w:rFonts w:ascii="Proxima Nova" w:cs="Proxima Nova" w:eastAsia="Proxima Nova" w:hAnsi="Proxima Nova"/>
-                <w:rtl w:val="0"/>
-              </w:rPr>
-              <w:t xml:space="preserve">SISCOP</w:t>
-            </w:r>
-          </w:p>
-        </w:tc>
-      </w:tr>
     </w:tbl>
     <w:p>
       <w:pPr>
-        <w:rPr/>
-      </w:pPr>
+        <w:rPr>
+          <w:sz w:val="12"/>
+          <w:szCs w:val="12"/>
+        </w:rPr>
+      </w:pPr>
+      <w:r>
+        <w:rPr>
+          <w:rtl w:val="0"/>
+        </w:rPr>
+      </w:r>
+    </w:p>
+    <w:p>
+      <w:pPr>
+        <w:spacing w:line="300" w:lineRule="auto"/>
+        <w:ind w:firstLine="720"/>
+        <w:rPr>
+          <w:rFonts w:ascii="Proxima Nova" w:cs="Proxima Nova" w:eastAsia="Proxima Nova" w:hAnsi="Proxima Nova"/>
+        </w:rPr>
+      </w:pPr>
+      <w:r>
+        <w:rPr>
+          <w:rFonts w:ascii="Proxima Nova" w:cs="Proxima Nova" w:eastAsia="Proxima Nova" w:hAnsi="Proxima Nova"/>
+          <w:rtl w:val="0"/>
+        </w:rPr>
+        <w:t xml:space="preserve">Tabla 5. Lista y Clasificación de Ítems del proyecto SISCOP</w:t>
+      </w:r>
       <w:r>
         <w:rPr>
           <w:rtl w:val="0"/>
@@ -15969,17 +15823,58 @@
           <w:szCs w:val="26"/>
         </w:rPr>
       </w:pPr>
-      <w:bookmarkStart w:colFirst="0" w:colLast="0" w:name="_heading=h.nir35oiw21ol" w:id="14"/>
-      <w:bookmarkEnd w:id="14"/>
-      <w:r>
+      <w:bookmarkStart w:colFirst="0" w:colLast="0" w:name="_heading=h.t4uzqospp6na" w:id="15"/>
+      <w:bookmarkEnd w:id="15"/>
+      <w:r>
+        <w:br w:type="page"/>
+      </w:r>
+      <w:r>
+        <w:rPr>
+          <w:rtl w:val="0"/>
+        </w:rPr>
+      </w:r>
+    </w:p>
+    <w:p>
+      <w:pPr>
+        <w:pStyle w:val="Heading2"/>
+        <w:spacing w:before="280" w:line="300" w:lineRule="auto"/>
         <w:rPr>
           <w:rFonts w:ascii="Proxima Nova" w:cs="Proxima Nova" w:eastAsia="Proxima Nova" w:hAnsi="Proxima Nova"/>
           <w:color w:val="e61a17"/>
           <w:sz w:val="26"/>
           <w:szCs w:val="26"/>
+        </w:rPr>
+      </w:pPr>
+      <w:bookmarkStart w:colFirst="0" w:colLast="0" w:name="_heading=h.nir35oiw21ol" w:id="16"/>
+      <w:bookmarkEnd w:id="16"/>
+      <w:r>
+        <w:rPr>
+          <w:rFonts w:ascii="Proxima Nova" w:cs="Proxima Nova" w:eastAsia="Proxima Nova" w:hAnsi="Proxima Nova"/>
+          <w:color w:val="e61a17"/>
+          <w:sz w:val="26"/>
+          <w:szCs w:val="26"/>
           <w:rtl w:val="0"/>
         </w:rPr>
         <w:t xml:space="preserve">3.2 Control de la GCS</w:t>
+      </w:r>
+    </w:p>
+    <w:p>
+      <w:pPr>
+        <w:rPr>
+          <w:rFonts w:ascii="Proxima Nova" w:cs="Proxima Nova" w:eastAsia="Proxima Nova" w:hAnsi="Proxima Nova"/>
+        </w:rPr>
+      </w:pPr>
+      <w:r>
+        <w:rPr>
+          <w:rFonts w:ascii="Proxima Nova" w:cs="Proxima Nova" w:eastAsia="Proxima Nova" w:hAnsi="Proxima Nova"/>
+          <w:rtl w:val="0"/>
+        </w:rPr>
+        <w:t xml:space="preserve">A continuación, se presentan las solicitudes de cambio recibidas por parte de los stakeholders del proyecto Sistema de Control de Peso (SISCOP).</w:t>
+      </w:r>
+      <w:r>
+        <w:rPr>
+          <w:rtl w:val="0"/>
+        </w:rPr>
       </w:r>
     </w:p>
     <w:p>
@@ -15993,8 +15888,8 @@
           <w:szCs w:val="24"/>
         </w:rPr>
       </w:pPr>
-      <w:bookmarkStart w:colFirst="0" w:colLast="0" w:name="_heading=h.bxhjchb9zs5c" w:id="15"/>
-      <w:bookmarkEnd w:id="15"/>
+      <w:bookmarkStart w:colFirst="0" w:colLast="0" w:name="_heading=h.bxhjchb9zs5c" w:id="17"/>
+      <w:bookmarkEnd w:id="17"/>
       <w:r>
         <w:rPr>
           <w:rFonts w:ascii="Proxima Nova" w:cs="Proxima Nova" w:eastAsia="Proxima Nova" w:hAnsi="Proxima Nova"/>
@@ -16047,8 +15942,8 @@
     <w:sdt>
       <w:sdtPr>
         <w:lock w:val="contentLocked"/>
-        <w:id w:val="1908159204"/>
-        <w:tag w:val="goog_rdk_8"/>
+        <w:id w:val="-1796327490"/>
+        <w:tag w:val="goog_rdk_12"/>
       </w:sdtPr>
       <w:sdtContent>
         <w:tbl>
@@ -16667,6 +16562,19 @@
     </w:sdt>
     <w:p>
       <w:pPr>
+        <w:rPr>
+          <w:sz w:val="14"/>
+          <w:szCs w:val="14"/>
+        </w:rPr>
+      </w:pPr>
+      <w:r>
+        <w:rPr>
+          <w:rtl w:val="0"/>
+        </w:rPr>
+      </w:r>
+    </w:p>
+    <w:p>
+      <w:pPr>
         <w:pStyle w:val="Heading3"/>
         <w:spacing w:after="200" w:before="200" w:line="300" w:lineRule="auto"/>
         <w:rPr>
@@ -16676,8 +16584,8 @@
           <w:szCs w:val="24"/>
         </w:rPr>
       </w:pPr>
-      <w:bookmarkStart w:colFirst="0" w:colLast="0" w:name="_heading=h.s4picwsik5c" w:id="16"/>
-      <w:bookmarkEnd w:id="16"/>
+      <w:bookmarkStart w:colFirst="0" w:colLast="0" w:name="_heading=h.s4picwsik5c" w:id="18"/>
+      <w:bookmarkEnd w:id="18"/>
       <w:r>
         <w:rPr>
           <w:rFonts w:ascii="Proxima Nova" w:cs="Proxima Nova" w:eastAsia="Proxima Nova" w:hAnsi="Proxima Nova"/>
@@ -16730,8 +16638,8 @@
     <w:sdt>
       <w:sdtPr>
         <w:lock w:val="contentLocked"/>
-        <w:id w:val="-1224077713"/>
-        <w:tag w:val="goog_rdk_9"/>
+        <w:id w:val="1012870323"/>
+        <w:tag w:val="goog_rdk_13"/>
       </w:sdtPr>
       <w:sdtContent>
         <w:tbl>
@@ -17259,7 +17167,7 @@
                     <w:color w:val="222222"/>
                     <w:rtl w:val="0"/>
                   </w:rPr>
-                  <w:t xml:space="preserve">Agregar validación automática para evitar el registro duplicado de pacientes mediante DNI en el módulo de admisión.</w:t>
+                  <w:t xml:space="preserve">Implementar conexión con la base de datos de RENIEC para consultar automáticamente los datos del paciente mediante el número de DNI durante el proceso de admisión.</w:t>
                 </w:r>
               </w:p>
             </w:tc>
@@ -17341,7 +17249,7 @@
                     <w:color w:val="222222"/>
                     <w:rtl w:val="0"/>
                   </w:rPr>
-                  <w:t xml:space="preserve">Actualmente el registro manual puede generar pacientes duplicados por error humano. La validación automática permitirá mantener la integridad de la información y evitar inconsistencias en las historias clínicas.</w:t>
+                  <w:t xml:space="preserve">Permitirá obtener automáticamente los datos del paciente a partir del DNI, agilizando el proceso de registro y mejorando la precisión de la información almacenada.</w:t>
                 </w:r>
               </w:p>
             </w:tc>
@@ -17351,21 +17259,6 @@
     </w:sdt>
     <w:p>
       <w:pPr>
-        <w:spacing w:after="0" w:lineRule="auto"/>
-        <w:rPr>
-          <w:rFonts w:ascii="Proxima Nova" w:cs="Proxima Nova" w:eastAsia="Proxima Nova" w:hAnsi="Proxima Nova"/>
-          <w:sz w:val="14"/>
-          <w:szCs w:val="14"/>
-        </w:rPr>
-      </w:pPr>
-      <w:r>
-        <w:rPr>
-          <w:rtl w:val="0"/>
-        </w:rPr>
-      </w:r>
-    </w:p>
-    <w:p>
-      <w:pPr>
         <w:pStyle w:val="Heading3"/>
         <w:spacing w:after="200" w:before="200" w:line="300" w:lineRule="auto"/>
         <w:rPr>
@@ -17375,8 +17268,8 @@
           <w:szCs w:val="24"/>
         </w:rPr>
       </w:pPr>
-      <w:bookmarkStart w:colFirst="0" w:colLast="0" w:name="_heading=h.9kdwxdq3b8no" w:id="17"/>
-      <w:bookmarkEnd w:id="17"/>
+      <w:bookmarkStart w:colFirst="0" w:colLast="0" w:name="_heading=h.9kdwxdq3b8no" w:id="19"/>
+      <w:bookmarkEnd w:id="19"/>
       <w:r>
         <w:rPr>
           <w:rFonts w:ascii="Proxima Nova" w:cs="Proxima Nova" w:eastAsia="Proxima Nova" w:hAnsi="Proxima Nova"/>
@@ -17443,8 +17336,8 @@
     <w:sdt>
       <w:sdtPr>
         <w:lock w:val="contentLocked"/>
-        <w:id w:val="-1910922167"/>
-        <w:tag w:val="goog_rdk_10"/>
+        <w:id w:val="-302737903"/>
+        <w:tag w:val="goog_rdk_14"/>
       </w:sdtPr>
       <w:sdtContent>
         <w:tbl>
@@ -17972,7 +17865,7 @@
                     <w:color w:val="222222"/>
                     <w:rtl w:val="0"/>
                   </w:rPr>
-                  <w:t xml:space="preserve">Integrar buscador de alimentos regionales en el módulo de registro de indicaciones para precargar valores nutricionales automáticamente.</w:t>
+                  <w:t xml:space="preserve">Agregar el campo “Buscar alimento” en el módulo “Registro de indicaciones” para autocompletar valores nutricionales del alimento seleccionado.</w:t>
                 </w:r>
               </w:p>
             </w:tc>
@@ -18054,7 +17947,7 @@
                     <w:color w:val="222222"/>
                     <w:rtl w:val="0"/>
                   </w:rPr>
-                  <w:t xml:space="preserve">Sustituir la redacción manual por datos técnicos estandarizados para eliminar errores de cálculo y agilizar la consulta </w:t>
+                  <w:t xml:space="preserve">Permitiría reducir errores en el registro manual de valores nutricionales y agilizar el proceso de indicaciones.</w:t>
                 </w:r>
               </w:p>
             </w:tc>
@@ -18069,12 +17962,12 @@
         <w:rPr>
           <w:rFonts w:ascii="Proxima Nova" w:cs="Proxima Nova" w:eastAsia="Proxima Nova" w:hAnsi="Proxima Nova"/>
           <w:color w:val="008a05"/>
-          <w:sz w:val="2"/>
-          <w:szCs w:val="2"/>
-        </w:rPr>
-      </w:pPr>
-      <w:bookmarkStart w:colFirst="0" w:colLast="0" w:name="_heading=h.mk1cieq3ek0x" w:id="18"/>
-      <w:bookmarkEnd w:id="18"/>
+          <w:sz w:val="18"/>
+          <w:szCs w:val="18"/>
+        </w:rPr>
+      </w:pPr>
+      <w:bookmarkStart w:colFirst="0" w:colLast="0" w:name="_heading=h.fywy8wimgcur" w:id="20"/>
+      <w:bookmarkEnd w:id="20"/>
       <w:r>
         <w:rPr>
           <w:rtl w:val="0"/>
@@ -18092,8 +17985,8 @@
           <w:szCs w:val="24"/>
         </w:rPr>
       </w:pPr>
-      <w:bookmarkStart w:colFirst="0" w:colLast="0" w:name="_heading=h.xcrj75ku4jpb" w:id="19"/>
-      <w:bookmarkEnd w:id="19"/>
+      <w:bookmarkStart w:colFirst="0" w:colLast="0" w:name="_heading=h.xcrj75ku4jpb" w:id="21"/>
+      <w:bookmarkEnd w:id="21"/>
       <w:r>
         <w:rPr>
           <w:rFonts w:ascii="Proxima Nova" w:cs="Proxima Nova" w:eastAsia="Proxima Nova" w:hAnsi="Proxima Nova"/>
@@ -18146,8 +18039,8 @@
     <w:sdt>
       <w:sdtPr>
         <w:lock w:val="contentLocked"/>
-        <w:id w:val="213356149"/>
-        <w:tag w:val="goog_rdk_11"/>
+        <w:id w:val="-734737737"/>
+        <w:tag w:val="goog_rdk_15"/>
       </w:sdtPr>
       <w:sdtContent>
         <w:tbl>
@@ -18675,7 +18568,7 @@
                     <w:color w:val="222222"/>
                     <w:rtl w:val="0"/>
                   </w:rPr>
-                  <w:t xml:space="preserve">Implementar una funcionalidad que evalúa el diagnóstico nutricional (IMC, grasa) y filtra una base de datos de alimentos regionales para ajustar porciones y emitir un plan formal.</w:t>
+                  <w:t xml:space="preserve">Agregar el campo “Nivel de glucosa” en el módulo de evaluación nutricional para generar recomendaciones alimenticias según el resultado registrado.</w:t>
                 </w:r>
               </w:p>
             </w:tc>
@@ -18757,7 +18650,15 @@
                     <w:color w:val="222222"/>
                     <w:rtl w:val="0"/>
                   </w:rPr>
-                  <w:t xml:space="preserve">Facilitar la localización rápida y precisa de la información histórica del paciente para habilitar y agilizar su atención médica.</w:t>
+                  <w:t xml:space="preserve">Facilitaría</w:t>
+                </w:r>
+                <w:r>
+                  <w:rPr>
+                    <w:rFonts w:ascii="Proxima Nova" w:cs="Proxima Nova" w:eastAsia="Proxima Nova" w:hAnsi="Proxima Nova"/>
+                    <w:color w:val="222222"/>
+                    <w:rtl w:val="0"/>
+                  </w:rPr>
+                  <w:t xml:space="preserve"> la elaboración de planes alimenticios personalizados según la condición nutricional del paciente.</w:t>
                 </w:r>
               </w:p>
             </w:tc>
@@ -18767,7 +18668,18 @@
     </w:sdt>
     <w:p>
       <w:pPr>
-        <w:spacing w:after="0" w:lineRule="auto"/>
+        <w:spacing w:after="200" w:before="200" w:line="300" w:lineRule="auto"/>
+        <w:rPr/>
+      </w:pPr>
+      <w:r>
+        <w:rPr>
+          <w:rtl w:val="0"/>
+        </w:rPr>
+      </w:r>
+    </w:p>
+    <w:p>
+      <w:pPr>
+        <w:spacing w:after="200" w:before="200" w:line="300" w:lineRule="auto"/>
         <w:rPr/>
       </w:pPr>
       <w:r>
@@ -18787,8 +18699,8 @@
           <w:szCs w:val="24"/>
         </w:rPr>
       </w:pPr>
-      <w:bookmarkStart w:colFirst="0" w:colLast="0" w:name="_heading=h.9r440b4291p6" w:id="20"/>
-      <w:bookmarkEnd w:id="20"/>
+      <w:bookmarkStart w:colFirst="0" w:colLast="0" w:name="_heading=h.9r440b4291p6" w:id="22"/>
+      <w:bookmarkEnd w:id="22"/>
       <w:r>
         <w:rPr>
           <w:rFonts w:ascii="Proxima Nova" w:cs="Proxima Nova" w:eastAsia="Proxima Nova" w:hAnsi="Proxima Nova"/>
@@ -18841,8 +18753,8 @@
     <w:sdt>
       <w:sdtPr>
         <w:lock w:val="contentLocked"/>
-        <w:id w:val="272412138"/>
-        <w:tag w:val="goog_rdk_12"/>
+        <w:id w:val="775448705"/>
+        <w:tag w:val="goog_rdk_16"/>
       </w:sdtPr>
       <w:sdtContent>
         <w:tbl>
@@ -19359,7 +19271,6 @@
                 <w:pPr>
                   <w:widowControl w:val="0"/>
                   <w:spacing w:after="0" w:line="240" w:lineRule="auto"/>
-                  <w:jc w:val="both"/>
                   <w:rPr>
                     <w:rFonts w:ascii="Proxima Nova" w:cs="Proxima Nova" w:eastAsia="Proxima Nova" w:hAnsi="Proxima Nova"/>
                     <w:color w:val="222222"/>
@@ -19371,7 +19282,7 @@
                     <w:color w:val="222222"/>
                     <w:rtl w:val="0"/>
                   </w:rPr>
-                  <w:t xml:space="preserve">Incorporar una función de cálculo automático del IMC (Índice de Masa Corporal) en el módulo de consulta.</w:t>
+                  <w:t xml:space="preserve">Agregar el campo “Nivel de actividad física” en el módulo “Consulta de evaluaciones” para calcular automáticamente el requerimiento calórico diario.</w:t>
                 </w:r>
               </w:p>
             </w:tc>
@@ -19442,7 +19353,6 @@
                 <w:pPr>
                   <w:widowControl w:val="0"/>
                   <w:spacing w:after="0" w:line="240" w:lineRule="auto"/>
-                  <w:jc w:val="both"/>
                   <w:rPr>
                     <w:rFonts w:ascii="Proxima Nova" w:cs="Proxima Nova" w:eastAsia="Proxima Nova" w:hAnsi="Proxima Nova"/>
                     <w:color w:val="222222"/>
@@ -19454,7 +19364,7 @@
                     <w:color w:val="222222"/>
                     <w:rtl w:val="0"/>
                   </w:rPr>
-                  <w:t xml:space="preserve">El cliente actualmente realiza los cálculos de forma manual y entrega recomendaciones escritas a mano. La automatización del IMC evita errores de cálculo.</w:t>
+                  <w:t xml:space="preserve">Permitiría automatizar el cálculo nutricional para reducir errores manuales y agilizar la generación de recomendaciones alimenticias.</w:t>
                 </w:r>
               </w:p>
             </w:tc>
@@ -19480,18 +19390,37 @@
         <w:rPr>
           <w:rFonts w:ascii="Proxima Nova" w:cs="Proxima Nova" w:eastAsia="Proxima Nova" w:hAnsi="Proxima Nova"/>
           <w:color w:val="008a05"/>
-          <w:sz w:val="24"/>
-          <w:szCs w:val="24"/>
-        </w:rPr>
-      </w:pPr>
-      <w:bookmarkStart w:colFirst="0" w:colLast="0" w:name="_heading=h.eifoq5cv39m2" w:id="21"/>
-      <w:bookmarkEnd w:id="21"/>
-      <w:r>
+          <w:sz w:val="2"/>
+          <w:szCs w:val="2"/>
+        </w:rPr>
+      </w:pPr>
+      <w:bookmarkStart w:colFirst="0" w:colLast="0" w:name="_heading=h.e33oubhkv2vk" w:id="23"/>
+      <w:bookmarkEnd w:id="23"/>
+      <w:r>
+        <w:rPr>
+          <w:rtl w:val="0"/>
+        </w:rPr>
+      </w:r>
+    </w:p>
+    <w:p>
+      <w:pPr>
+        <w:pStyle w:val="Heading3"/>
+        <w:spacing w:after="200" w:before="200" w:line="300" w:lineRule="auto"/>
         <w:rPr>
           <w:rFonts w:ascii="Proxima Nova" w:cs="Proxima Nova" w:eastAsia="Proxima Nova" w:hAnsi="Proxima Nova"/>
           <w:color w:val="008a05"/>
           <w:sz w:val="24"/>
           <w:szCs w:val="24"/>
+        </w:rPr>
+      </w:pPr>
+      <w:bookmarkStart w:colFirst="0" w:colLast="0" w:name="_heading=h.eifoq5cv39m2" w:id="24"/>
+      <w:bookmarkEnd w:id="24"/>
+      <w:r>
+        <w:rPr>
+          <w:rFonts w:ascii="Proxima Nova" w:cs="Proxima Nova" w:eastAsia="Proxima Nova" w:hAnsi="Proxima Nova"/>
+          <w:color w:val="008a05"/>
+          <w:sz w:val="24"/>
+          <w:szCs w:val="24"/>
           <w:rtl w:val="0"/>
         </w:rPr>
         <w:t xml:space="preserve">3.2.6 Solicitud de Cambio 6</w:t>
@@ -19501,6 +19430,8 @@
       <w:pPr>
         <w:rPr>
           <w:rFonts w:ascii="Proxima Nova" w:cs="Proxima Nova" w:eastAsia="Proxima Nova" w:hAnsi="Proxima Nova"/>
+          <w:sz w:val="18"/>
+          <w:szCs w:val="18"/>
         </w:rPr>
       </w:pPr>
       <w:r>
@@ -19519,15 +19450,6 @@
         </w:rPr>
         <w:t xml:space="preserve">: Carrascal Castro, Priscila</w:t>
       </w:r>
-    </w:p>
-    <w:p>
-      <w:pPr>
-        <w:rPr>
-          <w:rFonts w:ascii="Proxima Nova" w:cs="Proxima Nova" w:eastAsia="Proxima Nova" w:hAnsi="Proxima Nova"/>
-          <w:sz w:val="18"/>
-          <w:szCs w:val="18"/>
-        </w:rPr>
-      </w:pPr>
       <w:r>
         <w:rPr>
           <w:rtl w:val="0"/>
@@ -19552,8 +19474,8 @@
     <w:sdt>
       <w:sdtPr>
         <w:lock w:val="contentLocked"/>
-        <w:id w:val="16776065"/>
-        <w:tag w:val="goog_rdk_13"/>
+        <w:id w:val="1667618782"/>
+        <w:tag w:val="goog_rdk_17"/>
       </w:sdtPr>
       <w:sdtContent>
         <w:tbl>
@@ -20081,7 +20003,7 @@
                     <w:color w:val="222222"/>
                     <w:rtl w:val="0"/>
                   </w:rPr>
-                  <w:t xml:space="preserve">Incorporar mensajes de validación en tiempo real durante el registro y actualización de datos del paciente.</w:t>
+                  <w:t xml:space="preserve">Agregar el campo “Correo electrónico” en el módulo de registro de pacientes con validación automática de formato y duplicidad.</w:t>
                 </w:r>
               </w:p>
             </w:tc>
@@ -20163,7 +20085,7 @@
                     <w:color w:val="222222"/>
                     <w:rtl w:val="0"/>
                   </w:rPr>
-                  <w:t xml:space="preserve">La validación inmediata permite detectar errores antes de guardar la información, reduciendo registros incompletos y mejorando la calidad de los datos almacenados en el sistema.</w:t>
+                  <w:t xml:space="preserve">Permitiría almacenar información de contacto del paciente en caso cambie de numero de teléfono.</w:t>
                 </w:r>
               </w:p>
             </w:tc>
@@ -20183,6 +20105,17 @@
     </w:p>
     <w:p>
       <w:pPr>
+        <w:spacing w:after="200" w:before="200" w:line="300" w:lineRule="auto"/>
+        <w:rPr/>
+      </w:pPr>
+      <w:r>
+        <w:rPr>
+          <w:rtl w:val="0"/>
+        </w:rPr>
+      </w:r>
+    </w:p>
+    <w:p>
+      <w:pPr>
         <w:pStyle w:val="Heading3"/>
         <w:spacing w:after="200" w:before="200" w:line="300" w:lineRule="auto"/>
         <w:rPr>
@@ -20192,8 +20125,8 @@
           <w:szCs w:val="24"/>
         </w:rPr>
       </w:pPr>
-      <w:bookmarkStart w:colFirst="0" w:colLast="0" w:name="_heading=h.7awh2jq81t3l" w:id="22"/>
-      <w:bookmarkEnd w:id="22"/>
+      <w:bookmarkStart w:colFirst="0" w:colLast="0" w:name="_heading=h.7awh2jq81t3l" w:id="25"/>
+      <w:bookmarkEnd w:id="25"/>
       <w:r>
         <w:rPr>
           <w:rFonts w:ascii="Proxima Nova" w:cs="Proxima Nova" w:eastAsia="Proxima Nova" w:hAnsi="Proxima Nova"/>
@@ -20246,8 +20179,8 @@
     <w:sdt>
       <w:sdtPr>
         <w:lock w:val="contentLocked"/>
-        <w:id w:val="-2141465774"/>
-        <w:tag w:val="goog_rdk_14"/>
+        <w:id w:val="1135563744"/>
+        <w:tag w:val="goog_rdk_18"/>
       </w:sdtPr>
       <w:sdtContent>
         <w:tbl>
@@ -20775,7 +20708,7 @@
                     <w:color w:val="222222"/>
                     <w:rtl w:val="0"/>
                   </w:rPr>
-                  <w:t xml:space="preserve">Incorporar generación automática de reportes Word con el resumen de evaluación nutricional y evolución del paciente.</w:t>
+                  <w:t xml:space="preserve">Agregar el campo “Frecuencia de consumo de agua” en el módulo de evaluación nutricional para registrar hábitos de hidratación del paciente.</w:t>
                 </w:r>
               </w:p>
             </w:tc>
@@ -20857,7 +20790,15 @@
                     <w:color w:val="222222"/>
                     <w:rtl w:val="0"/>
                   </w:rPr>
-                  <w:t xml:space="preserve">La elaboración de reportes se realiza en PDF, pero se prefiere que además sea en Word ya que el personal tiene experiencia mas con esa herramienta de trabajo</w:t>
+                  <w:t xml:space="preserve">Facilitaría</w:t>
+                </w:r>
+                <w:r>
+                  <w:rPr>
+                    <w:rFonts w:ascii="Proxima Nova" w:cs="Proxima Nova" w:eastAsia="Proxima Nova" w:hAnsi="Proxima Nova"/>
+                    <w:color w:val="222222"/>
+                    <w:rtl w:val="0"/>
+                  </w:rPr>
+                  <w:t xml:space="preserve"> el seguimiento de hábitos alimenticios y mejora la precisión de las recomendaciones nutricionales.</w:t>
                 </w:r>
               </w:p>
             </w:tc>
@@ -20876,9 +20817,218 @@
         </w:rPr>
       </w:r>
     </w:p>
+    <w:p>
+      <w:pPr>
+        <w:pStyle w:val="Heading1"/>
+        <w:spacing w:after="0" w:lineRule="auto"/>
+        <w:rPr/>
+      </w:pPr>
+      <w:bookmarkStart w:colFirst="0" w:colLast="0" w:name="_heading=h.pcmmvip8srt2" w:id="26"/>
+      <w:bookmarkEnd w:id="26"/>
+      <w:r>
+        <w:br w:type="page"/>
+      </w:r>
+      <w:r>
+        <w:rPr>
+          <w:rtl w:val="0"/>
+        </w:rPr>
+      </w:r>
+    </w:p>
+    <w:p>
+      <w:pPr>
+        <w:spacing w:after="0" w:lineRule="auto"/>
+        <w:rPr>
+          <w:b w:val="1"/>
+          <w:bCs w:val="1"/>
+          <w:sz w:val="30"/>
+          <w:szCs w:val="30"/>
+        </w:rPr>
+      </w:pPr>
+      <w:r>
+        <w:rPr>
+          <w:b w:val="1"/>
+          <w:bCs w:val="1"/>
+          <w:sz w:val="30"/>
+          <w:szCs w:val="30"/>
+          <w:rtl w:val="0"/>
+        </w:rPr>
+        <w:t xml:space="preserve">Referencias</w:t>
+      </w:r>
+    </w:p>
+    <w:p>
+      <w:pPr>
+        <w:widowControl w:val="0"/>
+        <w:numPr>
+          <w:ilvl w:val="0"/>
+          <w:numId w:val="5"/>
+        </w:numPr>
+        <w:spacing w:after="0" w:line="240" w:lineRule="auto"/>
+        <w:ind w:left="283.4645669291342" w:hanging="285"/>
+        <w:rPr>
+          <w:rFonts w:ascii="Proxima Nova" w:cs="Proxima Nova" w:eastAsia="Proxima Nova" w:hAnsi="Proxima Nova"/>
+          <w:color w:val="222222"/>
+        </w:rPr>
+      </w:pPr>
+      <w:r>
+        <w:rPr>
+          <w:rFonts w:ascii="Proxima Nova" w:cs="Proxima Nova" w:eastAsia="Proxima Nova" w:hAnsi="Proxima Nova"/>
+          <w:color w:val="222222"/>
+          <w:rtl w:val="0"/>
+        </w:rPr>
+        <w:t xml:space="preserve">Chacon, S., &amp; Straub, B. (2014). Pro Git. </w:t>
+      </w:r>
+      <w:hyperlink r:id="rId11">
+        <w:r>
+          <w:rPr>
+            <w:rFonts w:ascii="Proxima Nova" w:cs="Proxima Nova" w:eastAsia="Proxima Nova" w:hAnsi="Proxima Nova"/>
+            <w:color w:val="1155cc"/>
+            <w:u w:val="single"/>
+            <w:rtl w:val="0"/>
+          </w:rPr>
+          <w:t xml:space="preserve">https://git-scm.com/book/en/v2</w:t>
+        </w:r>
+      </w:hyperlink>
+      <w:r>
+        <w:rPr>
+          <w:rFonts w:ascii="Proxima Nova" w:cs="Proxima Nova" w:eastAsia="Proxima Nova" w:hAnsi="Proxima Nova"/>
+          <w:color w:val="222222"/>
+          <w:rtl w:val="0"/>
+        </w:rPr>
+        <w:t xml:space="preserve"> </w:t>
+      </w:r>
+    </w:p>
+    <w:p>
+      <w:pPr>
+        <w:widowControl w:val="0"/>
+        <w:numPr>
+          <w:ilvl w:val="0"/>
+          <w:numId w:val="5"/>
+        </w:numPr>
+        <w:spacing w:after="0" w:line="240" w:lineRule="auto"/>
+        <w:ind w:left="283.4645669291342" w:hanging="285"/>
+        <w:rPr>
+          <w:rFonts w:ascii="Proxima Nova" w:cs="Proxima Nova" w:eastAsia="Proxima Nova" w:hAnsi="Proxima Nova"/>
+          <w:color w:val="222222"/>
+        </w:rPr>
+      </w:pPr>
+      <w:r>
+        <w:rPr>
+          <w:rFonts w:ascii="Proxima Nova" w:cs="Proxima Nova" w:eastAsia="Proxima Nova" w:hAnsi="Proxima Nova"/>
+          <w:color w:val="222222"/>
+          <w:rtl w:val="0"/>
+        </w:rPr>
+        <w:t xml:space="preserve">O'Sullivan, B. (2009). Mercurial: The Definitive Guide. </w:t>
+      </w:r>
+      <w:hyperlink r:id="rId12">
+        <w:r>
+          <w:rPr>
+            <w:rFonts w:ascii="Proxima Nova" w:cs="Proxima Nova" w:eastAsia="Proxima Nova" w:hAnsi="Proxima Nova"/>
+            <w:color w:val="1155cc"/>
+            <w:u w:val="single"/>
+            <w:rtl w:val="0"/>
+          </w:rPr>
+          <w:t xml:space="preserve">https://hgbook.red-bean.com/read/</w:t>
+        </w:r>
+      </w:hyperlink>
+      <w:r>
+        <w:rPr>
+          <w:rFonts w:ascii="Proxima Nova" w:cs="Proxima Nova" w:eastAsia="Proxima Nova" w:hAnsi="Proxima Nova"/>
+          <w:color w:val="222222"/>
+          <w:rtl w:val="0"/>
+        </w:rPr>
+        <w:t xml:space="preserve"> </w:t>
+      </w:r>
+    </w:p>
+    <w:p>
+      <w:pPr>
+        <w:widowControl w:val="0"/>
+        <w:numPr>
+          <w:ilvl w:val="0"/>
+          <w:numId w:val="5"/>
+        </w:numPr>
+        <w:spacing w:after="0" w:line="240" w:lineRule="auto"/>
+        <w:ind w:left="283.4645669291342" w:hanging="285"/>
+        <w:rPr>
+          <w:rFonts w:ascii="Proxima Nova" w:cs="Proxima Nova" w:eastAsia="Proxima Nova" w:hAnsi="Proxima Nova"/>
+          <w:color w:val="222222"/>
+        </w:rPr>
+      </w:pPr>
+      <w:r>
+        <w:rPr>
+          <w:rFonts w:ascii="Proxima Nova" w:cs="Proxima Nova" w:eastAsia="Proxima Nova" w:hAnsi="Proxima Nova"/>
+          <w:color w:val="222222"/>
+          <w:rtl w:val="0"/>
+        </w:rPr>
+        <w:t xml:space="preserve">Pilato, C. M., Collins-Sussman, B., &amp; Fitzpatrick, B. W. (2008). Version Control with Subversion. </w:t>
+      </w:r>
+      <w:hyperlink r:id="rId13">
+        <w:r>
+          <w:rPr>
+            <w:rFonts w:ascii="Proxima Nova" w:cs="Proxima Nova" w:eastAsia="Proxima Nova" w:hAnsi="Proxima Nova"/>
+            <w:color w:val="1155cc"/>
+            <w:u w:val="single"/>
+            <w:rtl w:val="0"/>
+          </w:rPr>
+          <w:t xml:space="preserve">https://indico.cern.ch/event/83294/contributions/1260815/attachments/1070958/1527274/svn-book.pdf</w:t>
+        </w:r>
+      </w:hyperlink>
+      <w:r>
+        <w:rPr>
+          <w:rFonts w:ascii="Proxima Nova" w:cs="Proxima Nova" w:eastAsia="Proxima Nova" w:hAnsi="Proxima Nova"/>
+          <w:color w:val="222222"/>
+          <w:rtl w:val="0"/>
+        </w:rPr>
+        <w:t xml:space="preserve"> </w:t>
+      </w:r>
+    </w:p>
+    <w:p>
+      <w:pPr>
+        <w:widowControl w:val="0"/>
+        <w:numPr>
+          <w:ilvl w:val="0"/>
+          <w:numId w:val="5"/>
+        </w:numPr>
+        <w:spacing w:after="0" w:line="240" w:lineRule="auto"/>
+        <w:ind w:left="283.4645669291342" w:hanging="285"/>
+        <w:rPr>
+          <w:rFonts w:ascii="Proxima Nova" w:cs="Proxima Nova" w:eastAsia="Proxima Nova" w:hAnsi="Proxima Nova"/>
+          <w:color w:val="222222"/>
+        </w:rPr>
+      </w:pPr>
+      <w:r>
+        <w:rPr>
+          <w:rFonts w:ascii="Proxima Nova" w:cs="Proxima Nova" w:eastAsia="Proxima Nova" w:hAnsi="Proxima Nova"/>
+          <w:rtl w:val="0"/>
+        </w:rPr>
+        <w:t xml:space="preserve">Perforce Software. (2024). Helix Core Version Control Guide. </w:t>
+      </w:r>
+      <w:hyperlink r:id="rId14">
+        <w:r>
+          <w:rPr>
+            <w:rFonts w:ascii="Proxima Nova" w:cs="Proxima Nova" w:eastAsia="Proxima Nova" w:hAnsi="Proxima Nova"/>
+            <w:color w:val="1155cc"/>
+            <w:u w:val="single"/>
+            <w:rtl w:val="0"/>
+          </w:rPr>
+          <w:t xml:space="preserve">https://ftp.perforce.com/perforce/r20.1/doc/manuals/overview.pdf</w:t>
+        </w:r>
+      </w:hyperlink>
+      <w:r>
+        <w:rPr>
+          <w:rFonts w:ascii="Proxima Nova" w:cs="Proxima Nova" w:eastAsia="Proxima Nova" w:hAnsi="Proxima Nova"/>
+          <w:rtl w:val="0"/>
+        </w:rPr>
+        <w:t xml:space="preserve"> </w:t>
+      </w:r>
+      <w:r>
+        <w:rPr>
+          <w:rtl w:val="0"/>
+        </w:rPr>
+      </w:r>
+    </w:p>
     <w:sectPr>
-      <w:headerReference r:id="rId13" w:type="default"/>
-      <w:footerReference r:id="rId14" w:type="default"/>
+      <w:headerReference r:id="rId15" w:type="default"/>
+      <w:footerReference r:id="rId16" w:type="default"/>
       <w:pgSz w:h="16838" w:w="11906" w:orient="portrait"/>
       <w:pgMar w:bottom="1417" w:top="1417" w:left="1701" w:right="1701" w:header="708" w:footer="708"/>
       <w:pgNumType w:start="1"/>
@@ -20911,12 +21061,12 @@
           <wp:extent cx="8801100" cy="369875"/>
           <wp:effectExtent b="0" l="0" r="0" t="0"/>
           <wp:wrapNone/>
-          <wp:docPr descr="línea horizontal" id="3" name="image1.png"/>
+          <wp:docPr descr="línea horizontal" id="3" name="image2.png"/>
           <a:graphic>
             <a:graphicData uri="http://schemas.openxmlformats.org/drawingml/2006/picture">
               <pic:pic>
                 <pic:nvPicPr>
-                  <pic:cNvPr descr="línea horizontal" id="0" name="image1.png"/>
+                  <pic:cNvPr descr="línea horizontal" id="0" name="image2.png"/>
                   <pic:cNvPicPr preferRelativeResize="0"/>
                 </pic:nvPicPr>
                 <pic:blipFill>
@@ -20968,12 +21118,12 @@
           <wp:extent cx="8801100" cy="235267"/>
           <wp:effectExtent b="0" l="0" r="0" t="0"/>
           <wp:wrapNone/>
-          <wp:docPr descr="línea horizontal" id="1" name="image1.png"/>
+          <wp:docPr descr="línea horizontal" id="1" name="image2.png"/>
           <a:graphic>
             <a:graphicData uri="http://schemas.openxmlformats.org/drawingml/2006/picture">
               <pic:pic>
                 <pic:nvPicPr>
-                  <pic:cNvPr descr="línea horizontal" id="0" name="image1.png"/>
+                  <pic:cNvPr descr="línea horizontal" id="0" name="image2.png"/>
                   <pic:cNvPicPr preferRelativeResize="0"/>
                 </pic:nvPicPr>
                 <pic:blipFill>
@@ -21337,6 +21487,116 @@
     <w:lvl w:ilvl="0">
       <w:start w:val="1"/>
       <w:numFmt w:val="bullet"/>
+      <w:lvlText w:val="●"/>
+      <w:lvlJc w:val="left"/>
+      <w:pPr>
+        <w:ind w:left="720" w:hanging="360"/>
+      </w:pPr>
+      <w:rPr>
+        <w:u w:val="none"/>
+      </w:rPr>
+    </w:lvl>
+    <w:lvl w:ilvl="1">
+      <w:start w:val="1"/>
+      <w:numFmt w:val="bullet"/>
+      <w:lvlText w:val="○"/>
+      <w:lvlJc w:val="left"/>
+      <w:pPr>
+        <w:ind w:left="1440" w:hanging="360"/>
+      </w:pPr>
+      <w:rPr>
+        <w:u w:val="none"/>
+      </w:rPr>
+    </w:lvl>
+    <w:lvl w:ilvl="2">
+      <w:start w:val="1"/>
+      <w:numFmt w:val="bullet"/>
+      <w:lvlText w:val="■"/>
+      <w:lvlJc w:val="left"/>
+      <w:pPr>
+        <w:ind w:left="2160" w:hanging="360"/>
+      </w:pPr>
+      <w:rPr>
+        <w:u w:val="none"/>
+      </w:rPr>
+    </w:lvl>
+    <w:lvl w:ilvl="3">
+      <w:start w:val="1"/>
+      <w:numFmt w:val="bullet"/>
+      <w:lvlText w:val="●"/>
+      <w:lvlJc w:val="left"/>
+      <w:pPr>
+        <w:ind w:left="2880" w:hanging="360"/>
+      </w:pPr>
+      <w:rPr>
+        <w:u w:val="none"/>
+      </w:rPr>
+    </w:lvl>
+    <w:lvl w:ilvl="4">
+      <w:start w:val="1"/>
+      <w:numFmt w:val="bullet"/>
+      <w:lvlText w:val="○"/>
+      <w:lvlJc w:val="left"/>
+      <w:pPr>
+        <w:ind w:left="3600" w:hanging="360"/>
+      </w:pPr>
+      <w:rPr>
+        <w:u w:val="none"/>
+      </w:rPr>
+    </w:lvl>
+    <w:lvl w:ilvl="5">
+      <w:start w:val="1"/>
+      <w:numFmt w:val="bullet"/>
+      <w:lvlText w:val="■"/>
+      <w:lvlJc w:val="left"/>
+      <w:pPr>
+        <w:ind w:left="4320" w:hanging="360"/>
+      </w:pPr>
+      <w:rPr>
+        <w:u w:val="none"/>
+      </w:rPr>
+    </w:lvl>
+    <w:lvl w:ilvl="6">
+      <w:start w:val="1"/>
+      <w:numFmt w:val="bullet"/>
+      <w:lvlText w:val="●"/>
+      <w:lvlJc w:val="left"/>
+      <w:pPr>
+        <w:ind w:left="5040" w:hanging="360"/>
+      </w:pPr>
+      <w:rPr>
+        <w:u w:val="none"/>
+      </w:rPr>
+    </w:lvl>
+    <w:lvl w:ilvl="7">
+      <w:start w:val="1"/>
+      <w:numFmt w:val="bullet"/>
+      <w:lvlText w:val="○"/>
+      <w:lvlJc w:val="left"/>
+      <w:pPr>
+        <w:ind w:left="5760" w:hanging="360"/>
+      </w:pPr>
+      <w:rPr>
+        <w:u w:val="none"/>
+      </w:rPr>
+    </w:lvl>
+    <w:lvl w:ilvl="8">
+      <w:start w:val="1"/>
+      <w:numFmt w:val="bullet"/>
+      <w:lvlText w:val="■"/>
+      <w:lvlJc w:val="left"/>
+      <w:pPr>
+        <w:ind w:left="6480" w:hanging="360"/>
+      </w:pPr>
+      <w:rPr>
+        <w:u w:val="none"/>
+      </w:rPr>
+    </w:lvl>
+  </w:abstractNum>
+  <w:abstractNum w:abstractNumId="5">
+    <w:lvl w:ilvl="0">
+      <w:start w:val="1"/>
+      <w:numFmt w:val="bullet"/>
       <w:lvlText w:val="❖"/>
       <w:lvlJc w:val="left"/>
       <w:pPr>
@@ -21443,7 +21703,7 @@
       </w:rPr>
     </w:lvl>
   </w:abstractNum>
-  <w:abstractNum w:abstractNumId="5">
+  <w:abstractNum w:abstractNumId="6">
     <w:lvl w:ilvl="0">
       <w:start w:val="1"/>
       <w:numFmt w:val="decimal"/>
@@ -21556,7 +21816,7 @@
       </w:rPr>
     </w:lvl>
   </w:abstractNum>
-  <w:abstractNum w:abstractNumId="6">
+  <w:abstractNum w:abstractNumId="7">
     <w:lvl w:ilvl="0">
       <w:start w:val="1"/>
       <w:numFmt w:val="bullet"/>
@@ -21683,6 +21943,9 @@
   </w:num>
   <w:num w:numId="6">
     <w:abstractNumId w:val="6"/>
+  </w:num>
+  <w:num w:numId="7">
+    <w:abstractNumId w:val="7"/>
   </w:num>
 </w:numbering>
 </file>
@@ -22270,7 +22533,7 @@
 
 <file path=customXML/item1.xml><?xml version="1.0" encoding="utf-8"?>
 <go:gDocsCustomXmlDataStorage xmlns:go="http://customooxmlschemas.google.com/" xmlns:r="http://schemas.openxmlformats.org/officeDocument/2006/relationships" uri="GoogleDocsCustomDataVersion2">
-  <go:docsCustomData xmlns:go="http://customooxmlschemas.google.com/" roundtripDataSignature="AMtx7mgm+fgK9Ks/L3LIQPDgJajdq+U5XQ==">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</go:docsCustomData>
+  <go:docsCustomData xmlns:go="http://customooxmlschemas.google.com/" roundtripDataSignature="AMtx7mgHoKJ2A8EN9G4mgzzo0dqvm+6Khg==">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</go:docsCustomData>
 </go:gDocsCustomXmlDataStorage>
 </file>
 

</xml_diff>

<commit_message>
Mejora de la presentacion de reportes GCS
</commit_message>
<xml_diff>
--- a/Documentacion/Planes/SONNY-PGC.docx
+++ b/Documentacion/Planes/SONNY-PGC.docx
@@ -75,12 +75,12 @@
           <wp:inline distB="114300" distT="114300" distL="114300" distR="114300">
             <wp:extent cx="447675" cy="57150"/>
             <wp:effectExtent b="0" l="0" r="0" t="0"/>
-            <wp:docPr descr="línea corta" id="2" name="image1.png"/>
+            <wp:docPr descr="línea corta" id="2" name="image2.png"/>
             <a:graphic>
               <a:graphicData uri="http://schemas.openxmlformats.org/drawingml/2006/picture">
                 <pic:pic>
                   <pic:nvPicPr>
-                    <pic:cNvPr descr="línea corta" id="0" name="image1.png"/>
+                    <pic:cNvPr descr="línea corta" id="0" name="image2.png"/>
                     <pic:cNvPicPr preferRelativeResize="0"/>
                   </pic:nvPicPr>
                   <pic:blipFill>
@@ -408,7 +408,7 @@
     </w:p>
     <w:p>
       <w:pPr>
-        <w:jc w:val="left"/>
+        <w:spacing w:after="0" w:before="480" w:line="300" w:lineRule="auto"/>
         <w:rPr>
           <w:b w:val="1"/>
           <w:bCs w:val="1"/>
@@ -417,6 +417,9 @@
         </w:rPr>
       </w:pPr>
       <w:r>
+        <w:br w:type="page"/>
+      </w:r>
+      <w:r>
         <w:rPr>
           <w:rtl w:val="0"/>
         </w:rPr>
@@ -424,35 +427,28 @@
     </w:p>
     <w:p>
       <w:pPr>
-        <w:pStyle w:val="Heading1"/>
         <w:spacing w:after="0" w:before="480" w:line="300" w:lineRule="auto"/>
-        <w:rPr>
-          <w:rFonts w:ascii="Proxima Nova" w:cs="Proxima Nova" w:eastAsia="Proxima Nova" w:hAnsi="Proxima Nova"/>
-          <w:b w:val="1"/>
-          <w:bCs w:val="1"/>
-        </w:rPr>
-      </w:pPr>
-      <w:bookmarkStart w:colFirst="0" w:colLast="0" w:name="_heading=h.oxbuber3oitr" w:id="1"/>
-      <w:bookmarkEnd w:id="1"/>
-      <w:r>
         <w:rPr>
           <w:rFonts w:ascii="Proxima Nova" w:cs="Proxima Nova" w:eastAsia="Proxima Nova" w:hAnsi="Proxima Nova"/>
           <w:color w:val="039be5"/>
           <w:sz w:val="36"/>
           <w:szCs w:val="36"/>
+        </w:rPr>
+      </w:pPr>
+      <w:r>
+        <w:rPr>
+          <w:rFonts w:ascii="Proxima Nova" w:cs="Proxima Nova" w:eastAsia="Proxima Nova" w:hAnsi="Proxima Nova"/>
+          <w:color w:val="039be5"/>
+          <w:sz w:val="36"/>
+          <w:szCs w:val="36"/>
           <w:rtl w:val="0"/>
         </w:rPr>
         <w:t xml:space="preserve">Índice</w:t>
-      </w:r>
-      <w:r>
-        <w:rPr>
-          <w:rtl w:val="0"/>
-        </w:rPr>
       </w:r>
     </w:p>
     <w:sdt>
       <w:sdtPr>
-        <w:id w:val="-1109577564"/>
+        <w:id w:val="-1621653750"/>
         <w:docPartObj>
           <w:docPartGallery w:val="Table of Contents"/>
           <w:docPartUnique w:val="1"/>
@@ -487,58 +483,6 @@
             <w:instrText xml:space="preserve"> TOC \h \u \z \t "Heading 1,1,Heading 2,2,Heading 3,3,Heading 4,4,Heading 5,5,Heading 6,6,"</w:instrText>
             <w:fldChar w:fldCharType="separate"/>
           </w:r>
-          <w:hyperlink w:anchor="_heading=h.oxbuber3oitr">
-            <w:r>
-              <w:rPr>
-                <w:rFonts w:ascii="Proxima Nova" w:cs="Proxima Nova" w:eastAsia="Proxima Nova" w:hAnsi="Proxima Nova"/>
-                <w:b w:val="1"/>
-                <w:bCs w:val="1"/>
-                <w:i w:val="0"/>
-                <w:iCs w:val="0"/>
-                <w:smallCaps w:val="0"/>
-                <w:strike w:val="0"/>
-                <w:color w:val="000000"/>
-                <w:sz w:val="22"/>
-                <w:szCs w:val="22"/>
-                <w:u w:val="none"/>
-                <w:shd w:fill="auto" w:val="clear"/>
-                <w:vertAlign w:val="baseline"/>
-                <w:rtl w:val="0"/>
-              </w:rPr>
-              <w:t xml:space="preserve">Índice</w:t>
-              <w:tab/>
-              <w:t xml:space="preserve">2</w:t>
-            </w:r>
-          </w:hyperlink>
-          <w:r>
-            <w:rPr>
-              <w:rtl w:val="0"/>
-            </w:rPr>
-          </w:r>
-        </w:p>
-        <w:p>
-          <w:pPr>
-            <w:widowControl w:val="0"/>
-            <w:tabs>
-              <w:tab w:val="right" w:leader="none" w:pos="12000"/>
-            </w:tabs>
-            <w:spacing w:after="0" w:before="60" w:line="240" w:lineRule="auto"/>
-            <w:rPr>
-              <w:rFonts w:ascii="Proxima Nova" w:cs="Proxima Nova" w:eastAsia="Proxima Nova" w:hAnsi="Proxima Nova"/>
-              <w:b w:val="1"/>
-              <w:bCs w:val="1"/>
-              <w:i w:val="0"/>
-              <w:iCs w:val="0"/>
-              <w:smallCaps w:val="0"/>
-              <w:strike w:val="0"/>
-              <w:color w:val="000000"/>
-              <w:sz w:val="22"/>
-              <w:szCs w:val="22"/>
-              <w:u w:val="none"/>
-              <w:shd w:fill="auto" w:val="clear"/>
-              <w:vertAlign w:val="baseline"/>
-            </w:rPr>
-          </w:pPr>
           <w:hyperlink w:anchor="_heading=h.wyx4ugz12jtv">
             <w:r>
               <w:rPr>
@@ -1499,7 +1443,7 @@
               </w:rPr>
               <w:t xml:space="preserve">4. Reportes para el estado de la configuración</w:t>
               <w:tab/>
-              <w:t xml:space="preserve">14</w:t>
+              <w:t xml:space="preserve">15</w:t>
             </w:r>
           </w:hyperlink>
           <w:r>
@@ -1548,7 +1492,7 @@
               </w:rPr>
               <w:t xml:space="preserve">4.1 Lista de versiones de un ítem</w:t>
               <w:tab/>
-              <w:t xml:space="preserve">14</w:t>
+              <w:t xml:space="preserve">15</w:t>
             </w:r>
           </w:hyperlink>
           <w:r>
@@ -1597,7 +1541,7 @@
               </w:rPr>
               <w:t xml:space="preserve">4.2 Lista de ítems de la gestión de la configuración</w:t>
               <w:tab/>
-              <w:t xml:space="preserve">15</w:t>
+              <w:t xml:space="preserve">16</w:t>
             </w:r>
           </w:hyperlink>
           <w:r>
@@ -1646,7 +1590,7 @@
               </w:rPr>
               <w:t xml:space="preserve">4.3 Lista de ítems de la gestión de la configuración</w:t>
               <w:tab/>
-              <w:t xml:space="preserve">15</w:t>
+              <w:t xml:space="preserve">17</w:t>
             </w:r>
           </w:hyperlink>
           <w:r>
@@ -1693,9 +1637,9 @@
                 <w:vertAlign w:val="baseline"/>
                 <w:rtl w:val="0"/>
               </w:rPr>
-              <w:t xml:space="preserve">4.4 Resultados generales de los reportes planteados</w:t>
+              <w:t xml:space="preserve">4.4 Acceso al archivo de reportes</w:t>
               <w:tab/>
-              <w:t xml:space="preserve">16</w:t>
+              <w:t xml:space="preserve">18</w:t>
             </w:r>
           </w:hyperlink>
           <w:r>
@@ -1749,8 +1693,8 @@
           <w:rFonts w:ascii="Arial" w:cs="Arial" w:eastAsia="Arial" w:hAnsi="Arial"/>
         </w:rPr>
       </w:pPr>
-      <w:bookmarkStart w:colFirst="0" w:colLast="0" w:name="_heading=h.wyx4ugz12jtv" w:id="2"/>
-      <w:bookmarkEnd w:id="2"/>
+      <w:bookmarkStart w:colFirst="0" w:colLast="0" w:name="_heading=h.wyx4ugz12jtv" w:id="1"/>
+      <w:bookmarkEnd w:id="1"/>
       <w:r>
         <w:rPr>
           <w:rFonts w:ascii="Proxima Nova" w:cs="Proxima Nova" w:eastAsia="Proxima Nova" w:hAnsi="Proxima Nova"/>
@@ -1775,8 +1719,8 @@
           <w:rFonts w:ascii="Arial" w:cs="Arial" w:eastAsia="Arial" w:hAnsi="Arial"/>
         </w:rPr>
       </w:pPr>
-      <w:bookmarkStart w:colFirst="0" w:colLast="0" w:name="_heading=h.m82gerliqzjn" w:id="3"/>
-      <w:bookmarkEnd w:id="3"/>
+      <w:bookmarkStart w:colFirst="0" w:colLast="0" w:name="_heading=h.m82gerliqzjn" w:id="2"/>
+      <w:bookmarkEnd w:id="2"/>
       <w:r>
         <w:rPr>
           <w:rFonts w:ascii="Proxima Nova" w:cs="Proxima Nova" w:eastAsia="Proxima Nova" w:hAnsi="Proxima Nova"/>
@@ -2855,8 +2799,8 @@
           <w:bCs w:val="1"/>
         </w:rPr>
       </w:pPr>
-      <w:bookmarkStart w:colFirst="0" w:colLast="0" w:name="_heading=h.vn8n8hkjhs0m" w:id="4"/>
-      <w:bookmarkEnd w:id="4"/>
+      <w:bookmarkStart w:colFirst="0" w:colLast="0" w:name="_heading=h.vn8n8hkjhs0m" w:id="3"/>
+      <w:bookmarkEnd w:id="3"/>
       <w:r>
         <w:rPr>
           <w:rFonts w:ascii="Proxima Nova" w:cs="Proxima Nova" w:eastAsia="Proxima Nova" w:hAnsi="Proxima Nova"/>
@@ -3232,8 +3176,8 @@
           <w:szCs w:val="26"/>
         </w:rPr>
       </w:pPr>
-      <w:bookmarkStart w:colFirst="0" w:colLast="0" w:name="_heading=h.86rjgx3ghk7" w:id="5"/>
-      <w:bookmarkEnd w:id="5"/>
+      <w:bookmarkStart w:colFirst="0" w:colLast="0" w:name="_heading=h.86rjgx3ghk7" w:id="4"/>
+      <w:bookmarkEnd w:id="4"/>
       <w:r>
         <w:rPr>
           <w:rFonts w:ascii="Proxima Nova" w:cs="Proxima Nova" w:eastAsia="Proxima Nova" w:hAnsi="Proxima Nova"/>
@@ -3261,8 +3205,8 @@
           <w:szCs w:val="26"/>
         </w:rPr>
       </w:pPr>
-      <w:bookmarkStart w:colFirst="0" w:colLast="0" w:name="_heading=h.whos5suqp7sm" w:id="6"/>
-      <w:bookmarkEnd w:id="6"/>
+      <w:bookmarkStart w:colFirst="0" w:colLast="0" w:name="_heading=h.whos5suqp7sm" w:id="5"/>
+      <w:bookmarkEnd w:id="5"/>
       <w:r>
         <w:rPr>
           <w:rFonts w:ascii="Proxima Nova" w:cs="Proxima Nova" w:eastAsia="Proxima Nova" w:hAnsi="Proxima Nova"/>
@@ -3309,7 +3253,7 @@
     <w:sdt>
       <w:sdtPr>
         <w:lock w:val="contentLocked"/>
-        <w:id w:val="-637745901"/>
+        <w:id w:val="1606524095"/>
         <w:tag w:val="goog_rdk_0"/>
       </w:sdtPr>
       <w:sdtContent>
@@ -4033,8 +3977,8 @@
           <w:szCs w:val="26"/>
         </w:rPr>
       </w:pPr>
-      <w:bookmarkStart w:colFirst="0" w:colLast="0" w:name="_heading=h.8ogizzm8wd3m" w:id="7"/>
-      <w:bookmarkEnd w:id="7"/>
+      <w:bookmarkStart w:colFirst="0" w:colLast="0" w:name="_heading=h.8ogizzm8wd3m" w:id="6"/>
+      <w:bookmarkEnd w:id="6"/>
       <w:r>
         <w:rPr>
           <w:rFonts w:ascii="Proxima Nova" w:cs="Proxima Nova" w:eastAsia="Proxima Nova" w:hAnsi="Proxima Nova"/>
@@ -4081,7 +4025,7 @@
     <w:sdt>
       <w:sdtPr>
         <w:lock w:val="contentLocked"/>
-        <w:id w:val="-2081600291"/>
+        <w:id w:val="-266320346"/>
         <w:tag w:val="goog_rdk_1"/>
       </w:sdtPr>
       <w:sdtContent>
@@ -4980,7 +4924,7 @@
     <w:sdt>
       <w:sdtPr>
         <w:lock w:val="contentLocked"/>
-        <w:id w:val="-1431368508"/>
+        <w:id w:val="-265936782"/>
         <w:tag w:val="goog_rdk_2"/>
       </w:sdtPr>
       <w:sdtContent>
@@ -7645,7 +7589,7 @@
     <w:sdt>
       <w:sdtPr>
         <w:lock w:val="contentLocked"/>
-        <w:id w:val="898290719"/>
+        <w:id w:val="458038345"/>
         <w:tag w:val="goog_rdk_3"/>
       </w:sdtPr>
       <w:sdtContent>
@@ -10787,8 +10731,8 @@
           <w:szCs w:val="36"/>
         </w:rPr>
       </w:pPr>
-      <w:bookmarkStart w:colFirst="0" w:colLast="0" w:name="_heading=h.ujkyugjazyci" w:id="8"/>
-      <w:bookmarkEnd w:id="8"/>
+      <w:bookmarkStart w:colFirst="0" w:colLast="0" w:name="_heading=h.ujkyugjazyci" w:id="7"/>
+      <w:bookmarkEnd w:id="7"/>
       <w:r>
         <w:br w:type="page"/>
       </w:r>
@@ -10806,8 +10750,8 @@
           <w:rFonts w:ascii="Proxima Nova" w:cs="Proxima Nova" w:eastAsia="Proxima Nova" w:hAnsi="Proxima Nova"/>
         </w:rPr>
       </w:pPr>
-      <w:bookmarkStart w:colFirst="0" w:colLast="0" w:name="_heading=h.cxfns0cohih9" w:id="9"/>
-      <w:bookmarkEnd w:id="9"/>
+      <w:bookmarkStart w:colFirst="0" w:colLast="0" w:name="_heading=h.cxfns0cohih9" w:id="8"/>
+      <w:bookmarkEnd w:id="8"/>
       <w:r>
         <w:rPr>
           <w:rFonts w:ascii="Proxima Nova" w:cs="Proxima Nova" w:eastAsia="Proxima Nova" w:hAnsi="Proxima Nova"/>
@@ -10834,8 +10778,8 @@
           <w:bCs w:val="1"/>
         </w:rPr>
       </w:pPr>
-      <w:bookmarkStart w:colFirst="0" w:colLast="0" w:name="_heading=h.ogfdulzed76k" w:id="10"/>
-      <w:bookmarkEnd w:id="10"/>
+      <w:bookmarkStart w:colFirst="0" w:colLast="0" w:name="_heading=h.ogfdulzed76k" w:id="9"/>
+      <w:bookmarkEnd w:id="9"/>
       <w:r>
         <w:rPr>
           <w:rFonts w:ascii="Proxima Nova" w:cs="Proxima Nova" w:eastAsia="Proxima Nova" w:hAnsi="Proxima Nova"/>
@@ -10863,8 +10807,8 @@
           <w:szCs w:val="24"/>
         </w:rPr>
       </w:pPr>
-      <w:bookmarkStart w:colFirst="0" w:colLast="0" w:name="_heading=h.lh6huhqns082" w:id="11"/>
-      <w:bookmarkEnd w:id="11"/>
+      <w:bookmarkStart w:colFirst="0" w:colLast="0" w:name="_heading=h.lh6huhqns082" w:id="10"/>
+      <w:bookmarkEnd w:id="10"/>
       <w:r>
         <w:rPr>
           <w:rFonts w:ascii="Proxima Nova" w:cs="Proxima Nova" w:eastAsia="Proxima Nova" w:hAnsi="Proxima Nova"/>
@@ -11057,12 +11001,12 @@
             <wp:extent cx="5399730" cy="4038600"/>
             <wp:effectExtent b="0" l="0" r="0" t="0"/>
             <wp:wrapTopAndBottom distB="0" distT="0"/>
-            <wp:docPr id="6" name="image4.png"/>
+            <wp:docPr id="6" name="image5.png"/>
             <a:graphic>
               <a:graphicData uri="http://schemas.openxmlformats.org/drawingml/2006/picture">
                 <pic:pic>
                   <pic:nvPicPr>
-                    <pic:cNvPr id="0" name="image4.png"/>
+                    <pic:cNvPr id="0" name="image5.png"/>
                     <pic:cNvPicPr preferRelativeResize="0"/>
                   </pic:nvPicPr>
                   <pic:blipFill>
@@ -11135,8 +11079,8 @@
           <w:szCs w:val="24"/>
         </w:rPr>
       </w:pPr>
-      <w:bookmarkStart w:colFirst="0" w:colLast="0" w:name="_heading=h.tjxs0ft018bm" w:id="12"/>
-      <w:bookmarkEnd w:id="12"/>
+      <w:bookmarkStart w:colFirst="0" w:colLast="0" w:name="_heading=h.tjxs0ft018bm" w:id="11"/>
+      <w:bookmarkEnd w:id="11"/>
       <w:r>
         <w:br w:type="page"/>
       </w:r>
@@ -11157,8 +11101,8 @@
           <w:szCs w:val="24"/>
         </w:rPr>
       </w:pPr>
-      <w:bookmarkStart w:colFirst="0" w:colLast="0" w:name="_heading=h.v3pesbi2zf64" w:id="13"/>
-      <w:bookmarkEnd w:id="13"/>
+      <w:bookmarkStart w:colFirst="0" w:colLast="0" w:name="_heading=h.v3pesbi2zf64" w:id="12"/>
+      <w:bookmarkEnd w:id="12"/>
       <w:r>
         <w:rPr>
           <w:rFonts w:ascii="Proxima Nova" w:cs="Proxima Nova" w:eastAsia="Proxima Nova" w:hAnsi="Proxima Nova"/>
@@ -11245,7 +11189,7 @@
     <w:sdt>
       <w:sdtPr>
         <w:lock w:val="contentLocked"/>
-        <w:id w:val="1768503305"/>
+        <w:id w:val="1279783075"/>
         <w:tag w:val="goog_rdk_4"/>
       </w:sdtPr>
       <w:sdtContent>
@@ -11375,7 +11319,7 @@
       </w:r>
       <w:sdt>
         <w:sdtPr>
-          <w:id w:val="1973611425"/>
+          <w:id w:val="-1473078678"/>
           <w:tag w:val="goog_rdk_5"/>
         </w:sdtPr>
         <w:sdtContent>
@@ -11453,7 +11397,7 @@
     <w:sdt>
       <w:sdtPr>
         <w:lock w:val="contentLocked"/>
-        <w:id w:val="-71009736"/>
+        <w:id w:val="261247884"/>
         <w:tag w:val="goog_rdk_6"/>
       </w:sdtPr>
       <w:sdtContent>
@@ -11560,7 +11504,7 @@
       </w:pPr>
       <w:sdt>
         <w:sdtPr>
-          <w:id w:val="361539281"/>
+          <w:id w:val="1355856641"/>
           <w:tag w:val="goog_rdk_7"/>
         </w:sdtPr>
         <w:sdtContent>
@@ -11638,7 +11582,7 @@
     <w:sdt>
       <w:sdtPr>
         <w:lock w:val="contentLocked"/>
-        <w:id w:val="280236408"/>
+        <w:id w:val="1176953007"/>
         <w:tag w:val="goog_rdk_8"/>
       </w:sdtPr>
       <w:sdtContent>
@@ -11746,7 +11690,7 @@
       </w:pPr>
       <w:sdt>
         <w:sdtPr>
-          <w:id w:val="726937774"/>
+          <w:id w:val="1444588532"/>
           <w:tag w:val="goog_rdk_9"/>
         </w:sdtPr>
         <w:sdtContent>
@@ -11824,7 +11768,7 @@
     <w:sdt>
       <w:sdtPr>
         <w:lock w:val="contentLocked"/>
-        <w:id w:val="1718829710"/>
+        <w:id w:val="-141319357"/>
         <w:tag w:val="goog_rdk_10"/>
       </w:sdtPr>
       <w:sdtContent>
@@ -11931,7 +11875,7 @@
       </w:pPr>
       <w:sdt>
         <w:sdtPr>
-          <w:id w:val="1503723688"/>
+          <w:id w:val="1501531694"/>
           <w:tag w:val="goog_rdk_11"/>
         </w:sdtPr>
         <w:sdtContent>
@@ -11991,8 +11935,8 @@
           <w:szCs w:val="24"/>
         </w:rPr>
       </w:pPr>
-      <w:bookmarkStart w:colFirst="0" w:colLast="0" w:name="_heading=h.qa9igwvqetd2" w:id="14"/>
-      <w:bookmarkEnd w:id="14"/>
+      <w:bookmarkStart w:colFirst="0" w:colLast="0" w:name="_heading=h.qa9igwvqetd2" w:id="13"/>
+      <w:bookmarkEnd w:id="13"/>
       <w:r>
         <w:rPr>
           <w:rFonts w:ascii="Proxima Nova" w:cs="Proxima Nova" w:eastAsia="Proxima Nova" w:hAnsi="Proxima Nova"/>
@@ -16007,8 +15951,8 @@
           <w:szCs w:val="26"/>
         </w:rPr>
       </w:pPr>
-      <w:bookmarkStart w:colFirst="0" w:colLast="0" w:name="_heading=h.t4uzqospp6na" w:id="15"/>
-      <w:bookmarkEnd w:id="15"/>
+      <w:bookmarkStart w:colFirst="0" w:colLast="0" w:name="_heading=h.t4uzqospp6na" w:id="14"/>
+      <w:bookmarkEnd w:id="14"/>
       <w:r>
         <w:br w:type="page"/>
       </w:r>
@@ -16029,8 +15973,8 @@
           <w:szCs w:val="26"/>
         </w:rPr>
       </w:pPr>
-      <w:bookmarkStart w:colFirst="0" w:colLast="0" w:name="_heading=h.nir35oiw21ol" w:id="16"/>
-      <w:bookmarkEnd w:id="16"/>
+      <w:bookmarkStart w:colFirst="0" w:colLast="0" w:name="_heading=h.nir35oiw21ol" w:id="15"/>
+      <w:bookmarkEnd w:id="15"/>
       <w:r>
         <w:rPr>
           <w:rFonts w:ascii="Proxima Nova" w:cs="Proxima Nova" w:eastAsia="Proxima Nova" w:hAnsi="Proxima Nova"/>
@@ -16072,8 +16016,8 @@
           <w:szCs w:val="24"/>
         </w:rPr>
       </w:pPr>
-      <w:bookmarkStart w:colFirst="0" w:colLast="0" w:name="_heading=h.bxhjchb9zs5c" w:id="17"/>
-      <w:bookmarkEnd w:id="17"/>
+      <w:bookmarkStart w:colFirst="0" w:colLast="0" w:name="_heading=h.bxhjchb9zs5c" w:id="16"/>
+      <w:bookmarkEnd w:id="16"/>
       <w:r>
         <w:rPr>
           <w:rFonts w:ascii="Proxima Nova" w:cs="Proxima Nova" w:eastAsia="Proxima Nova" w:hAnsi="Proxima Nova"/>
@@ -16126,7 +16070,7 @@
     <w:sdt>
       <w:sdtPr>
         <w:lock w:val="contentLocked"/>
-        <w:id w:val="260429924"/>
+        <w:id w:val="453036807"/>
         <w:tag w:val="goog_rdk_12"/>
       </w:sdtPr>
       <w:sdtContent>
@@ -16768,8 +16712,8 @@
           <w:szCs w:val="24"/>
         </w:rPr>
       </w:pPr>
-      <w:bookmarkStart w:colFirst="0" w:colLast="0" w:name="_heading=h.s4picwsik5c" w:id="18"/>
-      <w:bookmarkEnd w:id="18"/>
+      <w:bookmarkStart w:colFirst="0" w:colLast="0" w:name="_heading=h.s4picwsik5c" w:id="17"/>
+      <w:bookmarkEnd w:id="17"/>
       <w:r>
         <w:rPr>
           <w:rFonts w:ascii="Proxima Nova" w:cs="Proxima Nova" w:eastAsia="Proxima Nova" w:hAnsi="Proxima Nova"/>
@@ -16822,7 +16766,7 @@
     <w:sdt>
       <w:sdtPr>
         <w:lock w:val="contentLocked"/>
-        <w:id w:val="-948723706"/>
+        <w:id w:val="469805381"/>
         <w:tag w:val="goog_rdk_13"/>
       </w:sdtPr>
       <w:sdtContent>
@@ -17452,8 +17396,8 @@
           <w:szCs w:val="24"/>
         </w:rPr>
       </w:pPr>
-      <w:bookmarkStart w:colFirst="0" w:colLast="0" w:name="_heading=h.9kdwxdq3b8no" w:id="19"/>
-      <w:bookmarkEnd w:id="19"/>
+      <w:bookmarkStart w:colFirst="0" w:colLast="0" w:name="_heading=h.9kdwxdq3b8no" w:id="18"/>
+      <w:bookmarkEnd w:id="18"/>
       <w:r>
         <w:rPr>
           <w:rFonts w:ascii="Proxima Nova" w:cs="Proxima Nova" w:eastAsia="Proxima Nova" w:hAnsi="Proxima Nova"/>
@@ -17520,7 +17464,7 @@
     <w:sdt>
       <w:sdtPr>
         <w:lock w:val="contentLocked"/>
-        <w:id w:val="1522880373"/>
+        <w:id w:val="-256279876"/>
         <w:tag w:val="goog_rdk_14"/>
       </w:sdtPr>
       <w:sdtContent>
@@ -18150,8 +18094,8 @@
           <w:szCs w:val="18"/>
         </w:rPr>
       </w:pPr>
-      <w:bookmarkStart w:colFirst="0" w:colLast="0" w:name="_heading=h.fywy8wimgcur" w:id="20"/>
-      <w:bookmarkEnd w:id="20"/>
+      <w:bookmarkStart w:colFirst="0" w:colLast="0" w:name="_heading=h.fywy8wimgcur" w:id="19"/>
+      <w:bookmarkEnd w:id="19"/>
       <w:r>
         <w:rPr>
           <w:rtl w:val="0"/>
@@ -18169,8 +18113,8 @@
           <w:szCs w:val="24"/>
         </w:rPr>
       </w:pPr>
-      <w:bookmarkStart w:colFirst="0" w:colLast="0" w:name="_heading=h.xcrj75ku4jpb" w:id="21"/>
-      <w:bookmarkEnd w:id="21"/>
+      <w:bookmarkStart w:colFirst="0" w:colLast="0" w:name="_heading=h.xcrj75ku4jpb" w:id="20"/>
+      <w:bookmarkEnd w:id="20"/>
       <w:r>
         <w:rPr>
           <w:rFonts w:ascii="Proxima Nova" w:cs="Proxima Nova" w:eastAsia="Proxima Nova" w:hAnsi="Proxima Nova"/>
@@ -18223,7 +18167,7 @@
     <w:sdt>
       <w:sdtPr>
         <w:lock w:val="contentLocked"/>
-        <w:id w:val="1320928437"/>
+        <w:id w:val="-688603309"/>
         <w:tag w:val="goog_rdk_15"/>
       </w:sdtPr>
       <w:sdtContent>
@@ -18883,8 +18827,8 @@
           <w:szCs w:val="24"/>
         </w:rPr>
       </w:pPr>
-      <w:bookmarkStart w:colFirst="0" w:colLast="0" w:name="_heading=h.9r440b4291p6" w:id="22"/>
-      <w:bookmarkEnd w:id="22"/>
+      <w:bookmarkStart w:colFirst="0" w:colLast="0" w:name="_heading=h.9r440b4291p6" w:id="21"/>
+      <w:bookmarkEnd w:id="21"/>
       <w:r>
         <w:rPr>
           <w:rFonts w:ascii="Proxima Nova" w:cs="Proxima Nova" w:eastAsia="Proxima Nova" w:hAnsi="Proxima Nova"/>
@@ -18937,7 +18881,7 @@
     <w:sdt>
       <w:sdtPr>
         <w:lock w:val="contentLocked"/>
-        <w:id w:val="1165168502"/>
+        <w:id w:val="1595444976"/>
         <w:tag w:val="goog_rdk_16"/>
       </w:sdtPr>
       <w:sdtContent>
@@ -19578,8 +19522,8 @@
           <w:szCs w:val="2"/>
         </w:rPr>
       </w:pPr>
-      <w:bookmarkStart w:colFirst="0" w:colLast="0" w:name="_heading=h.e33oubhkv2vk" w:id="23"/>
-      <w:bookmarkEnd w:id="23"/>
+      <w:bookmarkStart w:colFirst="0" w:colLast="0" w:name="_heading=h.e33oubhkv2vk" w:id="22"/>
+      <w:bookmarkEnd w:id="22"/>
       <w:r>
         <w:rPr>
           <w:rtl w:val="0"/>
@@ -19597,8 +19541,8 @@
           <w:szCs w:val="24"/>
         </w:rPr>
       </w:pPr>
-      <w:bookmarkStart w:colFirst="0" w:colLast="0" w:name="_heading=h.eifoq5cv39m2" w:id="24"/>
-      <w:bookmarkEnd w:id="24"/>
+      <w:bookmarkStart w:colFirst="0" w:colLast="0" w:name="_heading=h.eifoq5cv39m2" w:id="23"/>
+      <w:bookmarkEnd w:id="23"/>
       <w:r>
         <w:rPr>
           <w:rFonts w:ascii="Proxima Nova" w:cs="Proxima Nova" w:eastAsia="Proxima Nova" w:hAnsi="Proxima Nova"/>
@@ -19658,7 +19602,7 @@
     <w:sdt>
       <w:sdtPr>
         <w:lock w:val="contentLocked"/>
-        <w:id w:val="-779108026"/>
+        <w:id w:val="-664831926"/>
         <w:tag w:val="goog_rdk_17"/>
       </w:sdtPr>
       <w:sdtContent>
@@ -20309,8 +20253,8 @@
           <w:szCs w:val="24"/>
         </w:rPr>
       </w:pPr>
-      <w:bookmarkStart w:colFirst="0" w:colLast="0" w:name="_heading=h.7awh2jq81t3l" w:id="25"/>
-      <w:bookmarkEnd w:id="25"/>
+      <w:bookmarkStart w:colFirst="0" w:colLast="0" w:name="_heading=h.7awh2jq81t3l" w:id="24"/>
+      <w:bookmarkEnd w:id="24"/>
       <w:r>
         <w:rPr>
           <w:rFonts w:ascii="Proxima Nova" w:cs="Proxima Nova" w:eastAsia="Proxima Nova" w:hAnsi="Proxima Nova"/>
@@ -20363,7 +20307,7 @@
     <w:sdt>
       <w:sdtPr>
         <w:lock w:val="contentLocked"/>
-        <w:id w:val="720000728"/>
+        <w:id w:val="-2011468467"/>
         <w:tag w:val="goog_rdk_18"/>
       </w:sdtPr>
       <w:sdtContent>
@@ -21011,8 +20955,8 @@
           <w:color w:val="039be5"/>
         </w:rPr>
       </w:pPr>
-      <w:bookmarkStart w:colFirst="0" w:colLast="0" w:name="_heading=h.pghu8du67al6" w:id="26"/>
-      <w:bookmarkEnd w:id="26"/>
+      <w:bookmarkStart w:colFirst="0" w:colLast="0" w:name="_heading=h.pghu8du67al6" w:id="25"/>
+      <w:bookmarkEnd w:id="25"/>
       <w:r>
         <w:br w:type="page"/>
       </w:r>
@@ -21032,8 +20976,8 @@
           <w:color w:val="039be5"/>
         </w:rPr>
       </w:pPr>
-      <w:bookmarkStart w:colFirst="0" w:colLast="0" w:name="_heading=h.pcmmvip8srt2" w:id="27"/>
-      <w:bookmarkEnd w:id="27"/>
+      <w:bookmarkStart w:colFirst="0" w:colLast="0" w:name="_heading=h.pcmmvip8srt2" w:id="26"/>
+      <w:bookmarkEnd w:id="26"/>
       <w:r>
         <w:rPr>
           <w:rFonts w:ascii="Proxima Nova" w:cs="Proxima Nova" w:eastAsia="Proxima Nova" w:hAnsi="Proxima Nova"/>
@@ -21053,8 +20997,8 @@
           <w:szCs w:val="26"/>
         </w:rPr>
       </w:pPr>
-      <w:bookmarkStart w:colFirst="0" w:colLast="0" w:name="_heading=h.dj54qyekizd" w:id="28"/>
-      <w:bookmarkEnd w:id="28"/>
+      <w:bookmarkStart w:colFirst="0" w:colLast="0" w:name="_heading=h.dj54qyekizd" w:id="27"/>
+      <w:bookmarkEnd w:id="27"/>
       <w:r>
         <w:rPr>
           <w:rFonts w:ascii="Proxima Nova" w:cs="Proxima Nova" w:eastAsia="Proxima Nova" w:hAnsi="Proxima Nova"/>
@@ -21064,6 +21008,25 @@
           <w:rtl w:val="0"/>
         </w:rPr>
         <w:t xml:space="preserve">4.1 Lista de versiones de un ítem</w:t>
+      </w:r>
+    </w:p>
+    <w:p>
+      <w:pPr>
+        <w:rPr>
+          <w:rFonts w:ascii="Proxima Nova" w:cs="Proxima Nova" w:eastAsia="Proxima Nova" w:hAnsi="Proxima Nova"/>
+        </w:rPr>
+      </w:pPr>
+      <w:r>
+        <w:rPr>
+          <w:rFonts w:ascii="Proxima Nova" w:cs="Proxima Nova" w:eastAsia="Proxima Nova" w:hAnsi="Proxima Nova"/>
+          <w:rtl w:val="0"/>
+        </w:rPr>
+        <w:t xml:space="preserve">La Tabla 6 define la estructura general del reporte de lista de versiones de un ítem, mientras que la Imagen 2 muestra ese reporte ya aplicado al ítem SISCOP-MDB.mwb.</w:t>
+      </w:r>
+      <w:r>
+        <w:rPr>
+          <w:rtl w:val="0"/>
+        </w:rPr>
       </w:r>
     </w:p>
     <w:p>
@@ -21084,7 +21047,7 @@
     <w:sdt>
       <w:sdtPr>
         <w:lock w:val="contentLocked"/>
-        <w:id w:val="-354773498"/>
+        <w:id w:val="1337924144"/>
         <w:tag w:val="goog_rdk_19"/>
       </w:sdtPr>
       <w:sdtContent>
@@ -21704,6 +21667,21 @@
     </w:p>
     <w:p>
       <w:pPr>
+        <w:spacing w:after="0" w:line="276" w:lineRule="auto"/>
+        <w:ind w:left="0" w:firstLine="0"/>
+        <w:jc w:val="left"/>
+        <w:rPr>
+          <w:rFonts w:ascii="Proxima Nova" w:cs="Proxima Nova" w:eastAsia="Proxima Nova" w:hAnsi="Proxima Nova"/>
+        </w:rPr>
+      </w:pPr>
+      <w:r>
+        <w:rPr>
+          <w:rtl w:val="0"/>
+        </w:rPr>
+      </w:r>
+    </w:p>
+    <w:p>
+      <w:pPr>
         <w:rPr/>
       </w:pPr>
       <w:r>
@@ -21711,13 +21689,13 @@
         <w:drawing>
           <wp:inline distB="114300" distT="114300" distL="114300" distR="114300">
             <wp:extent cx="5399730" cy="1676400"/>
-            <wp:effectExtent b="25400" l="25400" r="25400" t="25400"/>
-            <wp:docPr id="1" name="image3.png"/>
+            <wp:effectExtent b="12700" l="12700" r="12700" t="12700"/>
+            <wp:docPr id="1" name="image4.png"/>
             <a:graphic>
               <a:graphicData uri="http://schemas.openxmlformats.org/drawingml/2006/picture">
                 <pic:pic>
                   <pic:nvPicPr>
-                    <pic:cNvPr id="0" name="image3.png"/>
+                    <pic:cNvPr id="0" name="image4.png"/>
                     <pic:cNvPicPr preferRelativeResize="0"/>
                   </pic:nvPicPr>
                   <pic:blipFill>
@@ -21733,9 +21711,9 @@
                       <a:ext cx="5399730" cy="1676400"/>
                     </a:xfrm>
                     <a:prstGeom prst="rect"/>
-                    <a:ln w="25400">
+                    <a:ln w="12700">
                       <a:solidFill>
-                        <a:srgbClr val="000000"/>
+                        <a:srgbClr val="D9D9D9"/>
                       </a:solidFill>
                       <a:prstDash val="solid"/>
                     </a:ln>
@@ -21764,8 +21742,29 @@
           <w:rFonts w:ascii="Proxima Nova" w:cs="Proxima Nova" w:eastAsia="Proxima Nova" w:hAnsi="Proxima Nova"/>
           <w:rtl w:val="0"/>
         </w:rPr>
-        <w:t xml:space="preserve">Imagen 4.1 Resultado del reporte de versiones de SISCOP-MDB.mwb</w:t>
-      </w:r>
+        <w:t xml:space="preserve">Imagen 2. Resultado del reporte de versiones del ítem SISCOP-MDB.mwb</w:t>
+      </w:r>
+    </w:p>
+    <w:p>
+      <w:pPr>
+        <w:jc w:val="center"/>
+        <w:rPr>
+          <w:rFonts w:ascii="Proxima Nova" w:cs="Proxima Nova" w:eastAsia="Proxima Nova" w:hAnsi="Proxima Nova"/>
+        </w:rPr>
+      </w:pPr>
+      <w:r>
+        <w:rPr>
+          <w:rtl w:val="0"/>
+        </w:rPr>
+      </w:r>
+    </w:p>
+    <w:p>
+      <w:pPr>
+        <w:jc w:val="center"/>
+        <w:rPr>
+          <w:rFonts w:ascii="Proxima Nova" w:cs="Proxima Nova" w:eastAsia="Proxima Nova" w:hAnsi="Proxima Nova"/>
+        </w:rPr>
+      </w:pPr>
       <w:r>
         <w:rPr>
           <w:rtl w:val="0"/>
@@ -21782,17 +21781,57 @@
           <w:szCs w:val="26"/>
         </w:rPr>
       </w:pPr>
-      <w:bookmarkStart w:colFirst="0" w:colLast="0" w:name="_heading=h.8of4u6fhupjb" w:id="29"/>
-      <w:bookmarkEnd w:id="29"/>
-      <w:r>
+      <w:bookmarkStart w:colFirst="0" w:colLast="0" w:name="_heading=h.jrguw8wcymge" w:id="28"/>
+      <w:bookmarkEnd w:id="28"/>
+      <w:r>
+        <w:br w:type="page"/>
+      </w:r>
+      <w:r>
+        <w:rPr>
+          <w:rtl w:val="0"/>
+        </w:rPr>
+      </w:r>
+    </w:p>
+    <w:p>
+      <w:pPr>
+        <w:pStyle w:val="Heading2"/>
         <w:rPr>
           <w:rFonts w:ascii="Proxima Nova" w:cs="Proxima Nova" w:eastAsia="Proxima Nova" w:hAnsi="Proxima Nova"/>
           <w:color w:val="e61a17"/>
           <w:sz w:val="26"/>
           <w:szCs w:val="26"/>
+        </w:rPr>
+      </w:pPr>
+      <w:bookmarkStart w:colFirst="0" w:colLast="0" w:name="_heading=h.8of4u6fhupjb" w:id="29"/>
+      <w:bookmarkEnd w:id="29"/>
+      <w:r>
+        <w:rPr>
+          <w:rFonts w:ascii="Proxima Nova" w:cs="Proxima Nova" w:eastAsia="Proxima Nova" w:hAnsi="Proxima Nova"/>
+          <w:color w:val="e61a17"/>
+          <w:sz w:val="26"/>
+          <w:szCs w:val="26"/>
           <w:rtl w:val="0"/>
         </w:rPr>
         <w:t xml:space="preserve">4.2 Lista de ítems de la gestión de la configuración</w:t>
+      </w:r>
+    </w:p>
+    <w:p>
+      <w:pPr>
+        <w:rPr>
+          <w:rFonts w:ascii="Proxima Nova" w:cs="Proxima Nova" w:eastAsia="Proxima Nova" w:hAnsi="Proxima Nova"/>
+        </w:rPr>
+      </w:pPr>
+      <w:r>
+        <w:rPr>
+          <w:rFonts w:ascii="Proxima Nova" w:cs="Proxima Nova" w:eastAsia="Proxima Nova" w:hAnsi="Proxima Nova"/>
+          <w:rtl w:val="0"/>
+        </w:rPr>
+        <w:t xml:space="preserve">La Tabla 7 define la estructura general del reporte de lista de ítems de la configuración, mientras que la Imagen 3 muestra ese reporte ya aplicado al proyecto SISCOP.</w:t>
+      </w:r>
+      <w:r>
+        <w:rPr>
+          <w:rtl w:val="0"/>
+        </w:rPr>
       </w:r>
     </w:p>
     <w:p>
@@ -21813,7 +21852,7 @@
     <w:sdt>
       <w:sdtPr>
         <w:lock w:val="contentLocked"/>
-        <w:id w:val="840088774"/>
+        <w:id w:val="376058099"/>
         <w:tag w:val="goog_rdk_20"/>
       </w:sdtPr>
       <w:sdtContent>
@@ -22459,6 +22498,21 @@
       <w:pPr>
         <w:spacing w:after="0" w:line="276" w:lineRule="auto"/>
         <w:ind w:left="0" w:firstLine="0"/>
+        <w:jc w:val="left"/>
+        <w:rPr>
+          <w:rFonts w:ascii="Proxima Nova" w:cs="Proxima Nova" w:eastAsia="Proxima Nova" w:hAnsi="Proxima Nova"/>
+        </w:rPr>
+      </w:pPr>
+      <w:r>
+        <w:rPr>
+          <w:rtl w:val="0"/>
+        </w:rPr>
+      </w:r>
+    </w:p>
+    <w:p>
+      <w:pPr>
+        <w:spacing w:after="0" w:line="276" w:lineRule="auto"/>
+        <w:ind w:left="0" w:firstLine="0"/>
         <w:jc w:val="center"/>
         <w:rPr>
           <w:rFonts w:ascii="Proxima Nova" w:cs="Proxima Nova" w:eastAsia="Proxima Nova" w:hAnsi="Proxima Nova"/>
@@ -22471,13 +22525,13 @@
         <w:drawing>
           <wp:inline distB="114300" distT="114300" distL="114300" distR="114300">
             <wp:extent cx="5399730" cy="2235200"/>
-            <wp:effectExtent b="25400" l="25400" r="25400" t="25400"/>
-            <wp:docPr id="7" name="image5.png"/>
+            <wp:effectExtent b="12700" l="12700" r="12700" t="12700"/>
+            <wp:docPr id="7" name="image3.png"/>
             <a:graphic>
               <a:graphicData uri="http://schemas.openxmlformats.org/drawingml/2006/picture">
                 <pic:pic>
                   <pic:nvPicPr>
-                    <pic:cNvPr id="0" name="image5.png"/>
+                    <pic:cNvPr id="0" name="image3.png"/>
                     <pic:cNvPicPr preferRelativeResize="0"/>
                   </pic:nvPicPr>
                   <pic:blipFill>
@@ -22493,9 +22547,9 @@
                       <a:ext cx="5399730" cy="2235200"/>
                     </a:xfrm>
                     <a:prstGeom prst="rect"/>
-                    <a:ln w="25400">
+                    <a:ln w="12700">
                       <a:solidFill>
-                        <a:srgbClr val="000000"/>
+                        <a:srgbClr val="D9D9D9"/>
                       </a:solidFill>
                       <a:prstDash val="solid"/>
                     </a:ln>
@@ -22524,27 +22578,65 @@
           <w:rFonts w:ascii="Proxima Nova" w:cs="Proxima Nova" w:eastAsia="Proxima Nova" w:hAnsi="Proxima Nova"/>
           <w:rtl w:val="0"/>
         </w:rPr>
-        <w:t xml:space="preserve">Imagen 4.2 Resultado del reporte de lista de ítems de SISCOP</w:t>
+        <w:t xml:space="preserve">Imagen 3. Resultado del reporte de lista de ítems de SISCOP</w:t>
       </w:r>
     </w:p>
     <w:p>
       <w:pPr>
         <w:pStyle w:val="Heading2"/>
-        <w:rPr>
-          <w:rFonts w:ascii="Proxima Nova" w:cs="Proxima Nova" w:eastAsia="Proxima Nova" w:hAnsi="Proxima Nova"/>
-        </w:rPr>
-      </w:pPr>
-      <w:bookmarkStart w:colFirst="0" w:colLast="0" w:name="_heading=h.ofe3iia0iwla" w:id="30"/>
-      <w:bookmarkEnd w:id="30"/>
-      <w:r>
         <w:rPr>
           <w:rFonts w:ascii="Proxima Nova" w:cs="Proxima Nova" w:eastAsia="Proxima Nova" w:hAnsi="Proxima Nova"/>
           <w:color w:val="e61a17"/>
           <w:sz w:val="26"/>
           <w:szCs w:val="26"/>
+        </w:rPr>
+      </w:pPr>
+      <w:bookmarkStart w:colFirst="0" w:colLast="0" w:name="_heading=h.ydxgs8kwz3mh" w:id="30"/>
+      <w:bookmarkEnd w:id="30"/>
+      <w:r>
+        <w:br w:type="page"/>
+      </w:r>
+      <w:r>
+        <w:rPr>
+          <w:rtl w:val="0"/>
+        </w:rPr>
+      </w:r>
+    </w:p>
+    <w:p>
+      <w:pPr>
+        <w:pStyle w:val="Heading2"/>
+        <w:rPr>
+          <w:rFonts w:ascii="Proxima Nova" w:cs="Proxima Nova" w:eastAsia="Proxima Nova" w:hAnsi="Proxima Nova"/>
+          <w:color w:val="e61a17"/>
+          <w:sz w:val="26"/>
+          <w:szCs w:val="26"/>
+        </w:rPr>
+      </w:pPr>
+      <w:bookmarkStart w:colFirst="0" w:colLast="0" w:name="_heading=h.ofe3iia0iwla" w:id="31"/>
+      <w:bookmarkEnd w:id="31"/>
+      <w:r>
+        <w:rPr>
+          <w:rFonts w:ascii="Proxima Nova" w:cs="Proxima Nova" w:eastAsia="Proxima Nova" w:hAnsi="Proxima Nova"/>
+          <w:color w:val="e61a17"/>
+          <w:sz w:val="26"/>
+          <w:szCs w:val="26"/>
           <w:rtl w:val="0"/>
         </w:rPr>
         <w:t xml:space="preserve">4.3 Lista de ítems de la gestión de la configuración</w:t>
+      </w:r>
+    </w:p>
+    <w:p>
+      <w:pPr>
+        <w:rPr>
+          <w:rFonts w:ascii="Proxima Nova" w:cs="Proxima Nova" w:eastAsia="Proxima Nova" w:hAnsi="Proxima Nova"/>
+        </w:rPr>
+      </w:pPr>
+      <w:r>
+        <w:rPr>
+          <w:rFonts w:ascii="Proxima Nova" w:cs="Proxima Nova" w:eastAsia="Proxima Nova" w:hAnsi="Proxima Nova"/>
+          <w:rtl w:val="0"/>
+        </w:rPr>
+        <w:t xml:space="preserve">La Tabla 8 define la estructura general del reporte de ítems afectados por una solicitud de cambio, mientras que la Imagen 4 muestra ese reporte ya aplicado a la solicitud SC008 del proyecto SISCOP.</w:t>
       </w:r>
       <w:r>
         <w:rPr>
@@ -22570,7 +22662,7 @@
     <w:sdt>
       <w:sdtPr>
         <w:lock w:val="contentLocked"/>
-        <w:id w:val="1357257965"/>
+        <w:id w:val="-408814077"/>
         <w:tag w:val="goog_rdk_21"/>
       </w:sdtPr>
       <w:sdtContent>
@@ -23226,7 +23318,9 @@
       <w:pPr>
         <w:spacing w:after="0" w:line="276" w:lineRule="auto"/>
         <w:jc w:val="center"/>
-        <w:rPr/>
+        <w:rPr>
+          <w:rFonts w:ascii="Proxima Nova" w:cs="Proxima Nova" w:eastAsia="Proxima Nova" w:hAnsi="Proxima Nova"/>
+        </w:rPr>
       </w:pPr>
       <w:r>
         <w:rPr>
@@ -23235,6 +23329,15 @@
         </w:rPr>
         <w:t xml:space="preserve">Tabla 8. Reporte General de la Lista de ítems afectados por solicitudes de cambios</w:t>
       </w:r>
+    </w:p>
+    <w:p>
+      <w:pPr>
+        <w:spacing w:after="0" w:line="276" w:lineRule="auto"/>
+        <w:jc w:val="left"/>
+        <w:rPr>
+          <w:rFonts w:ascii="Proxima Nova" w:cs="Proxima Nova" w:eastAsia="Proxima Nova" w:hAnsi="Proxima Nova"/>
+        </w:rPr>
+      </w:pPr>
       <w:r>
         <w:rPr>
           <w:rtl w:val="0"/>
@@ -23252,7 +23355,7 @@
         <w:drawing>
           <wp:inline distB="114300" distT="114300" distL="114300" distR="114300">
             <wp:extent cx="5399730" cy="2222500"/>
-            <wp:effectExtent b="25400" l="25400" r="25400" t="25400"/>
+            <wp:effectExtent b="12700" l="12700" r="12700" t="12700"/>
             <wp:docPr id="4" name="image6.png"/>
             <a:graphic>
               <a:graphicData uri="http://schemas.openxmlformats.org/drawingml/2006/picture">
@@ -23274,9 +23377,9 @@
                       <a:ext cx="5399730" cy="2222500"/>
                     </a:xfrm>
                     <a:prstGeom prst="rect"/>
-                    <a:ln w="25400">
+                    <a:ln w="12700">
                       <a:solidFill>
-                        <a:srgbClr val="000000"/>
+                        <a:srgbClr val="D9D9D9"/>
                       </a:solidFill>
                       <a:prstDash val="solid"/>
                     </a:ln>
@@ -23303,7 +23406,40 @@
           <w:rFonts w:ascii="Proxima Nova" w:cs="Proxima Nova" w:eastAsia="Proxima Nova" w:hAnsi="Proxima Nova"/>
           <w:rtl w:val="0"/>
         </w:rPr>
-        <w:t xml:space="preserve">Imagen 4.3 Resultado del reporte de Ítems afectados por la solicitud de cambio SC008</w:t>
+        <w:t xml:space="preserve">Imagen 4. Resultado del reporte de Ítems afectados por la solicitud de cambio SC008</w:t>
+      </w:r>
+      <w:r>
+        <w:rPr>
+          <w:rtl w:val="0"/>
+        </w:rPr>
+      </w:r>
+    </w:p>
+    <w:p>
+      <w:pPr>
+        <w:rPr/>
+      </w:pPr>
+      <w:r>
+        <w:rPr>
+          <w:rtl w:val="0"/>
+        </w:rPr>
+      </w:r>
+    </w:p>
+    <w:p>
+      <w:pPr>
+        <w:rPr/>
+      </w:pPr>
+      <w:r>
+        <w:rPr>
+          <w:rtl w:val="0"/>
+        </w:rPr>
+      </w:r>
+    </w:p>
+    <w:p>
+      <w:pPr>
+        <w:rPr/>
+      </w:pPr>
+      <w:r>
+        <w:br w:type="page"/>
       </w:r>
       <w:r>
         <w:rPr>
@@ -23321,8 +23457,8 @@
           <w:szCs w:val="26"/>
         </w:rPr>
       </w:pPr>
-      <w:bookmarkStart w:colFirst="0" w:colLast="0" w:name="_heading=h.rjoy45eww5j5" w:id="31"/>
-      <w:bookmarkEnd w:id="31"/>
+      <w:bookmarkStart w:colFirst="0" w:colLast="0" w:name="_heading=h.rjoy45eww5j5" w:id="32"/>
+      <w:bookmarkEnd w:id="32"/>
       <w:r>
         <w:rPr>
           <w:rFonts w:ascii="Proxima Nova" w:cs="Proxima Nova" w:eastAsia="Proxima Nova" w:hAnsi="Proxima Nova"/>
@@ -23331,29 +23467,47 @@
           <w:szCs w:val="26"/>
           <w:rtl w:val="0"/>
         </w:rPr>
-        <w:t xml:space="preserve">4.4 Resultados generales de los reportes planteados</w:t>
+        <w:t xml:space="preserve">4.4 Acceso al archivo de reportes</w:t>
       </w:r>
     </w:p>
     <w:p>
       <w:pPr>
-        <w:rPr/>
-      </w:pPr>
-      <w:r>
-        <w:rPr>
-          <w:rtl w:val="0"/>
-        </w:rPr>
-        <w:t xml:space="preserve">A Continuación se adjunta un link para visualizar con mejor detalle los resultados de los 3 reportes planteados en el punto 4</w:t>
+        <w:rPr>
+          <w:rFonts w:ascii="Proxima Nova" w:cs="Proxima Nova" w:eastAsia="Proxima Nova" w:hAnsi="Proxima Nova"/>
+        </w:rPr>
+      </w:pPr>
+      <w:r>
+        <w:rPr>
+          <w:rFonts w:ascii="Proxima Nova" w:cs="Proxima Nova" w:eastAsia="Proxima Nova" w:hAnsi="Proxima Nova"/>
+          <w:rtl w:val="0"/>
+        </w:rPr>
+        <w:t xml:space="preserve">Cada uno de los reportes mostrados anteriormente fue implementado en una hoja distinta dentro del mismo archivo. En el siguiente enlace se puede acceder a las tres hojas para consultar los datos completos de forma interactiva. </w:t>
       </w:r>
     </w:p>
     <w:p>
       <w:pPr>
-        <w:rPr/>
-      </w:pPr>
-      <w:r>
-        <w:rPr>
-          <w:rtl w:val="0"/>
-        </w:rPr>
-        <w:t xml:space="preserve">Resultados: </w:t>
+        <w:rPr>
+          <w:rFonts w:ascii="Proxima Nova" w:cs="Proxima Nova" w:eastAsia="Proxima Nova" w:hAnsi="Proxima Nova"/>
+          <w:b w:val="1"/>
+          <w:bCs w:val="1"/>
+          <w:sz w:val="30"/>
+          <w:szCs w:val="30"/>
+        </w:rPr>
+      </w:pPr>
+      <w:r>
+        <w:rPr>
+          <w:rFonts w:ascii="Proxima Nova" w:cs="Proxima Nova" w:eastAsia="Proxima Nova" w:hAnsi="Proxima Nova"/>
+          <w:u w:val="single"/>
+          <w:rtl w:val="0"/>
+        </w:rPr>
+        <w:t xml:space="preserve">Enlace</w:t>
+      </w:r>
+      <w:r>
+        <w:rPr>
+          <w:rFonts w:ascii="Proxima Nova" w:cs="Proxima Nova" w:eastAsia="Proxima Nova" w:hAnsi="Proxima Nova"/>
+          <w:rtl w:val="0"/>
+        </w:rPr>
+        <w:t xml:space="preserve">: </w:t>
       </w:r>
       <w:hyperlink r:id="rId14">
         <w:r>
@@ -23365,28 +23519,6 @@
           <w:t xml:space="preserve">Grupo 3 - Reportes para el Estado de Contabilidad de la Configuración</w:t>
         </w:r>
       </w:hyperlink>
-      <w:r>
-        <w:rPr>
-          <w:rtl w:val="0"/>
-        </w:rPr>
-      </w:r>
-    </w:p>
-    <w:p>
-      <w:pPr>
-        <w:spacing w:after="0" w:line="276" w:lineRule="auto"/>
-        <w:jc w:val="left"/>
-        <w:rPr/>
-      </w:pPr>
-      <w:r>
-        <w:rPr>
-          <w:rtl w:val="0"/>
-        </w:rPr>
-      </w:r>
-    </w:p>
-    <w:p>
-      <w:pPr>
-        <w:rPr/>
-      </w:pPr>
       <w:r>
         <w:rPr>
           <w:rtl w:val="0"/>
@@ -23639,12 +23771,12 @@
           <wp:extent cx="8801100" cy="369875"/>
           <wp:effectExtent b="0" l="0" r="0" t="0"/>
           <wp:wrapNone/>
-          <wp:docPr descr="línea horizontal" id="3" name="image2.png"/>
+          <wp:docPr descr="línea horizontal" id="3" name="image1.png"/>
           <a:graphic>
             <a:graphicData uri="http://schemas.openxmlformats.org/drawingml/2006/picture">
               <pic:pic>
                 <pic:nvPicPr>
-                  <pic:cNvPr descr="línea horizontal" id="0" name="image2.png"/>
+                  <pic:cNvPr descr="línea horizontal" id="0" name="image1.png"/>
                   <pic:cNvPicPr preferRelativeResize="0"/>
                 </pic:nvPicPr>
                 <pic:blipFill>
@@ -23696,12 +23828,12 @@
           <wp:extent cx="8801100" cy="235267"/>
           <wp:effectExtent b="0" l="0" r="0" t="0"/>
           <wp:wrapNone/>
-          <wp:docPr descr="línea horizontal" id="5" name="image2.png"/>
+          <wp:docPr descr="línea horizontal" id="5" name="image1.png"/>
           <a:graphic>
             <a:graphicData uri="http://schemas.openxmlformats.org/drawingml/2006/picture">
               <pic:pic>
                 <pic:nvPicPr>
-                  <pic:cNvPr descr="línea horizontal" id="0" name="image2.png"/>
+                  <pic:cNvPr descr="línea horizontal" id="0" name="image1.png"/>
                   <pic:cNvPicPr preferRelativeResize="0"/>
                 </pic:nvPicPr>
                 <pic:blipFill>
@@ -25584,7 +25716,7 @@
 
 <file path=customXML/item1.xml><?xml version="1.0" encoding="utf-8"?>
 <go:gDocsCustomXmlDataStorage xmlns:go="http://customooxmlschemas.google.com/" xmlns:r="http://schemas.openxmlformats.org/officeDocument/2006/relationships" uri="GoogleDocsCustomDataVersion2">
-  <go:docsCustomData xmlns:go="http://customooxmlschemas.google.com/" roundtripDataSignature="AMtx7mjSZBSR1/BbjCbpwup820VlIAdFqg==">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</go:docsCustomData>
+  <go:docsCustomData xmlns:go="http://customooxmlschemas.google.com/" roundtripDataSignature="AMtx7miPco0gtBlnrlO6Ig5O+XGXzUwYJQ==">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</go:docsCustomData>
 </go:gDocsCustomXmlDataStorage>
 </file>
 

</xml_diff>